<commit_message>
add The planning documentation module has been completed
</commit_message>
<xml_diff>
--- a/документация/Отчет.docx
+++ b/документация/Отчет.docx
@@ -1158,7 +1158,7 @@
         </w:rPr>
         <w:fldChar w:fldCharType="separate"/>
       </w:r>
-      <w:hyperlink w:anchor="_Toc229822766" w:history="1">
+      <w:hyperlink w:anchor="_Toc229827214" w:history="1">
         <w:r>
           <w:rPr>
             <w:rStyle w:val="a9"/>
@@ -1187,7 +1187,7 @@
             <w:noProof/>
             <w:webHidden/>
           </w:rPr>
-          <w:instrText xml:space="preserve"> PAGEREF _Toc229822766 \h </w:instrText>
+          <w:instrText xml:space="preserve"> PAGEREF _Toc229827214 \h </w:instrText>
         </w:r>
         <w:r>
           <w:rPr>
@@ -1231,7 +1231,7 @@
           <w:lang w:eastAsia="ru-RU"/>
         </w:rPr>
       </w:pPr>
-      <w:hyperlink w:anchor="_Toc229822767" w:history="1">
+      <w:hyperlink w:anchor="_Toc229827215" w:history="1">
         <w:r>
           <w:rPr>
             <w:rStyle w:val="a9"/>
@@ -1277,7 +1277,7 @@
             <w:noProof/>
             <w:webHidden/>
           </w:rPr>
-          <w:instrText xml:space="preserve"> PAGEREF _Toc229822767 \h </w:instrText>
+          <w:instrText xml:space="preserve"> PAGEREF _Toc229827215 \h </w:instrText>
         </w:r>
         <w:r>
           <w:rPr>
@@ -1321,7 +1321,7 @@
           <w:lang w:eastAsia="ru-RU"/>
         </w:rPr>
       </w:pPr>
-      <w:hyperlink w:anchor="_Toc229822768" w:history="1">
+      <w:hyperlink w:anchor="_Toc229827216" w:history="1">
         <w:r>
           <w:rPr>
             <w:rStyle w:val="a9"/>
@@ -1367,7 +1367,7 @@
             <w:noProof/>
             <w:webHidden/>
           </w:rPr>
-          <w:instrText xml:space="preserve"> PAGEREF _Toc229822768 \h </w:instrText>
+          <w:instrText xml:space="preserve"> PAGEREF _Toc229827216 \h </w:instrText>
         </w:r>
         <w:r>
           <w:rPr>
@@ -1411,7 +1411,7 @@
           <w:lang w:eastAsia="ru-RU"/>
         </w:rPr>
       </w:pPr>
-      <w:hyperlink w:anchor="_Toc229822769" w:history="1">
+      <w:hyperlink w:anchor="_Toc229827217" w:history="1">
         <w:r>
           <w:rPr>
             <w:rStyle w:val="a9"/>
@@ -1457,7 +1457,7 @@
             <w:noProof/>
             <w:webHidden/>
           </w:rPr>
-          <w:instrText xml:space="preserve"> PAGEREF _Toc229822769 \h </w:instrText>
+          <w:instrText xml:space="preserve"> PAGEREF _Toc229827217 \h </w:instrText>
         </w:r>
         <w:r>
           <w:rPr>
@@ -1501,7 +1501,7 @@
           <w:lang w:eastAsia="ru-RU"/>
         </w:rPr>
       </w:pPr>
-      <w:hyperlink w:anchor="_Toc229822770" w:history="1">
+      <w:hyperlink w:anchor="_Toc229827218" w:history="1">
         <w:r>
           <w:rPr>
             <w:rStyle w:val="a9"/>
@@ -1549,7 +1549,7 @@
             <w:noProof/>
             <w:webHidden/>
           </w:rPr>
-          <w:instrText xml:space="preserve"> PAGEREF _Toc229822770 \h </w:instrText>
+          <w:instrText xml:space="preserve"> PAGEREF _Toc229827218 \h </w:instrText>
         </w:r>
         <w:r>
           <w:rPr>
@@ -1593,13 +1593,12 @@
           <w:lang w:eastAsia="ru-RU"/>
         </w:rPr>
       </w:pPr>
-      <w:hyperlink w:anchor="_Toc229822771" w:history="1">
+      <w:hyperlink w:anchor="_Toc229827219" w:history="1">
         <w:r>
           <w:rPr>
             <w:rStyle w:val="a9"/>
             <w:rFonts w:eastAsia="Times New Roman"/>
             <w:noProof/>
-            <w:highlight w:val="yellow"/>
             <w:lang w:eastAsia="ru-RU"/>
           </w:rPr>
           <w:t>3.</w:t>
@@ -1617,7 +1616,6 @@
             <w:rStyle w:val="a9"/>
             <w:rFonts w:eastAsia="Times New Roman"/>
             <w:noProof/>
-            <w:highlight w:val="yellow"/>
             <w:lang w:eastAsia="ru-RU"/>
           </w:rPr>
           <w:t>Создание плановой документации</w:t>
@@ -1641,7 +1639,7 @@
             <w:noProof/>
             <w:webHidden/>
           </w:rPr>
-          <w:instrText xml:space="preserve"> PAGEREF _Toc229822771 \h </w:instrText>
+          <w:instrText xml:space="preserve"> PAGEREF _Toc229827219 \h </w:instrText>
         </w:r>
         <w:r>
           <w:rPr>
@@ -1685,7 +1683,7 @@
           <w:lang w:eastAsia="ru-RU"/>
         </w:rPr>
       </w:pPr>
-      <w:hyperlink w:anchor="_Toc229822772" w:history="1">
+      <w:hyperlink w:anchor="_Toc229827220" w:history="1">
         <w:r>
           <w:rPr>
             <w:rStyle w:val="a9"/>
@@ -1731,7 +1729,7 @@
             <w:noProof/>
             <w:webHidden/>
           </w:rPr>
-          <w:instrText xml:space="preserve"> PAGEREF _Toc229822772 \h </w:instrText>
+          <w:instrText xml:space="preserve"> PAGEREF _Toc229827220 \h </w:instrText>
         </w:r>
         <w:r>
           <w:rPr>
@@ -1775,7 +1773,7 @@
           <w:lang w:eastAsia="ru-RU"/>
         </w:rPr>
       </w:pPr>
-      <w:hyperlink w:anchor="_Toc229822773" w:history="1">
+      <w:hyperlink w:anchor="_Toc229827221" w:history="1">
         <w:r>
           <w:rPr>
             <w:rStyle w:val="a9"/>
@@ -1817,7 +1815,7 @@
             <w:noProof/>
             <w:webHidden/>
           </w:rPr>
-          <w:instrText xml:space="preserve"> PAGEREF _Toc229822773 \h </w:instrText>
+          <w:instrText xml:space="preserve"> PAGEREF _Toc229827221 \h </w:instrText>
         </w:r>
         <w:r>
           <w:rPr>
@@ -1861,7 +1859,7 @@
           <w:lang w:eastAsia="ru-RU"/>
         </w:rPr>
       </w:pPr>
-      <w:hyperlink w:anchor="_Toc229822774" w:history="1">
+      <w:hyperlink w:anchor="_Toc229827222" w:history="1">
         <w:r>
           <w:rPr>
             <w:rStyle w:val="a9"/>
@@ -1903,7 +1901,7 @@
             <w:noProof/>
             <w:webHidden/>
           </w:rPr>
-          <w:instrText xml:space="preserve"> PAGEREF _Toc229822774 \h </w:instrText>
+          <w:instrText xml:space="preserve"> PAGEREF _Toc229827222 \h </w:instrText>
         </w:r>
         <w:r>
           <w:rPr>
@@ -1947,7 +1945,7 @@
           <w:lang w:eastAsia="ru-RU"/>
         </w:rPr>
       </w:pPr>
-      <w:hyperlink w:anchor="_Toc229822775" w:history="1">
+      <w:hyperlink w:anchor="_Toc229827223" w:history="1">
         <w:r>
           <w:rPr>
             <w:rStyle w:val="a9"/>
@@ -1989,7 +1987,7 @@
             <w:noProof/>
             <w:webHidden/>
           </w:rPr>
-          <w:instrText xml:space="preserve"> PAGEREF _Toc229822775 \h </w:instrText>
+          <w:instrText xml:space="preserve"> PAGEREF _Toc229827223 \h </w:instrText>
         </w:r>
         <w:r>
           <w:rPr>
@@ -2033,7 +2031,7 @@
           <w:lang w:eastAsia="ru-RU"/>
         </w:rPr>
       </w:pPr>
-      <w:hyperlink w:anchor="_Toc229822776" w:history="1">
+      <w:hyperlink w:anchor="_Toc229827224" w:history="1">
         <w:r>
           <w:rPr>
             <w:rStyle w:val="a9"/>
@@ -2075,7 +2073,7 @@
             <w:noProof/>
             <w:webHidden/>
           </w:rPr>
-          <w:instrText xml:space="preserve"> PAGEREF _Toc229822776 \h </w:instrText>
+          <w:instrText xml:space="preserve"> PAGEREF _Toc229827224 \h </w:instrText>
         </w:r>
         <w:r>
           <w:rPr>
@@ -2119,7 +2117,7 @@
           <w:lang w:eastAsia="ru-RU"/>
         </w:rPr>
       </w:pPr>
-      <w:hyperlink w:anchor="_Toc229822777" w:history="1">
+      <w:hyperlink w:anchor="_Toc229827225" w:history="1">
         <w:r>
           <w:rPr>
             <w:rStyle w:val="a9"/>
@@ -2161,7 +2159,7 @@
             <w:noProof/>
             <w:webHidden/>
           </w:rPr>
-          <w:instrText xml:space="preserve"> PAGEREF _Toc229822777 \h </w:instrText>
+          <w:instrText xml:space="preserve"> PAGEREF _Toc229827225 \h </w:instrText>
         </w:r>
         <w:r>
           <w:rPr>
@@ -2205,7 +2203,7 @@
           <w:lang w:eastAsia="ru-RU"/>
         </w:rPr>
       </w:pPr>
-      <w:hyperlink w:anchor="_Toc229822778" w:history="1">
+      <w:hyperlink w:anchor="_Toc229827226" w:history="1">
         <w:r>
           <w:rPr>
             <w:rStyle w:val="a9"/>
@@ -2247,7 +2245,7 @@
             <w:noProof/>
             <w:webHidden/>
           </w:rPr>
-          <w:instrText xml:space="preserve"> PAGEREF _Toc229822778 \h </w:instrText>
+          <w:instrText xml:space="preserve"> PAGEREF _Toc229827226 \h </w:instrText>
         </w:r>
         <w:r>
           <w:rPr>
@@ -2280,6 +2278,350 @@
     </w:p>
     <w:p>
       <w:pPr>
+        <w:pStyle w:val="21"/>
+        <w:tabs>
+          <w:tab w:val="left" w:pos="880"/>
+          <w:tab w:val="right" w:leader="dot" w:pos="9344"/>
+        </w:tabs>
+        <w:rPr>
+          <w:rFonts w:eastAsiaTheme="minorEastAsia"/>
+          <w:noProof/>
+          <w:lang w:eastAsia="ru-RU"/>
+        </w:rPr>
+      </w:pPr>
+      <w:hyperlink w:anchor="_Toc229827227" w:history="1">
+        <w:r>
+          <w:rPr>
+            <w:rStyle w:val="a9"/>
+            <w:noProof/>
+          </w:rPr>
+          <w:t>3.4.</w:t>
+        </w:r>
+        <w:r>
+          <w:rPr>
+            <w:rFonts w:eastAsiaTheme="minorEastAsia"/>
+            <w:noProof/>
+            <w:lang w:eastAsia="ru-RU"/>
+          </w:rPr>
+          <w:tab/>
+        </w:r>
+        <w:r>
+          <w:rPr>
+            <w:rStyle w:val="a9"/>
+            <w:noProof/>
+          </w:rPr>
+          <w:t>Диаграмма развертывания</w:t>
+        </w:r>
+        <w:r>
+          <w:rPr>
+            <w:noProof/>
+            <w:webHidden/>
+          </w:rPr>
+          <w:tab/>
+        </w:r>
+        <w:r>
+          <w:rPr>
+            <w:noProof/>
+            <w:webHidden/>
+          </w:rPr>
+          <w:fldChar w:fldCharType="begin"/>
+        </w:r>
+        <w:r>
+          <w:rPr>
+            <w:noProof/>
+            <w:webHidden/>
+          </w:rPr>
+          <w:instrText xml:space="preserve"> PAGEREF _Toc229827227 \h </w:instrText>
+        </w:r>
+        <w:r>
+          <w:rPr>
+            <w:noProof/>
+            <w:webHidden/>
+          </w:rPr>
+        </w:r>
+        <w:r>
+          <w:rPr>
+            <w:noProof/>
+            <w:webHidden/>
+          </w:rPr>
+          <w:fldChar w:fldCharType="separate"/>
+        </w:r>
+        <w:r>
+          <w:rPr>
+            <w:noProof/>
+            <w:webHidden/>
+          </w:rPr>
+          <w:t>34</w:t>
+        </w:r>
+        <w:r>
+          <w:rPr>
+            <w:noProof/>
+            <w:webHidden/>
+          </w:rPr>
+          <w:fldChar w:fldCharType="end"/>
+        </w:r>
+      </w:hyperlink>
+    </w:p>
+    <w:p>
+      <w:pPr>
+        <w:pStyle w:val="31"/>
+        <w:tabs>
+          <w:tab w:val="left" w:pos="1320"/>
+          <w:tab w:val="right" w:leader="dot" w:pos="9344"/>
+        </w:tabs>
+        <w:rPr>
+          <w:rFonts w:eastAsiaTheme="minorEastAsia"/>
+          <w:noProof/>
+          <w:lang w:eastAsia="ru-RU"/>
+        </w:rPr>
+      </w:pPr>
+      <w:hyperlink w:anchor="_Toc229827228" w:history="1">
+        <w:r>
+          <w:rPr>
+            <w:rStyle w:val="a9"/>
+            <w:noProof/>
+          </w:rPr>
+          <w:t>3.4.1.</w:t>
+        </w:r>
+        <w:r>
+          <w:rPr>
+            <w:rFonts w:eastAsiaTheme="minorEastAsia"/>
+            <w:noProof/>
+            <w:lang w:eastAsia="ru-RU"/>
+          </w:rPr>
+          <w:tab/>
+        </w:r>
+        <w:r>
+          <w:rPr>
+            <w:rStyle w:val="a9"/>
+            <w:noProof/>
+          </w:rPr>
+          <w:t>Узлы и устройства</w:t>
+        </w:r>
+        <w:r>
+          <w:rPr>
+            <w:noProof/>
+            <w:webHidden/>
+          </w:rPr>
+          <w:tab/>
+        </w:r>
+        <w:r>
+          <w:rPr>
+            <w:noProof/>
+            <w:webHidden/>
+          </w:rPr>
+          <w:fldChar w:fldCharType="begin"/>
+        </w:r>
+        <w:r>
+          <w:rPr>
+            <w:noProof/>
+            <w:webHidden/>
+          </w:rPr>
+          <w:instrText xml:space="preserve"> PAGEREF _Toc229827228 \h </w:instrText>
+        </w:r>
+        <w:r>
+          <w:rPr>
+            <w:noProof/>
+            <w:webHidden/>
+          </w:rPr>
+        </w:r>
+        <w:r>
+          <w:rPr>
+            <w:noProof/>
+            <w:webHidden/>
+          </w:rPr>
+          <w:fldChar w:fldCharType="separate"/>
+        </w:r>
+        <w:r>
+          <w:rPr>
+            <w:noProof/>
+            <w:webHidden/>
+          </w:rPr>
+          <w:t>34</w:t>
+        </w:r>
+        <w:r>
+          <w:rPr>
+            <w:noProof/>
+            <w:webHidden/>
+          </w:rPr>
+          <w:fldChar w:fldCharType="end"/>
+        </w:r>
+      </w:hyperlink>
+    </w:p>
+    <w:p>
+      <w:pPr>
+        <w:pStyle w:val="31"/>
+        <w:tabs>
+          <w:tab w:val="left" w:pos="1320"/>
+          <w:tab w:val="right" w:leader="dot" w:pos="9344"/>
+        </w:tabs>
+        <w:rPr>
+          <w:rFonts w:eastAsiaTheme="minorEastAsia"/>
+          <w:noProof/>
+          <w:lang w:eastAsia="ru-RU"/>
+        </w:rPr>
+      </w:pPr>
+      <w:hyperlink w:anchor="_Toc229827229" w:history="1">
+        <w:r>
+          <w:rPr>
+            <w:rStyle w:val="a9"/>
+            <w:noProof/>
+          </w:rPr>
+          <w:t>3.4.2.</w:t>
+        </w:r>
+        <w:r>
+          <w:rPr>
+            <w:rFonts w:eastAsiaTheme="minorEastAsia"/>
+            <w:noProof/>
+            <w:lang w:eastAsia="ru-RU"/>
+          </w:rPr>
+          <w:tab/>
+        </w:r>
+        <w:r>
+          <w:rPr>
+            <w:rStyle w:val="a9"/>
+            <w:noProof/>
+          </w:rPr>
+          <w:t>Сервисы, размещённые на серверном узле</w:t>
+        </w:r>
+        <w:r>
+          <w:rPr>
+            <w:noProof/>
+            <w:webHidden/>
+          </w:rPr>
+          <w:tab/>
+        </w:r>
+        <w:r>
+          <w:rPr>
+            <w:noProof/>
+            <w:webHidden/>
+          </w:rPr>
+          <w:fldChar w:fldCharType="begin"/>
+        </w:r>
+        <w:r>
+          <w:rPr>
+            <w:noProof/>
+            <w:webHidden/>
+          </w:rPr>
+          <w:instrText xml:space="preserve"> PAGEREF _Toc229827229 \h </w:instrText>
+        </w:r>
+        <w:r>
+          <w:rPr>
+            <w:noProof/>
+            <w:webHidden/>
+          </w:rPr>
+        </w:r>
+        <w:r>
+          <w:rPr>
+            <w:noProof/>
+            <w:webHidden/>
+          </w:rPr>
+          <w:fldChar w:fldCharType="separate"/>
+        </w:r>
+        <w:r>
+          <w:rPr>
+            <w:noProof/>
+            <w:webHidden/>
+          </w:rPr>
+          <w:t>35</w:t>
+        </w:r>
+        <w:r>
+          <w:rPr>
+            <w:noProof/>
+            <w:webHidden/>
+          </w:rPr>
+          <w:fldChar w:fldCharType="end"/>
+        </w:r>
+      </w:hyperlink>
+    </w:p>
+    <w:p>
+      <w:pPr>
+        <w:pStyle w:val="31"/>
+        <w:tabs>
+          <w:tab w:val="left" w:pos="1320"/>
+          <w:tab w:val="right" w:leader="dot" w:pos="9344"/>
+        </w:tabs>
+        <w:rPr>
+          <w:rFonts w:eastAsiaTheme="minorEastAsia"/>
+          <w:noProof/>
+          <w:lang w:eastAsia="ru-RU"/>
+        </w:rPr>
+      </w:pPr>
+      <w:hyperlink w:anchor="_Toc229827230" w:history="1">
+        <w:r>
+          <w:rPr>
+            <w:rStyle w:val="a9"/>
+            <w:noProof/>
+          </w:rPr>
+          <w:t>3.4.3.</w:t>
+        </w:r>
+        <w:r>
+          <w:rPr>
+            <w:rFonts w:eastAsiaTheme="minorEastAsia"/>
+            <w:noProof/>
+            <w:lang w:eastAsia="ru-RU"/>
+          </w:rPr>
+          <w:tab/>
+        </w:r>
+        <w:r>
+          <w:rPr>
+            <w:rStyle w:val="a9"/>
+            <w:noProof/>
+          </w:rPr>
+          <w:t>Базы данных</w:t>
+        </w:r>
+        <w:r>
+          <w:rPr>
+            <w:noProof/>
+            <w:webHidden/>
+          </w:rPr>
+          <w:tab/>
+        </w:r>
+        <w:r>
+          <w:rPr>
+            <w:noProof/>
+            <w:webHidden/>
+          </w:rPr>
+          <w:fldChar w:fldCharType="begin"/>
+        </w:r>
+        <w:r>
+          <w:rPr>
+            <w:noProof/>
+            <w:webHidden/>
+          </w:rPr>
+          <w:instrText xml:space="preserve"> PAGEREF _Toc229827230 \h </w:instrText>
+        </w:r>
+        <w:r>
+          <w:rPr>
+            <w:noProof/>
+            <w:webHidden/>
+          </w:rPr>
+        </w:r>
+        <w:r>
+          <w:rPr>
+            <w:noProof/>
+            <w:webHidden/>
+          </w:rPr>
+          <w:fldChar w:fldCharType="separate"/>
+        </w:r>
+        <w:r>
+          <w:rPr>
+            <w:noProof/>
+            <w:webHidden/>
+          </w:rPr>
+          <w:t>35</w:t>
+        </w:r>
+        <w:r>
+          <w:rPr>
+            <w:noProof/>
+            <w:webHidden/>
+          </w:rPr>
+          <w:fldChar w:fldCharType="end"/>
+        </w:r>
+      </w:hyperlink>
+    </w:p>
+    <w:p>
+      <w:pPr>
         <w:pStyle w:val="11"/>
         <w:tabs>
           <w:tab w:val="left" w:pos="440"/>
@@ -2291,7 +2633,7 @@
           <w:lang w:eastAsia="ru-RU"/>
         </w:rPr>
       </w:pPr>
-      <w:hyperlink w:anchor="_Toc229822779" w:history="1">
+      <w:hyperlink w:anchor="_Toc229827231" w:history="1">
         <w:r>
           <w:rPr>
             <w:rStyle w:val="a9"/>
@@ -2338,7 +2680,7 @@
             <w:noProof/>
             <w:webHidden/>
           </w:rPr>
-          <w:instrText xml:space="preserve"> PAGEREF _Toc229822779 \h </w:instrText>
+          <w:instrText xml:space="preserve"> PAGEREF _Toc229827231 \h </w:instrText>
         </w:r>
         <w:r>
           <w:rPr>
@@ -2358,7 +2700,7 @@
             <w:noProof/>
             <w:webHidden/>
           </w:rPr>
-          <w:t>35</w:t>
+          <w:t>37</w:t>
         </w:r>
         <w:r>
           <w:rPr>
@@ -2382,7 +2724,7 @@
           <w:lang w:eastAsia="ru-RU"/>
         </w:rPr>
       </w:pPr>
-      <w:hyperlink w:anchor="_Toc229822780" w:history="1">
+      <w:hyperlink w:anchor="_Toc229827232" w:history="1">
         <w:r>
           <w:rPr>
             <w:rStyle w:val="a9"/>
@@ -2430,7 +2772,7 @@
             <w:noProof/>
             <w:webHidden/>
           </w:rPr>
-          <w:instrText xml:space="preserve"> PAGEREF _Toc229822780 \h </w:instrText>
+          <w:instrText xml:space="preserve"> PAGEREF _Toc229827232 \h </w:instrText>
         </w:r>
         <w:r>
           <w:rPr>
@@ -2450,7 +2792,7 @@
             <w:noProof/>
             <w:webHidden/>
           </w:rPr>
-          <w:t>36</w:t>
+          <w:t>38</w:t>
         </w:r>
         <w:r>
           <w:rPr>
@@ -2474,7 +2816,7 @@
           <w:lang w:eastAsia="ru-RU"/>
         </w:rPr>
       </w:pPr>
-      <w:hyperlink w:anchor="_Toc229822781" w:history="1">
+      <w:hyperlink w:anchor="_Toc229827233" w:history="1">
         <w:r>
           <w:rPr>
             <w:rStyle w:val="a9"/>
@@ -2522,7 +2864,7 @@
             <w:noProof/>
             <w:webHidden/>
           </w:rPr>
-          <w:instrText xml:space="preserve"> PAGEREF _Toc229822781 \h </w:instrText>
+          <w:instrText xml:space="preserve"> PAGEREF _Toc229827233 \h </w:instrText>
         </w:r>
         <w:r>
           <w:rPr>
@@ -2542,7 +2884,7 @@
             <w:noProof/>
             <w:webHidden/>
           </w:rPr>
-          <w:t>37</w:t>
+          <w:t>39</w:t>
         </w:r>
         <w:r>
           <w:rPr>
@@ -2565,7 +2907,7 @@
           <w:lang w:eastAsia="ru-RU"/>
         </w:rPr>
       </w:pPr>
-      <w:hyperlink w:anchor="_Toc229822782" w:history="1">
+      <w:hyperlink w:anchor="_Toc229827234" w:history="1">
         <w:r>
           <w:rPr>
             <w:rStyle w:val="a9"/>
@@ -2595,7 +2937,7 @@
             <w:noProof/>
             <w:webHidden/>
           </w:rPr>
-          <w:instrText xml:space="preserve"> PAGEREF _Toc229822782 \h </w:instrText>
+          <w:instrText xml:space="preserve"> PAGEREF _Toc229827234 \h </w:instrText>
         </w:r>
         <w:r>
           <w:rPr>
@@ -2615,7 +2957,7 @@
             <w:noProof/>
             <w:webHidden/>
           </w:rPr>
-          <w:t>38</w:t>
+          <w:t>40</w:t>
         </w:r>
         <w:r>
           <w:rPr>
@@ -2647,6 +2989,8 @@
         </w:rPr>
         <w:fldChar w:fldCharType="end"/>
       </w:r>
+      <w:bookmarkStart w:id="2" w:name="_GoBack"/>
+      <w:bookmarkEnd w:id="2"/>
     </w:p>
     <w:p>
       <w:pPr>
@@ -2676,7 +3020,7 @@
           <w:lang w:eastAsia="ru-RU"/>
         </w:rPr>
       </w:pPr>
-      <w:bookmarkStart w:id="2" w:name="_Toc229822766"/>
+      <w:bookmarkStart w:id="3" w:name="_Toc229827214"/>
       <w:r>
         <w:rPr>
           <w:rFonts w:eastAsia="Times New Roman"/>
@@ -2685,7 +3029,7 @@
         <w:lastRenderedPageBreak/>
         <w:t>Введение</w:t>
       </w:r>
-      <w:bookmarkEnd w:id="2"/>
+      <w:bookmarkEnd w:id="3"/>
     </w:p>
     <w:p>
       <w:pPr>
@@ -3586,7 +3930,7 @@
           <w:lang w:eastAsia="ru-RU"/>
         </w:rPr>
       </w:pPr>
-      <w:bookmarkStart w:id="3" w:name="_Toc229822767"/>
+      <w:bookmarkStart w:id="4" w:name="_Toc229827215"/>
       <w:r>
         <w:rPr>
           <w:rFonts w:eastAsia="Times New Roman"/>
@@ -3595,7 +3939,7 @@
         <w:lastRenderedPageBreak/>
         <w:t>Концепт проекта</w:t>
       </w:r>
-      <w:bookmarkEnd w:id="3"/>
+      <w:bookmarkEnd w:id="4"/>
     </w:p>
     <w:p>
       <w:pPr>
@@ -3609,7 +3953,7 @@
           <w:lang w:eastAsia="ru-RU"/>
         </w:rPr>
       </w:pPr>
-      <w:bookmarkStart w:id="4" w:name="_Toc229822768"/>
+      <w:bookmarkStart w:id="5" w:name="_Toc229827216"/>
       <w:r>
         <w:rPr>
           <w:rFonts w:eastAsia="Times New Roman"/>
@@ -3617,7 +3961,7 @@
         </w:rPr>
         <w:t>Общее описание проекта</w:t>
       </w:r>
-      <w:bookmarkEnd w:id="4"/>
+      <w:bookmarkEnd w:id="5"/>
     </w:p>
     <w:p>
       <w:pPr>
@@ -4306,7 +4650,7 @@
           <w:lang w:eastAsia="ru-RU"/>
         </w:rPr>
       </w:pPr>
-      <w:bookmarkStart w:id="5" w:name="_Toc229822769"/>
+      <w:bookmarkStart w:id="6" w:name="_Toc229827217"/>
       <w:r>
         <w:rPr>
           <w:rFonts w:eastAsia="Times New Roman"/>
@@ -4314,7 +4658,7 @@
         </w:rPr>
         <w:t>Техническое задание</w:t>
       </w:r>
-      <w:bookmarkEnd w:id="5"/>
+      <w:bookmarkEnd w:id="6"/>
     </w:p>
     <w:p>
       <w:pPr>
@@ -17776,7 +18120,7 @@
           <w:lang w:eastAsia="ru-RU"/>
         </w:rPr>
       </w:pPr>
-      <w:bookmarkStart w:id="6" w:name="_Toc229822770"/>
+      <w:bookmarkStart w:id="7" w:name="_Toc229827218"/>
       <w:r>
         <w:rPr>
           <w:rFonts w:eastAsia="Times New Roman"/>
@@ -17786,7 +18130,7 @@
         <w:lastRenderedPageBreak/>
         <w:t>Формирование команды</w:t>
       </w:r>
-      <w:bookmarkEnd w:id="6"/>
+      <w:bookmarkEnd w:id="7"/>
     </w:p>
     <w:p>
       <w:pPr>
@@ -17933,45 +18277,19 @@
         </w:numPr>
         <w:rPr>
           <w:rFonts w:eastAsia="Times New Roman"/>
-          <w:highlight w:val="yellow"/>
-          <w:lang w:eastAsia="ru-RU"/>
-        </w:rPr>
-      </w:pPr>
-      <w:bookmarkStart w:id="7" w:name="_Toc229822771"/>
+          <w:lang w:eastAsia="ru-RU"/>
+        </w:rPr>
+      </w:pPr>
+      <w:bookmarkStart w:id="8" w:name="_Toc229827219"/>
       <w:r>
         <w:rPr>
           <w:rFonts w:eastAsia="Times New Roman"/>
-          <w:highlight w:val="yellow"/>
           <w:lang w:eastAsia="ru-RU"/>
         </w:rPr>
         <w:lastRenderedPageBreak/>
         <w:t>Создание плановой документации</w:t>
       </w:r>
-      <w:bookmarkEnd w:id="7"/>
-    </w:p>
-    <w:p>
-      <w:pPr>
-        <w:spacing w:after="100" w:afterAutospacing="1" w:line="360" w:lineRule="auto"/>
-        <w:ind w:firstLine="709"/>
-        <w:contextualSpacing/>
-        <w:jc w:val="both"/>
-        <w:rPr>
-          <w:rFonts w:ascii="Times New Roman" w:eastAsia="Times New Roman" w:hAnsi="Times New Roman" w:cs="Times New Roman"/>
-          <w:sz w:val="28"/>
-          <w:szCs w:val="28"/>
-          <w:lang w:eastAsia="ru-RU"/>
-        </w:rPr>
-      </w:pPr>
-      <w:r>
-        <w:rPr>
-          <w:rFonts w:ascii="Times New Roman" w:eastAsia="Times New Roman" w:hAnsi="Times New Roman" w:cs="Times New Roman"/>
-          <w:sz w:val="28"/>
-          <w:szCs w:val="28"/>
-          <w:highlight w:val="yellow"/>
-          <w:lang w:eastAsia="ru-RU"/>
-        </w:rPr>
-        <w:t>Описание системы с помощью диаграммы использования и других общих диаграмм.</w:t>
-      </w:r>
+      <w:bookmarkEnd w:id="8"/>
     </w:p>
     <w:p>
       <w:pPr>
@@ -18035,7 +18353,7 @@
           <w:lang w:eastAsia="ru-RU"/>
         </w:rPr>
       </w:pPr>
-      <w:bookmarkStart w:id="8" w:name="_Toc229822772"/>
+      <w:bookmarkStart w:id="9" w:name="_Toc229827220"/>
       <w:r>
         <w:rPr>
           <w:rFonts w:eastAsia="Times New Roman"/>
@@ -18043,7 +18361,7 @@
         </w:rPr>
         <w:t>Диаграмма Использования</w:t>
       </w:r>
-      <w:bookmarkEnd w:id="8"/>
+      <w:bookmarkEnd w:id="9"/>
     </w:p>
     <w:p>
       <w:pPr>
@@ -18417,7 +18735,6 @@
           <w:sz w:val="28"/>
           <w:szCs w:val="28"/>
         </w:rPr>
-        <w:lastRenderedPageBreak/>
         <w:t xml:space="preserve">Добавление/изменение билетов: администратор имеет права на </w:t>
       </w:r>
       <w:r>
@@ -18460,6 +18777,7 @@
           <w:sz w:val="28"/>
           <w:szCs w:val="28"/>
         </w:rPr>
+        <w:lastRenderedPageBreak/>
         <w:t>Прохождение тестирования: пользователь запускает выбранный режим и начинает тестирование</w:t>
       </w:r>
     </w:p>
@@ -18922,11 +19240,11 @@
           <w:numId w:val="41"/>
         </w:numPr>
       </w:pPr>
-      <w:bookmarkStart w:id="9" w:name="_Toc229822773"/>
+      <w:bookmarkStart w:id="10" w:name="_Toc229827221"/>
       <w:r>
         <w:t>Диаграмма классов</w:t>
       </w:r>
-      <w:bookmarkEnd w:id="9"/>
+      <w:bookmarkEnd w:id="10"/>
     </w:p>
     <w:p>
       <w:pPr>
@@ -18965,11 +19283,11 @@
         </w:numPr>
         <w:ind w:left="1418"/>
       </w:pPr>
-      <w:bookmarkStart w:id="10" w:name="_Toc229822774"/>
+      <w:bookmarkStart w:id="11" w:name="_Toc229827222"/>
       <w:r>
         <w:t>Гость и ограниченный доступ</w:t>
       </w:r>
-      <w:bookmarkEnd w:id="10"/>
+      <w:bookmarkEnd w:id="11"/>
     </w:p>
     <w:p>
       <w:pPr>
@@ -19017,11 +19335,11 @@
         </w:numPr>
         <w:ind w:left="1418"/>
       </w:pPr>
-      <w:bookmarkStart w:id="11" w:name="_Toc229822775"/>
+      <w:bookmarkStart w:id="12" w:name="_Toc229827223"/>
       <w:r>
         <w:t>Зарегистрированный пользователь: полный цикл тестирования</w:t>
       </w:r>
-      <w:bookmarkEnd w:id="11"/>
+      <w:bookmarkEnd w:id="12"/>
     </w:p>
     <w:p>
       <w:pPr>
@@ -19148,15 +19466,7 @@
           <w:sz w:val="28"/>
           <w:szCs w:val="28"/>
         </w:rPr>
-        <w:t xml:space="preserve">– </w:t>
-      </w:r>
-      <w:r>
-        <w:rPr>
-          <w:rFonts w:ascii="Times New Roman" w:hAnsi="Times New Roman" w:cs="Times New Roman"/>
-          <w:sz w:val="28"/>
-          <w:szCs w:val="28"/>
-        </w:rPr>
-        <w:t>предоставляется набор из 20 вопросов, с правом ошибиться только 2 раза, после этого тестирование завершается.</w:t>
+        <w:t>– предоставляется набор из 20 вопросов, с правом ошибиться только 2 раза, после этого тестирование завершается.</w:t>
       </w:r>
     </w:p>
     <w:p>
@@ -19428,11 +19738,11 @@
         </w:numPr>
         <w:ind w:left="1418"/>
       </w:pPr>
-      <w:bookmarkStart w:id="12" w:name="_Toc229822776"/>
+      <w:bookmarkStart w:id="13" w:name="_Toc229827224"/>
       <w:r>
         <w:t>Администратор: управление контентом</w:t>
       </w:r>
-      <w:bookmarkEnd w:id="12"/>
+      <w:bookmarkEnd w:id="13"/>
     </w:p>
     <w:p>
       <w:pPr>
@@ -19667,11 +19977,11 @@
           <w:numId w:val="41"/>
         </w:numPr>
       </w:pPr>
-      <w:bookmarkStart w:id="13" w:name="_Toc229822777"/>
+      <w:bookmarkStart w:id="14" w:name="_Toc229827225"/>
       <w:r>
         <w:t>Связи между процессами</w:t>
       </w:r>
-      <w:bookmarkEnd w:id="13"/>
+      <w:bookmarkEnd w:id="14"/>
     </w:p>
     <w:p>
       <w:pPr>
@@ -19827,8 +20137,10 @@
       <w:r>
         <w:rPr>
           <w:rFonts w:ascii="Times New Roman" w:hAnsi="Times New Roman" w:cs="Times New Roman"/>
-          <w:sz w:val="28"/>
-          <w:szCs w:val="28"/>
+          <w:noProof/>
+          <w:sz w:val="28"/>
+          <w:szCs w:val="28"/>
+          <w:lang w:eastAsia="ru-RU"/>
         </w:rPr>
         <w:lastRenderedPageBreak/>
         <w:drawing>
@@ -19908,11 +20220,11 @@
           <w:numId w:val="41"/>
         </w:numPr>
       </w:pPr>
-      <w:bookmarkStart w:id="14" w:name="_Toc229822778"/>
+      <w:bookmarkStart w:id="15" w:name="_Toc229827226"/>
       <w:r>
         <w:t>Диаграмма компонентов</w:t>
       </w:r>
-      <w:bookmarkEnd w:id="14"/>
+      <w:bookmarkEnd w:id="15"/>
     </w:p>
     <w:p>
       <w:pPr>
@@ -20174,9 +20486,11 @@
           <w:numId w:val="41"/>
         </w:numPr>
       </w:pPr>
+      <w:bookmarkStart w:id="16" w:name="_Toc229827227"/>
       <w:r>
         <w:t>Диаграмма развертывания</w:t>
       </w:r>
+      <w:bookmarkEnd w:id="16"/>
     </w:p>
     <w:p>
       <w:pPr>
@@ -20189,6 +20503,37 @@
           <w:szCs w:val="28"/>
         </w:rPr>
       </w:pPr>
+      <w:r>
+        <w:rPr>
+          <w:rFonts w:ascii="Times New Roman" w:hAnsi="Times New Roman" w:cs="Times New Roman"/>
+          <w:sz w:val="28"/>
+          <w:szCs w:val="28"/>
+        </w:rPr>
+        <w:t>Диаграмма развёртывания отражает физическую архитектуру системы: какие узлы участвуют в работе, как они соединены и какие сервисы на них разм</w:t>
+      </w:r>
+      <w:r>
+        <w:rPr>
+          <w:rFonts w:ascii="Times New Roman" w:hAnsi="Times New Roman" w:cs="Times New Roman"/>
+          <w:sz w:val="28"/>
+          <w:szCs w:val="28"/>
+        </w:rPr>
+        <w:t>ещены.</w:t>
+      </w:r>
+    </w:p>
+    <w:p>
+      <w:pPr>
+        <w:pStyle w:val="3"/>
+        <w:numPr>
+          <w:ilvl w:val="2"/>
+          <w:numId w:val="41"/>
+        </w:numPr>
+        <w:ind w:left="1418"/>
+      </w:pPr>
+      <w:bookmarkStart w:id="17" w:name="_Toc229827228"/>
+      <w:r>
+        <w:t>Узлы и устройства</w:t>
+      </w:r>
+      <w:bookmarkEnd w:id="17"/>
     </w:p>
     <w:p>
       <w:pPr>
@@ -20201,6 +20546,22 @@
           <w:szCs w:val="28"/>
         </w:rPr>
       </w:pPr>
+      <w:r>
+        <w:rPr>
+          <w:rFonts w:ascii="Times New Roman" w:hAnsi="Times New Roman" w:cs="Times New Roman"/>
+          <w:sz w:val="28"/>
+          <w:szCs w:val="28"/>
+        </w:rPr>
+        <w:t>Клиентская ч</w:t>
+      </w:r>
+      <w:r>
+        <w:rPr>
+          <w:rFonts w:ascii="Times New Roman" w:hAnsi="Times New Roman" w:cs="Times New Roman"/>
+          <w:sz w:val="28"/>
+          <w:szCs w:val="28"/>
+        </w:rPr>
+        <w:t>асть (на стороне пользователя):</w:t>
+      </w:r>
     </w:p>
     <w:p>
       <w:pPr>
@@ -20213,6 +20574,22 @@
           <w:szCs w:val="28"/>
         </w:rPr>
       </w:pPr>
+      <w:r>
+        <w:rPr>
+          <w:rFonts w:ascii="Times New Roman" w:hAnsi="Times New Roman" w:cs="Times New Roman"/>
+          <w:sz w:val="28"/>
+          <w:szCs w:val="28"/>
+        </w:rPr>
+        <w:t>Клиент — устройство пользователя (ПК, ноутбук, смартфон), на котором работает веб-клиент. Через него пользоват</w:t>
+      </w:r>
+      <w:r>
+        <w:rPr>
+          <w:rFonts w:ascii="Times New Roman" w:hAnsi="Times New Roman" w:cs="Times New Roman"/>
+          <w:sz w:val="28"/>
+          <w:szCs w:val="28"/>
+        </w:rPr>
+        <w:t>ель взаимодействует с системой.</w:t>
+      </w:r>
     </w:p>
     <w:p>
       <w:pPr>
@@ -20225,6 +20602,22 @@
           <w:szCs w:val="28"/>
         </w:rPr>
       </w:pPr>
+      <w:r>
+        <w:rPr>
+          <w:rFonts w:ascii="Times New Roman" w:hAnsi="Times New Roman" w:cs="Times New Roman"/>
+          <w:sz w:val="28"/>
+          <w:szCs w:val="28"/>
+        </w:rPr>
+        <w:t>Сотрудник — устройство администратора или модератора, также оснащённое веб-клиентом, но с особыми привилегиями (во</w:t>
+      </w:r>
+      <w:r>
+        <w:rPr>
+          <w:rFonts w:ascii="Times New Roman" w:hAnsi="Times New Roman" w:cs="Times New Roman"/>
+          <w:sz w:val="28"/>
+          <w:szCs w:val="28"/>
+        </w:rPr>
+        <w:t>зможность управлять контентом).</w:t>
+      </w:r>
     </w:p>
     <w:p>
       <w:pPr>
@@ -20237,6 +20630,40 @@
           <w:szCs w:val="28"/>
         </w:rPr>
       </w:pPr>
+      <w:r>
+        <w:rPr>
+          <w:rFonts w:ascii="Times New Roman" w:hAnsi="Times New Roman" w:cs="Times New Roman"/>
+          <w:sz w:val="28"/>
+          <w:szCs w:val="28"/>
+        </w:rPr>
+        <w:t xml:space="preserve">Оба клиента подключаются к серверной части через </w:t>
+      </w:r>
+      <w:proofErr w:type="spellStart"/>
+      <w:r>
+        <w:rPr>
+          <w:rFonts w:ascii="Times New Roman" w:hAnsi="Times New Roman" w:cs="Times New Roman"/>
+          <w:sz w:val="28"/>
+          <w:szCs w:val="28"/>
+        </w:rPr>
+        <w:t>интернет-соед</w:t>
+      </w:r>
+      <w:r>
+        <w:rPr>
+          <w:rFonts w:ascii="Times New Roman" w:hAnsi="Times New Roman" w:cs="Times New Roman"/>
+          <w:sz w:val="28"/>
+          <w:szCs w:val="28"/>
+        </w:rPr>
+        <w:t>инение</w:t>
+      </w:r>
+      <w:proofErr w:type="spellEnd"/>
+      <w:r>
+        <w:rPr>
+          <w:rFonts w:ascii="Times New Roman" w:hAnsi="Times New Roman" w:cs="Times New Roman"/>
+          <w:sz w:val="28"/>
+          <w:szCs w:val="28"/>
+        </w:rPr>
+        <w:t xml:space="preserve"> (защищённое соединение).</w:t>
+      </w:r>
     </w:p>
     <w:p>
       <w:pPr>
@@ -20261,6 +20688,15 @@
           <w:szCs w:val="28"/>
         </w:rPr>
       </w:pPr>
+      <w:r>
+        <w:rPr>
+          <w:rFonts w:ascii="Times New Roman" w:hAnsi="Times New Roman" w:cs="Times New Roman"/>
+          <w:sz w:val="28"/>
+          <w:szCs w:val="28"/>
+        </w:rPr>
+        <w:lastRenderedPageBreak/>
+        <w:t>Серверная часть:</w:t>
+      </w:r>
     </w:p>
     <w:p>
       <w:pPr>
@@ -20273,6 +20709,602 @@
           <w:szCs w:val="28"/>
         </w:rPr>
       </w:pPr>
+      <w:r>
+        <w:rPr>
+          <w:rFonts w:ascii="Times New Roman" w:hAnsi="Times New Roman" w:cs="Times New Roman"/>
+          <w:sz w:val="28"/>
+          <w:szCs w:val="28"/>
+        </w:rPr>
+        <w:t xml:space="preserve">Сервис базы данных и сервисов — центральный узел, на котором </w:t>
+      </w:r>
+      <w:r>
+        <w:rPr>
+          <w:rFonts w:ascii="Times New Roman" w:hAnsi="Times New Roman" w:cs="Times New Roman"/>
+          <w:sz w:val="28"/>
+          <w:szCs w:val="28"/>
+        </w:rPr>
+        <w:t>развёрнуты все сервисы системы.</w:t>
+      </w:r>
+    </w:p>
+    <w:p>
+      <w:pPr>
+        <w:pStyle w:val="aa"/>
+        <w:numPr>
+          <w:ilvl w:val="2"/>
+          <w:numId w:val="41"/>
+        </w:numPr>
+        <w:spacing w:after="0" w:line="360" w:lineRule="auto"/>
+        <w:ind w:left="1418"/>
+        <w:jc w:val="both"/>
+        <w:rPr>
+          <w:rFonts w:ascii="Times New Roman" w:eastAsiaTheme="majorEastAsia" w:hAnsi="Times New Roman" w:cstheme="majorBidi"/>
+          <w:sz w:val="28"/>
+          <w:szCs w:val="24"/>
+        </w:rPr>
+      </w:pPr>
+      <w:bookmarkStart w:id="18" w:name="_Toc229827229"/>
+      <w:r>
+        <w:rPr>
+          <w:rStyle w:val="30"/>
+        </w:rPr>
+        <w:t>Сервисы, размещённые на серверном узле</w:t>
+      </w:r>
+      <w:bookmarkEnd w:id="18"/>
+    </w:p>
+    <w:p>
+      <w:pPr>
+        <w:spacing w:after="0" w:line="360" w:lineRule="auto"/>
+        <w:jc w:val="both"/>
+        <w:rPr>
+          <w:rFonts w:ascii="Times New Roman" w:hAnsi="Times New Roman" w:cs="Times New Roman"/>
+          <w:sz w:val="28"/>
+          <w:szCs w:val="28"/>
+        </w:rPr>
+      </w:pPr>
+      <w:r>
+        <w:rPr>
+          <w:rFonts w:ascii="Times New Roman" w:hAnsi="Times New Roman" w:cs="Times New Roman"/>
+          <w:sz w:val="28"/>
+          <w:szCs w:val="28"/>
+        </w:rPr>
+        <w:t xml:space="preserve">Таблица 21 – </w:t>
+      </w:r>
+      <w:r>
+        <w:rPr>
+          <w:rStyle w:val="30"/>
+        </w:rPr>
+        <w:t>Сервисы серверного узла.</w:t>
+      </w:r>
+    </w:p>
+    <w:tbl>
+      <w:tblPr>
+        <w:tblStyle w:val="ab"/>
+        <w:tblW w:w="0" w:type="auto"/>
+        <w:tblLook w:val="04A0" w:firstRow="1" w:lastRow="0" w:firstColumn="1" w:lastColumn="0" w:noHBand="0" w:noVBand="1"/>
+      </w:tblPr>
+      <w:tblGrid>
+        <w:gridCol w:w="4672"/>
+        <w:gridCol w:w="4672"/>
+      </w:tblGrid>
+      <w:tr>
+        <w:tc>
+          <w:tcPr>
+            <w:tcW w:w="4672" w:type="dxa"/>
+          </w:tcPr>
+          <w:p>
+            <w:pPr>
+              <w:jc w:val="both"/>
+              <w:rPr>
+                <w:rFonts w:ascii="Times New Roman" w:hAnsi="Times New Roman" w:cs="Times New Roman"/>
+                <w:sz w:val="24"/>
+                <w:szCs w:val="24"/>
+              </w:rPr>
+            </w:pPr>
+            <w:r>
+              <w:rPr>
+                <w:rFonts w:ascii="Times New Roman" w:hAnsi="Times New Roman" w:cs="Times New Roman"/>
+                <w:sz w:val="24"/>
+                <w:szCs w:val="24"/>
+              </w:rPr>
+              <w:t>Сервис</w:t>
+            </w:r>
+          </w:p>
+        </w:tc>
+        <w:tc>
+          <w:tcPr>
+            <w:tcW w:w="4672" w:type="dxa"/>
+          </w:tcPr>
+          <w:p>
+            <w:pPr>
+              <w:jc w:val="both"/>
+              <w:rPr>
+                <w:rFonts w:ascii="Times New Roman" w:hAnsi="Times New Roman" w:cs="Times New Roman"/>
+                <w:sz w:val="24"/>
+                <w:szCs w:val="24"/>
+              </w:rPr>
+            </w:pPr>
+            <w:r>
+              <w:rPr>
+                <w:rFonts w:ascii="Times New Roman" w:hAnsi="Times New Roman" w:cs="Times New Roman"/>
+                <w:sz w:val="24"/>
+                <w:szCs w:val="24"/>
+              </w:rPr>
+              <w:t>Назначение</w:t>
+            </w:r>
+          </w:p>
+        </w:tc>
+      </w:tr>
+      <w:tr>
+        <w:tc>
+          <w:tcPr>
+            <w:tcW w:w="4672" w:type="dxa"/>
+          </w:tcPr>
+          <w:p>
+            <w:pPr>
+              <w:jc w:val="both"/>
+              <w:rPr>
+                <w:rFonts w:ascii="Times New Roman" w:hAnsi="Times New Roman" w:cs="Times New Roman"/>
+                <w:sz w:val="24"/>
+                <w:szCs w:val="24"/>
+              </w:rPr>
+            </w:pPr>
+            <w:r>
+              <w:rPr>
+                <w:rFonts w:ascii="Times New Roman" w:hAnsi="Times New Roman" w:cs="Times New Roman"/>
+                <w:sz w:val="24"/>
+                <w:szCs w:val="24"/>
+              </w:rPr>
+              <w:t>Сервис авторизации и регистрации</w:t>
+            </w:r>
+          </w:p>
+        </w:tc>
+        <w:tc>
+          <w:tcPr>
+            <w:tcW w:w="4672" w:type="dxa"/>
+          </w:tcPr>
+          <w:p>
+            <w:pPr>
+              <w:jc w:val="both"/>
+              <w:rPr>
+                <w:rFonts w:ascii="Times New Roman" w:hAnsi="Times New Roman" w:cs="Times New Roman"/>
+                <w:sz w:val="24"/>
+                <w:szCs w:val="24"/>
+              </w:rPr>
+            </w:pPr>
+            <w:r>
+              <w:rPr>
+                <w:rFonts w:ascii="Times New Roman" w:hAnsi="Times New Roman" w:cs="Times New Roman"/>
+                <w:sz w:val="24"/>
+                <w:szCs w:val="24"/>
+              </w:rPr>
+              <w:t>Обрабатывает вход пользователей в систему, регистрацию новых аккаунтов и проверку прав доступа</w:t>
+            </w:r>
+          </w:p>
+        </w:tc>
+      </w:tr>
+      <w:tr>
+        <w:tc>
+          <w:tcPr>
+            <w:tcW w:w="4672" w:type="dxa"/>
+          </w:tcPr>
+          <w:p>
+            <w:pPr>
+              <w:jc w:val="both"/>
+              <w:rPr>
+                <w:rFonts w:ascii="Times New Roman" w:hAnsi="Times New Roman" w:cs="Times New Roman"/>
+                <w:sz w:val="24"/>
+                <w:szCs w:val="24"/>
+              </w:rPr>
+            </w:pPr>
+            <w:r>
+              <w:rPr>
+                <w:rFonts w:ascii="Times New Roman" w:hAnsi="Times New Roman" w:cs="Times New Roman"/>
+                <w:sz w:val="24"/>
+                <w:szCs w:val="24"/>
+              </w:rPr>
+              <w:t>Сервис тестирования</w:t>
+            </w:r>
+          </w:p>
+        </w:tc>
+        <w:tc>
+          <w:tcPr>
+            <w:tcW w:w="4672" w:type="dxa"/>
+          </w:tcPr>
+          <w:p>
+            <w:pPr>
+              <w:jc w:val="both"/>
+              <w:rPr>
+                <w:rFonts w:ascii="Times New Roman" w:hAnsi="Times New Roman" w:cs="Times New Roman"/>
+                <w:sz w:val="24"/>
+                <w:szCs w:val="24"/>
+              </w:rPr>
+            </w:pPr>
+            <w:r>
+              <w:rPr>
+                <w:rFonts w:ascii="Times New Roman" w:hAnsi="Times New Roman" w:cs="Times New Roman"/>
+                <w:sz w:val="24"/>
+                <w:szCs w:val="24"/>
+              </w:rPr>
+              <w:t>Проводит тестирование: выдаёт вопросы, принимает ответы, фиксирует результат</w:t>
+            </w:r>
+          </w:p>
+        </w:tc>
+      </w:tr>
+      <w:tr>
+        <w:tc>
+          <w:tcPr>
+            <w:tcW w:w="4672" w:type="dxa"/>
+          </w:tcPr>
+          <w:p>
+            <w:pPr>
+              <w:jc w:val="both"/>
+              <w:rPr>
+                <w:rFonts w:ascii="Times New Roman" w:hAnsi="Times New Roman" w:cs="Times New Roman"/>
+                <w:sz w:val="24"/>
+                <w:szCs w:val="24"/>
+              </w:rPr>
+            </w:pPr>
+            <w:r>
+              <w:rPr>
+                <w:rFonts w:ascii="Times New Roman" w:hAnsi="Times New Roman" w:cs="Times New Roman"/>
+                <w:sz w:val="24"/>
+                <w:szCs w:val="24"/>
+              </w:rPr>
+              <w:t>Сервис администратора</w:t>
+            </w:r>
+          </w:p>
+        </w:tc>
+        <w:tc>
+          <w:tcPr>
+            <w:tcW w:w="4672" w:type="dxa"/>
+          </w:tcPr>
+          <w:p>
+            <w:pPr>
+              <w:jc w:val="both"/>
+              <w:rPr>
+                <w:rFonts w:ascii="Times New Roman" w:hAnsi="Times New Roman" w:cs="Times New Roman"/>
+                <w:sz w:val="24"/>
+                <w:szCs w:val="24"/>
+              </w:rPr>
+            </w:pPr>
+            <w:r>
+              <w:rPr>
+                <w:rFonts w:ascii="Times New Roman" w:hAnsi="Times New Roman" w:cs="Times New Roman"/>
+                <w:sz w:val="24"/>
+                <w:szCs w:val="24"/>
+              </w:rPr>
+              <w:t>Обеспечивает функции управления контентом: добавление, редактирование и удаление вопросов</w:t>
+            </w:r>
+          </w:p>
+        </w:tc>
+      </w:tr>
+      <w:tr>
+        <w:tc>
+          <w:tcPr>
+            <w:tcW w:w="4672" w:type="dxa"/>
+          </w:tcPr>
+          <w:p>
+            <w:pPr>
+              <w:jc w:val="both"/>
+              <w:rPr>
+                <w:rFonts w:ascii="Times New Roman" w:hAnsi="Times New Roman" w:cs="Times New Roman"/>
+                <w:sz w:val="24"/>
+                <w:szCs w:val="24"/>
+              </w:rPr>
+            </w:pPr>
+            <w:r>
+              <w:rPr>
+                <w:rFonts w:ascii="Times New Roman" w:hAnsi="Times New Roman" w:cs="Times New Roman"/>
+                <w:sz w:val="24"/>
+                <w:szCs w:val="24"/>
+              </w:rPr>
+              <w:t>Сервис аналитики</w:t>
+            </w:r>
+          </w:p>
+        </w:tc>
+        <w:tc>
+          <w:tcPr>
+            <w:tcW w:w="4672" w:type="dxa"/>
+          </w:tcPr>
+          <w:p>
+            <w:pPr>
+              <w:jc w:val="both"/>
+              <w:rPr>
+                <w:rFonts w:ascii="Times New Roman" w:hAnsi="Times New Roman" w:cs="Times New Roman"/>
+                <w:sz w:val="24"/>
+                <w:szCs w:val="24"/>
+              </w:rPr>
+            </w:pPr>
+            <w:r>
+              <w:rPr>
+                <w:rFonts w:ascii="Times New Roman" w:hAnsi="Times New Roman" w:cs="Times New Roman"/>
+                <w:sz w:val="24"/>
+                <w:szCs w:val="24"/>
+              </w:rPr>
+              <w:t>Собирает и обрабатывает статистику пользователей: соотношение правильных/неправильных ответов, прогресс, популярность режимов</w:t>
+            </w:r>
+          </w:p>
+        </w:tc>
+      </w:tr>
+    </w:tbl>
+    <w:p>
+      <w:pPr>
+        <w:spacing w:after="0" w:line="360" w:lineRule="auto"/>
+        <w:ind w:firstLine="709"/>
+        <w:jc w:val="both"/>
+        <w:rPr>
+          <w:rFonts w:ascii="Times New Roman" w:hAnsi="Times New Roman" w:cs="Times New Roman"/>
+          <w:sz w:val="28"/>
+          <w:szCs w:val="28"/>
+        </w:rPr>
+      </w:pPr>
+    </w:p>
+    <w:p>
+      <w:pPr>
+        <w:pStyle w:val="3"/>
+        <w:numPr>
+          <w:ilvl w:val="2"/>
+          <w:numId w:val="41"/>
+        </w:numPr>
+      </w:pPr>
+      <w:bookmarkStart w:id="19" w:name="_Toc229827230"/>
+      <w:r>
+        <w:t>Базы данных</w:t>
+      </w:r>
+      <w:bookmarkEnd w:id="19"/>
+    </w:p>
+    <w:p>
+      <w:pPr>
+        <w:spacing w:after="0" w:line="360" w:lineRule="auto"/>
+        <w:ind w:firstLine="709"/>
+        <w:jc w:val="both"/>
+        <w:rPr>
+          <w:rFonts w:ascii="Times New Roman" w:hAnsi="Times New Roman" w:cs="Times New Roman"/>
+          <w:sz w:val="28"/>
+          <w:szCs w:val="28"/>
+        </w:rPr>
+      </w:pPr>
+      <w:r>
+        <w:rPr>
+          <w:rFonts w:ascii="Times New Roman" w:hAnsi="Times New Roman" w:cs="Times New Roman"/>
+          <w:sz w:val="28"/>
+          <w:szCs w:val="28"/>
+        </w:rPr>
+        <w:t>На том же серверном уз</w:t>
+      </w:r>
+      <w:r>
+        <w:rPr>
+          <w:rFonts w:ascii="Times New Roman" w:hAnsi="Times New Roman" w:cs="Times New Roman"/>
+          <w:sz w:val="28"/>
+          <w:szCs w:val="28"/>
+        </w:rPr>
+        <w:t>ле расположены две базы данных:</w:t>
+      </w:r>
+    </w:p>
+    <w:p>
+      <w:pPr>
+        <w:spacing w:after="0" w:line="360" w:lineRule="auto"/>
+        <w:ind w:firstLine="709"/>
+        <w:jc w:val="both"/>
+        <w:rPr>
+          <w:rFonts w:ascii="Times New Roman" w:hAnsi="Times New Roman" w:cs="Times New Roman"/>
+          <w:sz w:val="28"/>
+          <w:szCs w:val="28"/>
+        </w:rPr>
+      </w:pPr>
+      <w:r>
+        <w:rPr>
+          <w:rFonts w:ascii="Times New Roman" w:hAnsi="Times New Roman" w:cs="Times New Roman"/>
+          <w:sz w:val="28"/>
+          <w:szCs w:val="28"/>
+        </w:rPr>
+        <w:t>База данных вопросов — хранит банк теоретических вопросов с правил</w:t>
+      </w:r>
+      <w:r>
+        <w:rPr>
+          <w:rFonts w:ascii="Times New Roman" w:hAnsi="Times New Roman" w:cs="Times New Roman"/>
+          <w:sz w:val="28"/>
+          <w:szCs w:val="28"/>
+        </w:rPr>
+        <w:t>ьными и неправильными ответами.</w:t>
+      </w:r>
+    </w:p>
+    <w:p>
+      <w:pPr>
+        <w:spacing w:after="0" w:line="360" w:lineRule="auto"/>
+        <w:ind w:firstLine="709"/>
+        <w:jc w:val="both"/>
+        <w:rPr>
+          <w:rFonts w:ascii="Times New Roman" w:hAnsi="Times New Roman" w:cs="Times New Roman"/>
+          <w:sz w:val="28"/>
+          <w:szCs w:val="28"/>
+        </w:rPr>
+      </w:pPr>
+      <w:r>
+        <w:rPr>
+          <w:rFonts w:ascii="Times New Roman" w:hAnsi="Times New Roman" w:cs="Times New Roman"/>
+          <w:sz w:val="28"/>
+          <w:szCs w:val="28"/>
+        </w:rPr>
+        <w:t xml:space="preserve">База данных клиентов — хранит информацию о пользователях (логины, пароли, </w:t>
+      </w:r>
+      <w:r>
+        <w:rPr>
+          <w:rFonts w:ascii="Times New Roman" w:hAnsi="Times New Roman" w:cs="Times New Roman"/>
+          <w:sz w:val="28"/>
+          <w:szCs w:val="28"/>
+        </w:rPr>
+        <w:t>личные данные) и их статистику.</w:t>
+      </w:r>
+    </w:p>
+    <w:p>
+      <w:pPr>
+        <w:spacing w:after="0" w:line="360" w:lineRule="auto"/>
+        <w:ind w:firstLine="709"/>
+        <w:jc w:val="both"/>
+        <w:rPr>
+          <w:rFonts w:ascii="Times New Roman" w:hAnsi="Times New Roman" w:cs="Times New Roman"/>
+          <w:sz w:val="28"/>
+          <w:szCs w:val="28"/>
+        </w:rPr>
+      </w:pPr>
+      <w:r>
+        <w:rPr>
+          <w:rFonts w:ascii="Times New Roman" w:hAnsi="Times New Roman" w:cs="Times New Roman"/>
+          <w:sz w:val="28"/>
+          <w:szCs w:val="28"/>
+        </w:rPr>
+        <w:t>4. Связи между элементами</w:t>
+      </w:r>
+    </w:p>
+    <w:p>
+      <w:pPr>
+        <w:spacing w:after="0" w:line="360" w:lineRule="auto"/>
+        <w:ind w:firstLine="709"/>
+        <w:jc w:val="both"/>
+        <w:rPr>
+          <w:rFonts w:ascii="Times New Roman" w:hAnsi="Times New Roman" w:cs="Times New Roman"/>
+          <w:sz w:val="28"/>
+          <w:szCs w:val="28"/>
+        </w:rPr>
+      </w:pPr>
+      <w:r>
+        <w:rPr>
+          <w:rFonts w:ascii="Times New Roman" w:hAnsi="Times New Roman" w:cs="Times New Roman"/>
+          <w:sz w:val="28"/>
+          <w:szCs w:val="28"/>
+        </w:rPr>
+        <w:t>Клиент и Сотрудник соединены с серверным узлом через интернет (защищённое соединение). Оба обращаются к сервису авторизации</w:t>
+      </w:r>
+      <w:r>
+        <w:rPr>
+          <w:rFonts w:ascii="Times New Roman" w:hAnsi="Times New Roman" w:cs="Times New Roman"/>
+          <w:sz w:val="28"/>
+          <w:szCs w:val="28"/>
+        </w:rPr>
+        <w:t xml:space="preserve"> для входа в систему.</w:t>
+      </w:r>
+    </w:p>
+    <w:p>
+      <w:pPr>
+        <w:spacing w:after="0" w:line="360" w:lineRule="auto"/>
+        <w:ind w:firstLine="709"/>
+        <w:jc w:val="both"/>
+        <w:rPr>
+          <w:rFonts w:ascii="Times New Roman" w:hAnsi="Times New Roman" w:cs="Times New Roman"/>
+          <w:sz w:val="28"/>
+          <w:szCs w:val="28"/>
+        </w:rPr>
+      </w:pPr>
+      <w:r>
+        <w:rPr>
+          <w:rFonts w:ascii="Times New Roman" w:hAnsi="Times New Roman" w:cs="Times New Roman"/>
+          <w:sz w:val="28"/>
+          <w:szCs w:val="28"/>
+        </w:rPr>
+        <w:t>После авторизации клиент получает доступ к сервису тестирования (для прохождения тестов) и к сервису аналит</w:t>
+      </w:r>
+      <w:r>
+        <w:rPr>
+          <w:rFonts w:ascii="Times New Roman" w:hAnsi="Times New Roman" w:cs="Times New Roman"/>
+          <w:sz w:val="28"/>
+          <w:szCs w:val="28"/>
+        </w:rPr>
+        <w:t>ики (для просмотра статистики).</w:t>
+      </w:r>
+    </w:p>
+    <w:p>
+      <w:pPr>
+        <w:spacing w:after="0" w:line="360" w:lineRule="auto"/>
+        <w:ind w:firstLine="709"/>
+        <w:jc w:val="both"/>
+        <w:rPr>
+          <w:rFonts w:ascii="Times New Roman" w:hAnsi="Times New Roman" w:cs="Times New Roman"/>
+          <w:sz w:val="28"/>
+          <w:szCs w:val="28"/>
+        </w:rPr>
+      </w:pPr>
+      <w:r>
+        <w:rPr>
+          <w:rFonts w:ascii="Times New Roman" w:hAnsi="Times New Roman" w:cs="Times New Roman"/>
+          <w:sz w:val="28"/>
+          <w:szCs w:val="28"/>
+        </w:rPr>
+        <w:lastRenderedPageBreak/>
+        <w:t>Сотрудник после авторизации с особыми привилегиями получает доступ к сервису администратора д</w:t>
+      </w:r>
+      <w:r>
+        <w:rPr>
+          <w:rFonts w:ascii="Times New Roman" w:hAnsi="Times New Roman" w:cs="Times New Roman"/>
+          <w:sz w:val="28"/>
+          <w:szCs w:val="28"/>
+        </w:rPr>
+        <w:t>ля управления базой вопросов.</w:t>
+      </w:r>
+    </w:p>
+    <w:p>
+      <w:pPr>
+        <w:spacing w:after="0" w:line="360" w:lineRule="auto"/>
+        <w:ind w:firstLine="709"/>
+        <w:jc w:val="both"/>
+        <w:rPr>
+          <w:rFonts w:ascii="Times New Roman" w:hAnsi="Times New Roman" w:cs="Times New Roman"/>
+          <w:sz w:val="28"/>
+          <w:szCs w:val="28"/>
+        </w:rPr>
+      </w:pPr>
+      <w:r>
+        <w:rPr>
+          <w:rFonts w:ascii="Times New Roman" w:hAnsi="Times New Roman" w:cs="Times New Roman"/>
+          <w:sz w:val="28"/>
+          <w:szCs w:val="28"/>
+        </w:rPr>
+        <w:t>Сервис тестирования обращается к базе данных в</w:t>
+      </w:r>
+      <w:r>
+        <w:rPr>
+          <w:rFonts w:ascii="Times New Roman" w:hAnsi="Times New Roman" w:cs="Times New Roman"/>
+          <w:sz w:val="28"/>
+          <w:szCs w:val="28"/>
+        </w:rPr>
+        <w:t>опросов для получения вопросов.</w:t>
+      </w:r>
+    </w:p>
+    <w:p>
+      <w:pPr>
+        <w:spacing w:after="0" w:line="360" w:lineRule="auto"/>
+        <w:ind w:firstLine="709"/>
+        <w:jc w:val="both"/>
+        <w:rPr>
+          <w:rFonts w:ascii="Times New Roman" w:hAnsi="Times New Roman" w:cs="Times New Roman"/>
+          <w:sz w:val="28"/>
+          <w:szCs w:val="28"/>
+        </w:rPr>
+      </w:pPr>
+      <w:r>
+        <w:rPr>
+          <w:rFonts w:ascii="Times New Roman" w:hAnsi="Times New Roman" w:cs="Times New Roman"/>
+          <w:sz w:val="28"/>
+          <w:szCs w:val="28"/>
+        </w:rPr>
+        <w:t>Сервис аналитики обращается</w:t>
+      </w:r>
+      <w:r>
+        <w:rPr>
+          <w:rFonts w:ascii="Times New Roman" w:hAnsi="Times New Roman" w:cs="Times New Roman"/>
+          <w:sz w:val="28"/>
+          <w:szCs w:val="28"/>
+        </w:rPr>
+        <w:t xml:space="preserve"> </w:t>
+      </w:r>
+      <w:r>
+        <w:rPr>
+          <w:rFonts w:ascii="Times New Roman" w:hAnsi="Times New Roman" w:cs="Times New Roman"/>
+          <w:sz w:val="28"/>
+          <w:szCs w:val="28"/>
+        </w:rPr>
+        <w:t>к базе данных клиентов для сбора статистики и записи результатов тестирования.</w:t>
+      </w:r>
     </w:p>
     <w:p>
       <w:pPr>
@@ -20285,19 +21317,17 @@
           <w:szCs w:val="28"/>
         </w:rPr>
       </w:pPr>
-      <w:bookmarkStart w:id="15" w:name="_GoBack"/>
       <w:r>
         <w:rPr>
           <w:rFonts w:ascii="Times New Roman" w:hAnsi="Times New Roman" w:cs="Times New Roman"/>
           <w:sz w:val="28"/>
           <w:szCs w:val="28"/>
         </w:rPr>
-        <w:lastRenderedPageBreak/>
         <w:drawing>
-          <wp:inline distT="0" distB="0" distL="0" distR="0" wp14:anchorId="675E84B0" wp14:editId="3B9A8E26">
-            <wp:extent cx="5839640" cy="2648320"/>
-            <wp:effectExtent l="0" t="0" r="0" b="0"/>
-            <wp:docPr id="4" name="Рисунок 4"/>
+          <wp:inline distT="0" distB="0" distL="0" distR="0" wp14:anchorId="1B846CDC" wp14:editId="60E0294B">
+            <wp:extent cx="5939790" cy="2784475"/>
+            <wp:effectExtent l="0" t="0" r="3810" b="0"/>
+            <wp:docPr id="5" name="Рисунок 5"/>
             <wp:cNvGraphicFramePr>
               <a:graphicFrameLocks xmlns:a="http://schemas.openxmlformats.org/drawingml/2006/main" noChangeAspect="1"/>
             </wp:cNvGraphicFramePr>
@@ -20317,7 +21347,7 @@
                   <pic:spPr>
                     <a:xfrm>
                       <a:off x="0" y="0"/>
-                      <a:ext cx="5839640" cy="2648320"/>
+                      <a:ext cx="5939790" cy="2784475"/>
                     </a:xfrm>
                     <a:prstGeom prst="rect">
                       <a:avLst/>
@@ -20329,7 +21359,6 @@
           </wp:inline>
         </w:drawing>
       </w:r>
-      <w:bookmarkEnd w:id="15"/>
     </w:p>
     <w:p>
       <w:pPr>
@@ -20350,78 +21379,6 @@
         </w:rPr>
         <w:t>Рисунок 4 – Диаграмма развертывания</w:t>
       </w:r>
-    </w:p>
-    <w:p>
-      <w:pPr>
-        <w:spacing w:after="0" w:line="360" w:lineRule="auto"/>
-        <w:ind w:firstLine="709"/>
-        <w:jc w:val="both"/>
-        <w:rPr>
-          <w:rFonts w:ascii="Times New Roman" w:hAnsi="Times New Roman" w:cs="Times New Roman"/>
-          <w:sz w:val="28"/>
-          <w:szCs w:val="28"/>
-        </w:rPr>
-      </w:pPr>
-    </w:p>
-    <w:p>
-      <w:pPr>
-        <w:spacing w:after="0" w:line="360" w:lineRule="auto"/>
-        <w:ind w:firstLine="709"/>
-        <w:jc w:val="both"/>
-        <w:rPr>
-          <w:rFonts w:ascii="Times New Roman" w:hAnsi="Times New Roman" w:cs="Times New Roman"/>
-          <w:sz w:val="28"/>
-          <w:szCs w:val="28"/>
-        </w:rPr>
-      </w:pPr>
-    </w:p>
-    <w:p>
-      <w:pPr>
-        <w:spacing w:after="0" w:line="360" w:lineRule="auto"/>
-        <w:ind w:firstLine="709"/>
-        <w:jc w:val="both"/>
-        <w:rPr>
-          <w:rFonts w:ascii="Times New Roman" w:hAnsi="Times New Roman" w:cs="Times New Roman"/>
-          <w:sz w:val="28"/>
-          <w:szCs w:val="28"/>
-        </w:rPr>
-      </w:pPr>
-    </w:p>
-    <w:p>
-      <w:pPr>
-        <w:spacing w:after="0" w:line="360" w:lineRule="auto"/>
-        <w:ind w:firstLine="709"/>
-        <w:jc w:val="both"/>
-        <w:rPr>
-          <w:rFonts w:ascii="Times New Roman" w:hAnsi="Times New Roman" w:cs="Times New Roman"/>
-          <w:sz w:val="28"/>
-          <w:szCs w:val="28"/>
-        </w:rPr>
-      </w:pPr>
-    </w:p>
-    <w:p>
-      <w:pPr>
-        <w:spacing w:after="0" w:line="360" w:lineRule="auto"/>
-        <w:ind w:firstLine="709"/>
-        <w:jc w:val="both"/>
-        <w:rPr>
-          <w:rFonts w:ascii="Times New Roman" w:hAnsi="Times New Roman" w:cs="Times New Roman"/>
-          <w:sz w:val="28"/>
-          <w:szCs w:val="28"/>
-        </w:rPr>
-      </w:pPr>
-    </w:p>
-    <w:p>
-      <w:pPr>
-        <w:spacing w:after="0" w:line="360" w:lineRule="auto"/>
-        <w:ind w:firstLine="709"/>
-        <w:jc w:val="both"/>
-        <w:rPr>
-          <w:rFonts w:ascii="Times New Roman" w:hAnsi="Times New Roman" w:cs="Times New Roman"/>
-          <w:sz w:val="28"/>
-          <w:szCs w:val="28"/>
-        </w:rPr>
-      </w:pPr>
     </w:p>
     <w:p>
       <w:pPr>
@@ -20453,7 +21410,7 @@
           <w:lang w:eastAsia="ru-RU"/>
         </w:rPr>
       </w:pPr>
-      <w:bookmarkStart w:id="16" w:name="_Toc229822779"/>
+      <w:bookmarkStart w:id="20" w:name="_Toc229827231"/>
       <w:r>
         <w:rPr>
           <w:rFonts w:eastAsia="Times New Roman"/>
@@ -20463,7 +21420,7 @@
         <w:lastRenderedPageBreak/>
         <w:t>Индивидуальные задание и создание индивидуальных диаграмм, разделенных по модулям.</w:t>
       </w:r>
-      <w:bookmarkEnd w:id="16"/>
+      <w:bookmarkEnd w:id="20"/>
     </w:p>
     <w:p>
       <w:pPr>
@@ -20592,7 +21549,7 @@
           <w:lang w:eastAsia="ru-RU"/>
         </w:rPr>
       </w:pPr>
-      <w:bookmarkStart w:id="17" w:name="_Toc229822780"/>
+      <w:bookmarkStart w:id="21" w:name="_Toc229827232"/>
       <w:r>
         <w:rPr>
           <w:rFonts w:eastAsia="Times New Roman"/>
@@ -20602,7 +21559,7 @@
         <w:lastRenderedPageBreak/>
         <w:t>Тестирование</w:t>
       </w:r>
-      <w:bookmarkEnd w:id="17"/>
+      <w:bookmarkEnd w:id="21"/>
     </w:p>
     <w:p>
       <w:pPr>
@@ -20717,7 +21674,7 @@
           <w:lang w:eastAsia="ru-RU"/>
         </w:rPr>
       </w:pPr>
-      <w:bookmarkStart w:id="18" w:name="_Toc229822781"/>
+      <w:bookmarkStart w:id="22" w:name="_Toc229827233"/>
       <w:r>
         <w:rPr>
           <w:rFonts w:eastAsia="Times New Roman"/>
@@ -20727,7 +21684,7 @@
         <w:lastRenderedPageBreak/>
         <w:t>Описание организации реализации проекта</w:t>
       </w:r>
-      <w:bookmarkEnd w:id="18"/>
+      <w:bookmarkEnd w:id="22"/>
     </w:p>
     <w:p>
       <w:pPr>
@@ -20836,7 +21793,7 @@
           <w:lang w:eastAsia="ru-RU"/>
         </w:rPr>
       </w:pPr>
-      <w:bookmarkStart w:id="19" w:name="_Toc229822782"/>
+      <w:bookmarkStart w:id="23" w:name="_Toc229827234"/>
       <w:r>
         <w:rPr>
           <w:rFonts w:eastAsia="Times New Roman"/>
@@ -20846,7 +21803,7 @@
         <w:lastRenderedPageBreak/>
         <w:t>Заключение</w:t>
       </w:r>
-      <w:bookmarkEnd w:id="19"/>
+      <w:bookmarkEnd w:id="23"/>
     </w:p>
     <w:p>
       <w:pPr>
@@ -21067,6 +22024,7 @@
         <w:docPartUnique/>
       </w:docPartObj>
     </w:sdtPr>
+    <w:sdtEndPr/>
     <w:sdtContent>
       <w:p>
         <w:pPr>
@@ -21086,7 +22044,7 @@
           <w:rPr>
             <w:noProof/>
           </w:rPr>
-          <w:t>35</w:t>
+          <w:t>2</w:t>
         </w:r>
         <w:r>
           <w:fldChar w:fldCharType="end"/>
@@ -27586,7 +28544,7 @@
 </file>
 
 <file path=customXml/itemProps1.xml><?xml version="1.0" encoding="utf-8"?>
-<ds:datastoreItem xmlns:ds="http://schemas.openxmlformats.org/officeDocument/2006/customXml" ds:itemID="{A13F06B0-4AB0-4063-BCD9-E136273DE1FA}">
+<ds:datastoreItem xmlns:ds="http://schemas.openxmlformats.org/officeDocument/2006/customXml" ds:itemID="{48E31AC9-1AE1-45DE-91C5-D8CCE591D6B8}">
   <ds:schemaRefs>
     <ds:schemaRef ds:uri="http://schemas.openxmlformats.org/officeDocument/2006/bibliography"/>
   </ds:schemaRefs>

</xml_diff>

<commit_message>
actual branch is develop and fixed document
</commit_message>
<xml_diff>
--- a/документация/Отчет.docx
+++ b/документация/Отчет.docx
@@ -295,19 +295,8 @@
           <w:szCs w:val="28"/>
           <w:lang w:eastAsia="ru-RU"/>
         </w:rPr>
-        <w:t xml:space="preserve">____________ Ю.С. </w:t>
-      </w:r>
-      <w:proofErr w:type="spellStart"/>
-      <w:r>
-        <w:rPr>
-          <w:rFonts w:ascii="Times New Roman" w:eastAsia="Times New Roman" w:hAnsi="Times New Roman" w:cs="Times New Roman"/>
-          <w:sz w:val="28"/>
-          <w:szCs w:val="28"/>
-          <w:lang w:eastAsia="ru-RU"/>
-        </w:rPr>
-        <w:t>Мамшева</w:t>
-      </w:r>
-      <w:proofErr w:type="spellEnd"/>
+        <w:t>____________ Ю.С. Мамшева</w:t>
+      </w:r>
     </w:p>
     <w:p>
       <w:pPr>
@@ -665,25 +654,7 @@
           <w:sz w:val="28"/>
           <w:lang w:eastAsia="ru-RU"/>
         </w:rPr>
-        <w:t xml:space="preserve">итель: ___________ </w:t>
-      </w:r>
-      <w:proofErr w:type="spellStart"/>
-      <w:r>
-        <w:rPr>
-          <w:rFonts w:ascii="Times New Roman" w:eastAsia="Times New Roman" w:hAnsi="Times New Roman" w:cs="Times New Roman"/>
-          <w:sz w:val="28"/>
-          <w:lang w:eastAsia="ru-RU"/>
-        </w:rPr>
-        <w:t>Мамшева</w:t>
-      </w:r>
-      <w:proofErr w:type="spellEnd"/>
-      <w:r>
-        <w:rPr>
-          <w:rFonts w:ascii="Times New Roman" w:eastAsia="Times New Roman" w:hAnsi="Times New Roman" w:cs="Times New Roman"/>
-          <w:sz w:val="28"/>
-          <w:lang w:eastAsia="ru-RU"/>
-        </w:rPr>
-        <w:t xml:space="preserve"> Ю.С.</w:t>
+        <w:t>итель: ___________ Мамшева Ю.С.</w:t>
       </w:r>
       <w:r>
         <w:rPr>
@@ -4021,8 +3992,6 @@
           </w:rPr>
           <w:tab/>
         </w:r>
-        <w:bookmarkStart w:id="2" w:name="_GoBack"/>
-        <w:bookmarkEnd w:id="2"/>
         <w:r>
           <w:rPr>
             <w:rStyle w:val="a9"/>
@@ -4463,7 +4432,27 @@
             <w:highlight w:val="yellow"/>
             <w:lang w:eastAsia="ru-RU"/>
           </w:rPr>
-          <w:t>Индивидуальные задание и создание индивидуальных диаграмм, разделенных по модулям.</w:t>
+          <w:t>Индивидуальные задание и создание инд</w:t>
+        </w:r>
+        <w:r>
+          <w:rPr>
+            <w:rStyle w:val="a9"/>
+            <w:rFonts w:eastAsia="Times New Roman"/>
+            <w:noProof/>
+            <w:highlight w:val="yellow"/>
+            <w:lang w:eastAsia="ru-RU"/>
+          </w:rPr>
+          <w:t>и</w:t>
+        </w:r>
+        <w:r>
+          <w:rPr>
+            <w:rStyle w:val="a9"/>
+            <w:rFonts w:eastAsia="Times New Roman"/>
+            <w:noProof/>
+            <w:highlight w:val="yellow"/>
+            <w:lang w:eastAsia="ru-RU"/>
+          </w:rPr>
+          <w:t>видуальных диаграмм, разделенных по модулям.</w:t>
         </w:r>
         <w:r>
           <w:rPr>
@@ -4822,8 +4811,8 @@
           <w:lang w:eastAsia="ru-RU"/>
         </w:rPr>
       </w:pPr>
-      <w:bookmarkStart w:id="3" w:name="_Toc229829439"/>
-      <w:bookmarkStart w:id="4" w:name="_Toc229829725"/>
+      <w:bookmarkStart w:id="2" w:name="_Toc229829439"/>
+      <w:bookmarkStart w:id="3" w:name="_Toc229829725"/>
       <w:r>
         <w:rPr>
           <w:rFonts w:eastAsia="Times New Roman"/>
@@ -4832,8 +4821,8 @@
         <w:lastRenderedPageBreak/>
         <w:t>Введение</w:t>
       </w:r>
+      <w:bookmarkEnd w:id="2"/>
       <w:bookmarkEnd w:id="3"/>
-      <w:bookmarkEnd w:id="4"/>
     </w:p>
     <w:p>
       <w:pPr>
@@ -5734,8 +5723,8 @@
           <w:lang w:eastAsia="ru-RU"/>
         </w:rPr>
       </w:pPr>
-      <w:bookmarkStart w:id="5" w:name="_Toc229829440"/>
-      <w:bookmarkStart w:id="6" w:name="_Toc229829726"/>
+      <w:bookmarkStart w:id="4" w:name="_Toc229829440"/>
+      <w:bookmarkStart w:id="5" w:name="_Toc229829726"/>
       <w:r>
         <w:rPr>
           <w:rFonts w:eastAsia="Times New Roman"/>
@@ -5744,8 +5733,8 @@
         <w:lastRenderedPageBreak/>
         <w:t>Концепт проекта</w:t>
       </w:r>
+      <w:bookmarkEnd w:id="4"/>
       <w:bookmarkEnd w:id="5"/>
-      <w:bookmarkEnd w:id="6"/>
     </w:p>
     <w:p>
       <w:pPr>
@@ -5759,8 +5748,8 @@
           <w:lang w:eastAsia="ru-RU"/>
         </w:rPr>
       </w:pPr>
-      <w:bookmarkStart w:id="7" w:name="_Toc229829441"/>
-      <w:bookmarkStart w:id="8" w:name="_Toc229829727"/>
+      <w:bookmarkStart w:id="6" w:name="_Toc229829441"/>
+      <w:bookmarkStart w:id="7" w:name="_Toc229829727"/>
       <w:r>
         <w:rPr>
           <w:rFonts w:eastAsia="Times New Roman"/>
@@ -5768,8 +5757,8 @@
         </w:rPr>
         <w:t>Общее описание проекта</w:t>
       </w:r>
+      <w:bookmarkEnd w:id="6"/>
       <w:bookmarkEnd w:id="7"/>
-      <w:bookmarkEnd w:id="8"/>
     </w:p>
     <w:p>
       <w:pPr>
@@ -5954,47 +5943,7 @@
           <w:szCs w:val="28"/>
           <w:lang w:eastAsia="ru-RU"/>
         </w:rPr>
-        <w:t>Проект «</w:t>
-      </w:r>
-      <w:proofErr w:type="spellStart"/>
-      <w:r>
-        <w:rPr>
-          <w:rFonts w:ascii="Times New Roman" w:eastAsia="Times New Roman" w:hAnsi="Times New Roman" w:cs="Times New Roman"/>
-          <w:sz w:val="28"/>
-          <w:szCs w:val="28"/>
-          <w:lang w:eastAsia="ru-RU"/>
-        </w:rPr>
-        <w:t>Wrong</w:t>
-      </w:r>
-      <w:proofErr w:type="spellEnd"/>
-      <w:r>
-        <w:rPr>
-          <w:rFonts w:ascii="Times New Roman" w:eastAsia="Times New Roman" w:hAnsi="Times New Roman" w:cs="Times New Roman"/>
-          <w:sz w:val="28"/>
-          <w:szCs w:val="28"/>
-          <w:lang w:eastAsia="ru-RU"/>
-        </w:rPr>
-        <w:t xml:space="preserve"> </w:t>
-      </w:r>
-      <w:proofErr w:type="spellStart"/>
-      <w:r>
-        <w:rPr>
-          <w:rFonts w:ascii="Times New Roman" w:eastAsia="Times New Roman" w:hAnsi="Times New Roman" w:cs="Times New Roman"/>
-          <w:sz w:val="28"/>
-          <w:szCs w:val="28"/>
-          <w:lang w:eastAsia="ru-RU"/>
-        </w:rPr>
-        <w:t>Turn</w:t>
-      </w:r>
-      <w:proofErr w:type="spellEnd"/>
-      <w:r>
-        <w:rPr>
-          <w:rFonts w:ascii="Times New Roman" w:eastAsia="Times New Roman" w:hAnsi="Times New Roman" w:cs="Times New Roman"/>
-          <w:sz w:val="28"/>
-          <w:szCs w:val="28"/>
-          <w:lang w:eastAsia="ru-RU"/>
-        </w:rPr>
-        <w:t>» актуален в связи с высоким уровнем аварийности среди начинающих водителей, причиной которого часто является недостаточная теоретическая подготовка и неумение применять правила в стрессовых ситуациях. Существующие тесты и билеты зачастую не предоставляют глубокого анализа ошибок пользователя и не адаптируют обучение под его слабые места. Разрабатываемый сервис решает эту проблему, предлагая интеллектуальный анализ подготовки (выявление «слепых зон» в знаниях), что повышает качество усвоения ПДД и, как следствие, безопасность на дороге.</w:t>
+        <w:t>Проект «Wrong Turn» актуален в связи с высоким уровнем аварийности среди начинающих водителей, причиной которого часто является недостаточная теоретическая подготовка и неумение применять правила в стрессовых ситуациях. Существующие тесты и билеты зачастую не предоставляют глубокого анализа ошибок пользователя и не адаптируют обучение под его слабые места. Разрабатываемый сервис решает эту проблему, предлагая интеллектуальный анализ подготовки (выявление «слепых зон» в знаниях), что повышает качество усвоения ПДД и, как следствие, безопасность на дороге.</w:t>
       </w:r>
     </w:p>
     <w:p>
@@ -6017,47 +5966,7 @@
           <w:szCs w:val="28"/>
           <w:lang w:eastAsia="ru-RU"/>
         </w:rPr>
-        <w:t>Актуальность разработки вспомогательного инструмента «</w:t>
-      </w:r>
-      <w:proofErr w:type="spellStart"/>
-      <w:r>
-        <w:rPr>
-          <w:rFonts w:ascii="Times New Roman" w:eastAsia="Times New Roman" w:hAnsi="Times New Roman" w:cs="Times New Roman"/>
-          <w:sz w:val="28"/>
-          <w:szCs w:val="28"/>
-          <w:lang w:eastAsia="ru-RU"/>
-        </w:rPr>
-        <w:t>Wrong</w:t>
-      </w:r>
-      <w:proofErr w:type="spellEnd"/>
-      <w:r>
-        <w:rPr>
-          <w:rFonts w:ascii="Times New Roman" w:eastAsia="Times New Roman" w:hAnsi="Times New Roman" w:cs="Times New Roman"/>
-          <w:sz w:val="28"/>
-          <w:szCs w:val="28"/>
-          <w:lang w:eastAsia="ru-RU"/>
-        </w:rPr>
-        <w:t xml:space="preserve"> </w:t>
-      </w:r>
-      <w:proofErr w:type="spellStart"/>
-      <w:r>
-        <w:rPr>
-          <w:rFonts w:ascii="Times New Roman" w:eastAsia="Times New Roman" w:hAnsi="Times New Roman" w:cs="Times New Roman"/>
-          <w:sz w:val="28"/>
-          <w:szCs w:val="28"/>
-          <w:lang w:eastAsia="ru-RU"/>
-        </w:rPr>
-        <w:t>Turn</w:t>
-      </w:r>
-      <w:proofErr w:type="spellEnd"/>
-      <w:r>
-        <w:rPr>
-          <w:rFonts w:ascii="Times New Roman" w:eastAsia="Times New Roman" w:hAnsi="Times New Roman" w:cs="Times New Roman"/>
-          <w:sz w:val="28"/>
-          <w:szCs w:val="28"/>
-          <w:lang w:eastAsia="ru-RU"/>
-        </w:rPr>
-        <w:t>» обусловлена несколькими ключевыми факторами в сфере подготовки водителей и б</w:t>
+        <w:t>Актуальность разработки вспомогательного инструмента «Wrong Turn» обусловлена несколькими ключевыми факторами в сфере подготовки водителей и б</w:t>
       </w:r>
       <w:r>
         <w:rPr>
@@ -6093,47 +6002,7 @@
           <w:szCs w:val="28"/>
           <w:lang w:eastAsia="ru-RU"/>
         </w:rPr>
-        <w:t>Высокий уровень аварийности по вине новичков. Статистика ГИБДД показывает, что значительная часть ДТП совершается водителями со стажем менее 2 лет. Основная причина — не твердое знание ПДД в нестандартных или стрессовых ситуациях (например, в условиях ограниченной видимости или интенсивного движения). «</w:t>
-      </w:r>
-      <w:proofErr w:type="spellStart"/>
-      <w:r>
-        <w:rPr>
-          <w:rFonts w:ascii="Times New Roman" w:eastAsia="Times New Roman" w:hAnsi="Times New Roman" w:cs="Times New Roman"/>
-          <w:sz w:val="28"/>
-          <w:szCs w:val="28"/>
-          <w:lang w:eastAsia="ru-RU"/>
-        </w:rPr>
-        <w:t>Wrong</w:t>
-      </w:r>
-      <w:proofErr w:type="spellEnd"/>
-      <w:r>
-        <w:rPr>
-          <w:rFonts w:ascii="Times New Roman" w:eastAsia="Times New Roman" w:hAnsi="Times New Roman" w:cs="Times New Roman"/>
-          <w:sz w:val="28"/>
-          <w:szCs w:val="28"/>
-          <w:lang w:eastAsia="ru-RU"/>
-        </w:rPr>
-        <w:t xml:space="preserve"> </w:t>
-      </w:r>
-      <w:proofErr w:type="spellStart"/>
-      <w:r>
-        <w:rPr>
-          <w:rFonts w:ascii="Times New Roman" w:eastAsia="Times New Roman" w:hAnsi="Times New Roman" w:cs="Times New Roman"/>
-          <w:sz w:val="28"/>
-          <w:szCs w:val="28"/>
-          <w:lang w:eastAsia="ru-RU"/>
-        </w:rPr>
-        <w:t>Turn</w:t>
-      </w:r>
-      <w:proofErr w:type="spellEnd"/>
-      <w:r>
-        <w:rPr>
-          <w:rFonts w:ascii="Times New Roman" w:eastAsia="Times New Roman" w:hAnsi="Times New Roman" w:cs="Times New Roman"/>
-          <w:sz w:val="28"/>
-          <w:szCs w:val="28"/>
-          <w:lang w:eastAsia="ru-RU"/>
-        </w:rPr>
-        <w:t>» направлен на л</w:t>
+        <w:t>Высокий уровень аварийности по вине новичков. Статистика ГИБДД показывает, что значительная часть ДТП совершается водителями со стажем менее 2 лет. Основная причина — не твердое знание ПДД в нестандартных или стрессовых ситуациях (например, в условиях ограниченной видимости или интенсивного движения). «Wrong Turn» направлен на л</w:t>
       </w:r>
       <w:r>
         <w:rPr>
@@ -6233,47 +6102,7 @@
           <w:szCs w:val="28"/>
           <w:lang w:eastAsia="ru-RU"/>
         </w:rPr>
-        <w:t xml:space="preserve"> тяготеет к адаптивному обучению. Проект «</w:t>
-      </w:r>
-      <w:proofErr w:type="spellStart"/>
-      <w:r>
-        <w:rPr>
-          <w:rFonts w:ascii="Times New Roman" w:eastAsia="Times New Roman" w:hAnsi="Times New Roman" w:cs="Times New Roman"/>
-          <w:sz w:val="28"/>
-          <w:szCs w:val="28"/>
-          <w:lang w:eastAsia="ru-RU"/>
-        </w:rPr>
-        <w:t>Wrong</w:t>
-      </w:r>
-      <w:proofErr w:type="spellEnd"/>
-      <w:r>
-        <w:rPr>
-          <w:rFonts w:ascii="Times New Roman" w:eastAsia="Times New Roman" w:hAnsi="Times New Roman" w:cs="Times New Roman"/>
-          <w:sz w:val="28"/>
-          <w:szCs w:val="28"/>
-          <w:lang w:eastAsia="ru-RU"/>
-        </w:rPr>
-        <w:t xml:space="preserve"> </w:t>
-      </w:r>
-      <w:proofErr w:type="spellStart"/>
-      <w:r>
-        <w:rPr>
-          <w:rFonts w:ascii="Times New Roman" w:eastAsia="Times New Roman" w:hAnsi="Times New Roman" w:cs="Times New Roman"/>
-          <w:sz w:val="28"/>
-          <w:szCs w:val="28"/>
-          <w:lang w:eastAsia="ru-RU"/>
-        </w:rPr>
-        <w:t>Turn</w:t>
-      </w:r>
-      <w:proofErr w:type="spellEnd"/>
-      <w:r>
-        <w:rPr>
-          <w:rFonts w:ascii="Times New Roman" w:eastAsia="Times New Roman" w:hAnsi="Times New Roman" w:cs="Times New Roman"/>
-          <w:sz w:val="28"/>
-          <w:szCs w:val="28"/>
-          <w:lang w:eastAsia="ru-RU"/>
-        </w:rPr>
-        <w:t>» предоставляет анализ деятельности обучающегося: выявляет темы, в которых пользователь чаще всего ошибается (например, «проезд перекрестков с круговым движением» или «железнодорожные переезды»), и формирует индивидуальную т</w:t>
+        <w:t xml:space="preserve"> тяготеет к адаптивному обучению. Проект «Wrong Turn» предоставляет анализ деятельности обучающегося: выявляет темы, в которых пользователь чаще всего ошибается (например, «проезд перекрестков с круговым движением» или «железнодорожные переезды»), и формирует индивидуальную т</w:t>
       </w:r>
       <w:r>
         <w:rPr>
@@ -6309,47 +6138,7 @@
           <w:szCs w:val="28"/>
           <w:lang w:eastAsia="ru-RU"/>
         </w:rPr>
-        <w:t>Психологическая подготовка к экзамену. Название «</w:t>
-      </w:r>
-      <w:proofErr w:type="spellStart"/>
-      <w:r>
-        <w:rPr>
-          <w:rFonts w:ascii="Times New Roman" w:eastAsia="Times New Roman" w:hAnsi="Times New Roman" w:cs="Times New Roman"/>
-          <w:sz w:val="28"/>
-          <w:szCs w:val="28"/>
-          <w:lang w:eastAsia="ru-RU"/>
-        </w:rPr>
-        <w:t>Wrong</w:t>
-      </w:r>
-      <w:proofErr w:type="spellEnd"/>
-      <w:r>
-        <w:rPr>
-          <w:rFonts w:ascii="Times New Roman" w:eastAsia="Times New Roman" w:hAnsi="Times New Roman" w:cs="Times New Roman"/>
-          <w:sz w:val="28"/>
-          <w:szCs w:val="28"/>
-          <w:lang w:eastAsia="ru-RU"/>
-        </w:rPr>
-        <w:t xml:space="preserve"> </w:t>
-      </w:r>
-      <w:proofErr w:type="spellStart"/>
-      <w:r>
-        <w:rPr>
-          <w:rFonts w:ascii="Times New Roman" w:eastAsia="Times New Roman" w:hAnsi="Times New Roman" w:cs="Times New Roman"/>
-          <w:sz w:val="28"/>
-          <w:szCs w:val="28"/>
-          <w:lang w:eastAsia="ru-RU"/>
-        </w:rPr>
-        <w:t>Turn</w:t>
-      </w:r>
-      <w:proofErr w:type="spellEnd"/>
-      <w:r>
-        <w:rPr>
-          <w:rFonts w:ascii="Times New Roman" w:eastAsia="Times New Roman" w:hAnsi="Times New Roman" w:cs="Times New Roman"/>
-          <w:sz w:val="28"/>
-          <w:szCs w:val="28"/>
-          <w:lang w:eastAsia="ru-RU"/>
-        </w:rPr>
-        <w:t>» символизирует безопасную среду для ошибок. В реальной жизни ошибка на дороге может стоить здоровья или жизни, а в учебном сервисе — это просто шаг к правильному пониманию. Проект учит не бояться ошибаться на этапе обучения, что снижает тревожност</w:t>
+        <w:t>Психологическая подготовка к экзамену. Название «Wrong Turn» символизирует безопасную среду для ошибок. В реальной жизни ошибка на дороге может стоить здоровья или жизни, а в учебном сервисе — это просто шаг к правильному пониманию. Проект учит не бояться ошибаться на этапе обучения, что снижает тревожност</w:t>
       </w:r>
       <w:r>
         <w:rPr>
@@ -6403,47 +6192,7 @@
           <w:szCs w:val="28"/>
           <w:lang w:eastAsia="ru-RU"/>
         </w:rPr>
-        <w:t xml:space="preserve"> «</w:t>
-      </w:r>
-      <w:proofErr w:type="spellStart"/>
-      <w:r>
-        <w:rPr>
-          <w:rFonts w:ascii="Times New Roman" w:eastAsia="Times New Roman" w:hAnsi="Times New Roman" w:cs="Times New Roman"/>
-          <w:sz w:val="28"/>
-          <w:szCs w:val="28"/>
-          <w:lang w:eastAsia="ru-RU"/>
-        </w:rPr>
-        <w:t>Wrong</w:t>
-      </w:r>
-      <w:proofErr w:type="spellEnd"/>
-      <w:r>
-        <w:rPr>
-          <w:rFonts w:ascii="Times New Roman" w:eastAsia="Times New Roman" w:hAnsi="Times New Roman" w:cs="Times New Roman"/>
-          <w:sz w:val="28"/>
-          <w:szCs w:val="28"/>
-          <w:lang w:eastAsia="ru-RU"/>
-        </w:rPr>
-        <w:t xml:space="preserve"> </w:t>
-      </w:r>
-      <w:proofErr w:type="spellStart"/>
-      <w:r>
-        <w:rPr>
-          <w:rFonts w:ascii="Times New Roman" w:eastAsia="Times New Roman" w:hAnsi="Times New Roman" w:cs="Times New Roman"/>
-          <w:sz w:val="28"/>
-          <w:szCs w:val="28"/>
-          <w:lang w:eastAsia="ru-RU"/>
-        </w:rPr>
-        <w:t>Turn</w:t>
-      </w:r>
-      <w:proofErr w:type="spellEnd"/>
-      <w:r>
-        <w:rPr>
-          <w:rFonts w:ascii="Times New Roman" w:eastAsia="Times New Roman" w:hAnsi="Times New Roman" w:cs="Times New Roman"/>
-          <w:sz w:val="28"/>
-          <w:szCs w:val="28"/>
-          <w:lang w:eastAsia="ru-RU"/>
-        </w:rPr>
-        <w:t>» может быть интегрирован как цифровой помощник для самостоятельной работы курсанта, позволяя преподавателю отслеживать прогресс группы (слабые места, динамику улучшений) без ручной проверки сотен тестов.</w:t>
+        <w:t xml:space="preserve"> «Wrong Turn» может быть интегрирован как цифровой помощник для самостоятельной работы курсанта, позволяя преподавателю отслеживать прогресс группы (слабые места, динамику улучшений) без ручной проверки сотен тестов.</w:t>
       </w:r>
     </w:p>
     <w:p>
@@ -6458,8 +6207,8 @@
           <w:lang w:eastAsia="ru-RU"/>
         </w:rPr>
       </w:pPr>
-      <w:bookmarkStart w:id="9" w:name="_Toc229829442"/>
-      <w:bookmarkStart w:id="10" w:name="_Toc229829728"/>
+      <w:bookmarkStart w:id="8" w:name="_Toc229829442"/>
+      <w:bookmarkStart w:id="9" w:name="_Toc229829728"/>
       <w:r>
         <w:rPr>
           <w:rFonts w:eastAsia="Times New Roman"/>
@@ -6467,8 +6216,8 @@
         </w:rPr>
         <w:t>Техническое задание</w:t>
       </w:r>
+      <w:bookmarkEnd w:id="8"/>
       <w:bookmarkEnd w:id="9"/>
-      <w:bookmarkEnd w:id="10"/>
     </w:p>
     <w:p>
       <w:pPr>
@@ -6626,47 +6375,7 @@
           <w:szCs w:val="28"/>
           <w:lang w:eastAsia="ru-RU"/>
         </w:rPr>
-        <w:t>Полное наименование: «</w:t>
-      </w:r>
-      <w:proofErr w:type="spellStart"/>
-      <w:r>
-        <w:rPr>
-          <w:rFonts w:ascii="Times New Roman" w:eastAsia="Times New Roman" w:hAnsi="Times New Roman" w:cs="Times New Roman"/>
-          <w:sz w:val="28"/>
-          <w:szCs w:val="28"/>
-          <w:lang w:eastAsia="ru-RU"/>
-        </w:rPr>
-        <w:t>Wrong</w:t>
-      </w:r>
-      <w:proofErr w:type="spellEnd"/>
-      <w:r>
-        <w:rPr>
-          <w:rFonts w:ascii="Times New Roman" w:eastAsia="Times New Roman" w:hAnsi="Times New Roman" w:cs="Times New Roman"/>
-          <w:sz w:val="28"/>
-          <w:szCs w:val="28"/>
-          <w:lang w:eastAsia="ru-RU"/>
-        </w:rPr>
-        <w:t xml:space="preserve"> </w:t>
-      </w:r>
-      <w:proofErr w:type="spellStart"/>
-      <w:r>
-        <w:rPr>
-          <w:rFonts w:ascii="Times New Roman" w:eastAsia="Times New Roman" w:hAnsi="Times New Roman" w:cs="Times New Roman"/>
-          <w:sz w:val="28"/>
-          <w:szCs w:val="28"/>
-          <w:lang w:eastAsia="ru-RU"/>
-        </w:rPr>
-        <w:t>Turn</w:t>
-      </w:r>
-      <w:proofErr w:type="spellEnd"/>
-      <w:r>
-        <w:rPr>
-          <w:rFonts w:ascii="Times New Roman" w:eastAsia="Times New Roman" w:hAnsi="Times New Roman" w:cs="Times New Roman"/>
-          <w:sz w:val="28"/>
-          <w:szCs w:val="28"/>
-          <w:lang w:eastAsia="ru-RU"/>
-        </w:rPr>
-        <w:t>».</w:t>
+        <w:t>Полное наименование: «Wrong Turn».</w:t>
       </w:r>
     </w:p>
     <w:p>
@@ -6802,47 +6511,7 @@
           <w:szCs w:val="28"/>
           <w:lang w:eastAsia="ru-RU"/>
         </w:rPr>
-        <w:t xml:space="preserve">- Высокий спрос: ежедневные запросы «сдать </w:t>
-      </w:r>
-      <w:proofErr w:type="spellStart"/>
-      <w:r>
-        <w:rPr>
-          <w:rFonts w:ascii="Times New Roman" w:eastAsia="Times New Roman" w:hAnsi="Times New Roman" w:cs="Times New Roman"/>
-          <w:sz w:val="28"/>
-          <w:szCs w:val="28"/>
-          <w:lang w:eastAsia="ru-RU"/>
-        </w:rPr>
-        <w:t>пдд</w:t>
-      </w:r>
-      <w:proofErr w:type="spellEnd"/>
-      <w:r>
-        <w:rPr>
-          <w:rFonts w:ascii="Times New Roman" w:eastAsia="Times New Roman" w:hAnsi="Times New Roman" w:cs="Times New Roman"/>
-          <w:sz w:val="28"/>
-          <w:szCs w:val="28"/>
-          <w:lang w:eastAsia="ru-RU"/>
-        </w:rPr>
-        <w:t xml:space="preserve"> онлайн» и «решать билеты </w:t>
-      </w:r>
-      <w:proofErr w:type="spellStart"/>
-      <w:r>
-        <w:rPr>
-          <w:rFonts w:ascii="Times New Roman" w:eastAsia="Times New Roman" w:hAnsi="Times New Roman" w:cs="Times New Roman"/>
-          <w:sz w:val="28"/>
-          <w:szCs w:val="28"/>
-          <w:lang w:eastAsia="ru-RU"/>
-        </w:rPr>
-        <w:t>пдд</w:t>
-      </w:r>
-      <w:proofErr w:type="spellEnd"/>
-      <w:r>
-        <w:rPr>
-          <w:rFonts w:ascii="Times New Roman" w:eastAsia="Times New Roman" w:hAnsi="Times New Roman" w:cs="Times New Roman"/>
-          <w:sz w:val="28"/>
-          <w:szCs w:val="28"/>
-          <w:lang w:eastAsia="ru-RU"/>
-        </w:rPr>
-        <w:t xml:space="preserve"> 2026»</w:t>
+        <w:t>- Высокий спрос: ежедневные запросы «сдать пдд онлайн» и «решать билеты пдд 2026»</w:t>
       </w:r>
     </w:p>
     <w:p>
@@ -6940,47 +6609,7 @@
           <w:szCs w:val="28"/>
           <w:lang w:eastAsia="ru-RU"/>
         </w:rPr>
-        <w:t>ИС «</w:t>
-      </w:r>
-      <w:proofErr w:type="spellStart"/>
-      <w:r>
-        <w:rPr>
-          <w:rFonts w:ascii="Times New Roman" w:eastAsia="Times New Roman" w:hAnsi="Times New Roman" w:cs="Times New Roman"/>
-          <w:sz w:val="28"/>
-          <w:szCs w:val="28"/>
-          <w:lang w:eastAsia="ru-RU"/>
-        </w:rPr>
-        <w:t>Wrong</w:t>
-      </w:r>
-      <w:proofErr w:type="spellEnd"/>
-      <w:r>
-        <w:rPr>
-          <w:rFonts w:ascii="Times New Roman" w:eastAsia="Times New Roman" w:hAnsi="Times New Roman" w:cs="Times New Roman"/>
-          <w:sz w:val="28"/>
-          <w:szCs w:val="28"/>
-          <w:lang w:eastAsia="ru-RU"/>
-        </w:rPr>
-        <w:t xml:space="preserve"> </w:t>
-      </w:r>
-      <w:proofErr w:type="spellStart"/>
-      <w:r>
-        <w:rPr>
-          <w:rFonts w:ascii="Times New Roman" w:eastAsia="Times New Roman" w:hAnsi="Times New Roman" w:cs="Times New Roman"/>
-          <w:sz w:val="28"/>
-          <w:szCs w:val="28"/>
-          <w:lang w:eastAsia="ru-RU"/>
-        </w:rPr>
-        <w:t>Turn</w:t>
-      </w:r>
-      <w:proofErr w:type="spellEnd"/>
-      <w:r>
-        <w:rPr>
-          <w:rFonts w:ascii="Times New Roman" w:eastAsia="Times New Roman" w:hAnsi="Times New Roman" w:cs="Times New Roman"/>
-          <w:sz w:val="28"/>
-          <w:szCs w:val="28"/>
-          <w:lang w:eastAsia="ru-RU"/>
-        </w:rPr>
-        <w:t xml:space="preserve">» предназначена для проведения тестирования знаний пользователя теорию по вождению, с акцентом отображения ошибок и отображения готовности пользователя к теоретическому экзамену. </w:t>
+        <w:t xml:space="preserve">ИС «Wrong Turn» предназначена для проведения тестирования знаний пользователя теорию по вождению, с акцентом отображения ошибок и отображения готовности пользователя к теоретическому экзамену. </w:t>
       </w:r>
     </w:p>
     <w:p>
@@ -7416,47 +7045,7 @@
           <w:szCs w:val="28"/>
           <w:lang w:eastAsia="ru-RU"/>
         </w:rPr>
-        <w:t>В ходе проектирования информационной системы «</w:t>
-      </w:r>
-      <w:proofErr w:type="spellStart"/>
-      <w:r>
-        <w:rPr>
-          <w:rFonts w:ascii="Times New Roman" w:eastAsia="Times New Roman" w:hAnsi="Times New Roman" w:cs="Times New Roman"/>
-          <w:sz w:val="28"/>
-          <w:szCs w:val="28"/>
-          <w:lang w:eastAsia="ru-RU"/>
-        </w:rPr>
-        <w:t>Wrong</w:t>
-      </w:r>
-      <w:proofErr w:type="spellEnd"/>
-      <w:r>
-        <w:rPr>
-          <w:rFonts w:ascii="Times New Roman" w:eastAsia="Times New Roman" w:hAnsi="Times New Roman" w:cs="Times New Roman"/>
-          <w:sz w:val="28"/>
-          <w:szCs w:val="28"/>
-          <w:lang w:eastAsia="ru-RU"/>
-        </w:rPr>
-        <w:t xml:space="preserve"> </w:t>
-      </w:r>
-      <w:proofErr w:type="spellStart"/>
-      <w:r>
-        <w:rPr>
-          <w:rFonts w:ascii="Times New Roman" w:eastAsia="Times New Roman" w:hAnsi="Times New Roman" w:cs="Times New Roman"/>
-          <w:sz w:val="28"/>
-          <w:szCs w:val="28"/>
-          <w:lang w:eastAsia="ru-RU"/>
-        </w:rPr>
-        <w:t>Turn</w:t>
-      </w:r>
-      <w:proofErr w:type="spellEnd"/>
-      <w:r>
-        <w:rPr>
-          <w:rFonts w:ascii="Times New Roman" w:eastAsia="Times New Roman" w:hAnsi="Times New Roman" w:cs="Times New Roman"/>
-          <w:sz w:val="28"/>
-          <w:szCs w:val="28"/>
-          <w:lang w:eastAsia="ru-RU"/>
-        </w:rPr>
-        <w:t>» были определены следующие цели, достижение которых обеспечивает решение выявленной проблемы - низкой эффективности ручного контроля знаний ПДД и отсутствия детализированной обратной связи по ошибкам тестируемого.</w:t>
+        <w:t>В ходе проектирования информационной системы «Wrong Turn» были определены следующие цели, достижение которых обеспечивает решение выявленной проблемы - низкой эффективности ручного контроля знаний ПДД и отсутствия детализированной обратной связи по ошибкам тестируемого.</w:t>
       </w:r>
     </w:p>
     <w:p>
@@ -7525,27 +7114,7 @@
           <w:szCs w:val="28"/>
           <w:lang w:eastAsia="ru-RU"/>
         </w:rPr>
-        <w:t xml:space="preserve">Цель 2. Обеспечение объективности и </w:t>
-      </w:r>
-      <w:proofErr w:type="spellStart"/>
-      <w:r>
-        <w:rPr>
-          <w:rFonts w:ascii="Times New Roman" w:eastAsia="Times New Roman" w:hAnsi="Times New Roman" w:cs="Times New Roman"/>
-          <w:sz w:val="28"/>
-          <w:szCs w:val="28"/>
-          <w:lang w:eastAsia="ru-RU"/>
-        </w:rPr>
-        <w:t>воспроизводимости</w:t>
-      </w:r>
-      <w:proofErr w:type="spellEnd"/>
-      <w:r>
-        <w:rPr>
-          <w:rFonts w:ascii="Times New Roman" w:eastAsia="Times New Roman" w:hAnsi="Times New Roman" w:cs="Times New Roman"/>
-          <w:sz w:val="28"/>
-          <w:szCs w:val="28"/>
-          <w:lang w:eastAsia="ru-RU"/>
-        </w:rPr>
-        <w:t xml:space="preserve"> результатов тестирования</w:t>
+        <w:t>Цель 2. Обеспечение объективности и воспроизводимости результатов тестирования</w:t>
       </w:r>
     </w:p>
     <w:p>
@@ -8060,27 +7629,7 @@
           <w:szCs w:val="28"/>
           <w:lang w:eastAsia="ru-RU"/>
         </w:rPr>
-        <w:t xml:space="preserve">Цель 2. Объективность и </w:t>
-      </w:r>
-      <w:proofErr w:type="spellStart"/>
-      <w:r>
-        <w:rPr>
-          <w:rFonts w:ascii="Times New Roman" w:eastAsia="Times New Roman" w:hAnsi="Times New Roman" w:cs="Times New Roman"/>
-          <w:sz w:val="28"/>
-          <w:szCs w:val="28"/>
-          <w:lang w:eastAsia="ru-RU"/>
-        </w:rPr>
-        <w:t>воспроизводимость</w:t>
-      </w:r>
-      <w:proofErr w:type="spellEnd"/>
-      <w:r>
-        <w:rPr>
-          <w:rFonts w:ascii="Times New Roman" w:eastAsia="Times New Roman" w:hAnsi="Times New Roman" w:cs="Times New Roman"/>
-          <w:sz w:val="28"/>
-          <w:szCs w:val="28"/>
-          <w:lang w:eastAsia="ru-RU"/>
-        </w:rPr>
-        <w:t xml:space="preserve"> результатов</w:t>
+        <w:t>Цель 2. Объективность и воспроизводимость результатов</w:t>
       </w:r>
     </w:p>
     <w:p>
@@ -8569,23 +8118,7 @@
                 <w:rFonts w:ascii="Times New Roman" w:hAnsi="Times New Roman" w:cs="Times New Roman"/>
                 <w:sz w:val="24"/>
               </w:rPr>
-              <w:t xml:space="preserve">Присутствие в выходном отчете </w:t>
-            </w:r>
-            <w:proofErr w:type="spellStart"/>
-            <w:r>
-              <w:rPr>
-                <w:rFonts w:ascii="Times New Roman" w:hAnsi="Times New Roman" w:cs="Times New Roman"/>
-                <w:sz w:val="24"/>
-              </w:rPr>
-              <w:t>потемной</w:t>
-            </w:r>
-            <w:proofErr w:type="spellEnd"/>
-            <w:r>
-              <w:rPr>
-                <w:rFonts w:ascii="Times New Roman" w:hAnsi="Times New Roman" w:cs="Times New Roman"/>
-                <w:sz w:val="24"/>
-              </w:rPr>
-              <w:t xml:space="preserve"> классификации ошибок</w:t>
+              <w:t>Присутствие в выходном отчете потемной классификации ошибок</w:t>
             </w:r>
           </w:p>
         </w:tc>
@@ -9049,23 +8582,7 @@
                 <w:rFonts w:ascii="Times New Roman" w:hAnsi="Times New Roman" w:cs="Times New Roman"/>
                 <w:sz w:val="24"/>
               </w:rPr>
-              <w:t xml:space="preserve">Да (механизм </w:t>
-            </w:r>
-            <w:proofErr w:type="spellStart"/>
-            <w:r>
-              <w:rPr>
-                <w:rFonts w:ascii="Times New Roman" w:hAnsi="Times New Roman" w:cs="Times New Roman"/>
-                <w:sz w:val="24"/>
-              </w:rPr>
-              <w:t>версионирования</w:t>
-            </w:r>
-            <w:proofErr w:type="spellEnd"/>
-            <w:r>
-              <w:rPr>
-                <w:rFonts w:ascii="Times New Roman" w:hAnsi="Times New Roman" w:cs="Times New Roman"/>
-                <w:sz w:val="24"/>
-              </w:rPr>
-              <w:t>)</w:t>
+              <w:t>Да (механизм версионирования)</w:t>
             </w:r>
           </w:p>
         </w:tc>
@@ -9174,47 +8691,7 @@
           <w:szCs w:val="28"/>
           <w:lang w:eastAsia="ru-RU"/>
         </w:rPr>
-        <w:t>В настоящем разделе приводится детализированное описание объектов, подвергаемых автоматизации в рамках ИС «</w:t>
-      </w:r>
-      <w:proofErr w:type="spellStart"/>
-      <w:r>
-        <w:rPr>
-          <w:rFonts w:ascii="Times New Roman" w:eastAsia="Times New Roman" w:hAnsi="Times New Roman" w:cs="Times New Roman"/>
-          <w:sz w:val="28"/>
-          <w:szCs w:val="28"/>
-          <w:lang w:eastAsia="ru-RU"/>
-        </w:rPr>
-        <w:t>Wrong</w:t>
-      </w:r>
-      <w:proofErr w:type="spellEnd"/>
-      <w:r>
-        <w:rPr>
-          <w:rFonts w:ascii="Times New Roman" w:eastAsia="Times New Roman" w:hAnsi="Times New Roman" w:cs="Times New Roman"/>
-          <w:sz w:val="28"/>
-          <w:szCs w:val="28"/>
-          <w:lang w:eastAsia="ru-RU"/>
-        </w:rPr>
-        <w:t xml:space="preserve"> </w:t>
-      </w:r>
-      <w:proofErr w:type="spellStart"/>
-      <w:r>
-        <w:rPr>
-          <w:rFonts w:ascii="Times New Roman" w:eastAsia="Times New Roman" w:hAnsi="Times New Roman" w:cs="Times New Roman"/>
-          <w:sz w:val="28"/>
-          <w:szCs w:val="28"/>
-          <w:lang w:eastAsia="ru-RU"/>
-        </w:rPr>
-        <w:t>Turn</w:t>
-      </w:r>
-      <w:proofErr w:type="spellEnd"/>
-      <w:r>
-        <w:rPr>
-          <w:rFonts w:ascii="Times New Roman" w:eastAsia="Times New Roman" w:hAnsi="Times New Roman" w:cs="Times New Roman"/>
-          <w:sz w:val="28"/>
-          <w:szCs w:val="28"/>
-          <w:lang w:eastAsia="ru-RU"/>
-        </w:rPr>
-        <w:t xml:space="preserve">». Под объектом автоматизации понимается информационная сущность или физический компонент системы, над которым выполняются автоматизированные процедуры (сбор, хранение, обработка, передача, отображение). Характеристика каждого объекта включает его функциональное назначение, </w:t>
+        <w:t xml:space="preserve">В настоящем разделе приводится детализированное описание объектов, подвергаемых автоматизации в рамках ИС «Wrong Turn». Под объектом автоматизации понимается информационная сущность или физический компонент системы, над которым выполняются автоматизированные процедуры (сбор, хранение, обработка, передача, отображение). Характеристика каждого объекта включает его функциональное назначение, </w:t>
       </w:r>
       <w:r>
         <w:rPr>
@@ -9349,27 +8826,7 @@
           <w:szCs w:val="28"/>
           <w:lang w:eastAsia="ru-RU"/>
         </w:rPr>
-        <w:t xml:space="preserve">Реляционная таблица в СУБД (SQL </w:t>
-      </w:r>
-      <w:proofErr w:type="spellStart"/>
-      <w:r>
-        <w:rPr>
-          <w:rFonts w:ascii="Times New Roman" w:eastAsia="Times New Roman" w:hAnsi="Times New Roman" w:cs="Times New Roman"/>
-          <w:sz w:val="28"/>
-          <w:szCs w:val="28"/>
-          <w:lang w:eastAsia="ru-RU"/>
-        </w:rPr>
-        <w:t>lite</w:t>
-      </w:r>
-      <w:proofErr w:type="spellEnd"/>
-      <w:r>
-        <w:rPr>
-          <w:rFonts w:ascii="Times New Roman" w:eastAsia="Times New Roman" w:hAnsi="Times New Roman" w:cs="Times New Roman"/>
-          <w:sz w:val="28"/>
-          <w:szCs w:val="28"/>
-          <w:lang w:eastAsia="ru-RU"/>
-        </w:rPr>
-        <w:t xml:space="preserve">). </w:t>
+        <w:t xml:space="preserve">Реляционная таблица в СУБД (SQL lite). </w:t>
       </w:r>
     </w:p>
     <w:p>
@@ -9586,47 +9043,7 @@
           <w:szCs w:val="28"/>
           <w:lang w:eastAsia="ru-RU"/>
         </w:rPr>
-        <w:t xml:space="preserve">Реляционная таблица с внешними ключами к </w:t>
-      </w:r>
-      <w:proofErr w:type="spellStart"/>
-      <w:r>
-        <w:rPr>
-          <w:rFonts w:ascii="Times New Roman" w:eastAsia="Times New Roman" w:hAnsi="Times New Roman" w:cs="Times New Roman"/>
-          <w:sz w:val="28"/>
-          <w:szCs w:val="28"/>
-          <w:lang w:eastAsia="ru-RU"/>
-        </w:rPr>
-        <w:t>questions</w:t>
-      </w:r>
-      <w:proofErr w:type="spellEnd"/>
-      <w:r>
-        <w:rPr>
-          <w:rFonts w:ascii="Times New Roman" w:eastAsia="Times New Roman" w:hAnsi="Times New Roman" w:cs="Times New Roman"/>
-          <w:sz w:val="28"/>
-          <w:szCs w:val="28"/>
-          <w:lang w:eastAsia="ru-RU"/>
-        </w:rPr>
-        <w:t xml:space="preserve"> и </w:t>
-      </w:r>
-      <w:proofErr w:type="spellStart"/>
-      <w:r>
-        <w:rPr>
-          <w:rFonts w:ascii="Times New Roman" w:eastAsia="Times New Roman" w:hAnsi="Times New Roman" w:cs="Times New Roman"/>
-          <w:sz w:val="28"/>
-          <w:szCs w:val="28"/>
-          <w:lang w:eastAsia="ru-RU"/>
-        </w:rPr>
-        <w:t>users</w:t>
-      </w:r>
-      <w:proofErr w:type="spellEnd"/>
-      <w:r>
-        <w:rPr>
-          <w:rFonts w:ascii="Times New Roman" w:eastAsia="Times New Roman" w:hAnsi="Times New Roman" w:cs="Times New Roman"/>
-          <w:sz w:val="28"/>
-          <w:szCs w:val="28"/>
-          <w:lang w:eastAsia="ru-RU"/>
-        </w:rPr>
-        <w:t xml:space="preserve">. </w:t>
+        <w:t xml:space="preserve">Реляционная таблица с внешними ключами к questions и users. </w:t>
       </w:r>
     </w:p>
     <w:p>
@@ -10186,47 +9603,7 @@
           <w:szCs w:val="28"/>
           <w:lang w:eastAsia="ru-RU"/>
         </w:rPr>
-        <w:t>Для обеспечения функционирования ИС «</w:t>
-      </w:r>
-      <w:proofErr w:type="spellStart"/>
-      <w:r>
-        <w:rPr>
-          <w:rFonts w:ascii="Times New Roman" w:eastAsia="Times New Roman" w:hAnsi="Times New Roman" w:cs="Times New Roman"/>
-          <w:sz w:val="28"/>
-          <w:szCs w:val="28"/>
-          <w:lang w:eastAsia="ru-RU"/>
-        </w:rPr>
-        <w:t>Wrong</w:t>
-      </w:r>
-      <w:proofErr w:type="spellEnd"/>
-      <w:r>
-        <w:rPr>
-          <w:rFonts w:ascii="Times New Roman" w:eastAsia="Times New Roman" w:hAnsi="Times New Roman" w:cs="Times New Roman"/>
-          <w:sz w:val="28"/>
-          <w:szCs w:val="28"/>
-          <w:lang w:eastAsia="ru-RU"/>
-        </w:rPr>
-        <w:t xml:space="preserve"> </w:t>
-      </w:r>
-      <w:proofErr w:type="spellStart"/>
-      <w:r>
-        <w:rPr>
-          <w:rFonts w:ascii="Times New Roman" w:eastAsia="Times New Roman" w:hAnsi="Times New Roman" w:cs="Times New Roman"/>
-          <w:sz w:val="28"/>
-          <w:szCs w:val="28"/>
-          <w:lang w:eastAsia="ru-RU"/>
-        </w:rPr>
-        <w:t>Turn</w:t>
-      </w:r>
-      <w:proofErr w:type="spellEnd"/>
-      <w:r>
-        <w:rPr>
-          <w:rFonts w:ascii="Times New Roman" w:eastAsia="Times New Roman" w:hAnsi="Times New Roman" w:cs="Times New Roman"/>
-          <w:sz w:val="28"/>
-          <w:szCs w:val="28"/>
-          <w:lang w:eastAsia="ru-RU"/>
-        </w:rPr>
-        <w:t>» предусматриваются следующие штатные единицы (или роли):</w:t>
+        <w:t>Для обеспечения функционирования ИС «Wrong Turn» предусматриваются следующие штатные единицы (или роли):</w:t>
       </w:r>
     </w:p>
     <w:p>
@@ -11264,23 +10641,7 @@
                 <w:rFonts w:ascii="Times New Roman" w:hAnsi="Times New Roman" w:cs="Times New Roman"/>
                 <w:sz w:val="24"/>
               </w:rPr>
-              <w:t>CSS-эффекты (</w:t>
-            </w:r>
-            <w:proofErr w:type="spellStart"/>
-            <w:r>
-              <w:rPr>
-                <w:rFonts w:ascii="Times New Roman" w:hAnsi="Times New Roman" w:cs="Times New Roman"/>
-                <w:sz w:val="24"/>
-              </w:rPr>
-              <w:t>hover</w:t>
-            </w:r>
-            <w:proofErr w:type="spellEnd"/>
-            <w:r>
-              <w:rPr>
-                <w:rFonts w:ascii="Times New Roman" w:hAnsi="Times New Roman" w:cs="Times New Roman"/>
-                <w:sz w:val="24"/>
-              </w:rPr>
-              <w:t>)</w:t>
+              <w:t>CSS-эффекты (hover)</w:t>
             </w:r>
           </w:p>
         </w:tc>
@@ -11537,39 +10898,7 @@
                 <w:rFonts w:ascii="Times New Roman" w:hAnsi="Times New Roman" w:cs="Times New Roman"/>
                 <w:sz w:val="24"/>
               </w:rPr>
-              <w:t>В системе «</w:t>
-            </w:r>
-            <w:proofErr w:type="spellStart"/>
-            <w:r>
-              <w:rPr>
-                <w:rFonts w:ascii="Times New Roman" w:hAnsi="Times New Roman" w:cs="Times New Roman"/>
-                <w:sz w:val="24"/>
-              </w:rPr>
-              <w:t>Wrong</w:t>
-            </w:r>
-            <w:proofErr w:type="spellEnd"/>
-            <w:r>
-              <w:rPr>
-                <w:rFonts w:ascii="Times New Roman" w:hAnsi="Times New Roman" w:cs="Times New Roman"/>
-                <w:sz w:val="24"/>
-              </w:rPr>
-              <w:t xml:space="preserve"> </w:t>
-            </w:r>
-            <w:proofErr w:type="spellStart"/>
-            <w:r>
-              <w:rPr>
-                <w:rFonts w:ascii="Times New Roman" w:hAnsi="Times New Roman" w:cs="Times New Roman"/>
-                <w:sz w:val="24"/>
-              </w:rPr>
-              <w:t>Turn</w:t>
-            </w:r>
-            <w:proofErr w:type="spellEnd"/>
-            <w:r>
-              <w:rPr>
-                <w:rFonts w:ascii="Times New Roman" w:hAnsi="Times New Roman" w:cs="Times New Roman"/>
-                <w:sz w:val="24"/>
-              </w:rPr>
-              <w:t>» финансовые данные не обрабатываются (отсутствуют платежи, подписки и т.п.). При их появлении — обязательное шифрование и запрет передачи третьим лицам.</w:t>
+              <w:t>В системе «Wrong Turn» финансовые данные не обрабатываются (отсутствуют платежи, подписки и т.п.). При их появлении — обязательное шифрование и запрет передачи третьим лицам.</w:t>
             </w:r>
           </w:p>
         </w:tc>
@@ -11717,67 +11046,7 @@
           <w:szCs w:val="28"/>
           <w:lang w:eastAsia="ru-RU"/>
         </w:rPr>
-        <w:t>Разработка и внедрение информационной системы «</w:t>
-      </w:r>
-      <w:proofErr w:type="spellStart"/>
-      <w:r>
-        <w:rPr>
-          <w:rFonts w:ascii="Times New Roman" w:eastAsia="Times New Roman" w:hAnsi="Times New Roman" w:cs="Times New Roman"/>
-          <w:sz w:val="28"/>
-          <w:szCs w:val="28"/>
-          <w:lang w:eastAsia="ru-RU"/>
-        </w:rPr>
-        <w:t>Wrong</w:t>
-      </w:r>
-      <w:proofErr w:type="spellEnd"/>
-      <w:r>
-        <w:rPr>
-          <w:rFonts w:ascii="Times New Roman" w:eastAsia="Times New Roman" w:hAnsi="Times New Roman" w:cs="Times New Roman"/>
-          <w:sz w:val="28"/>
-          <w:szCs w:val="28"/>
-          <w:lang w:eastAsia="ru-RU"/>
-        </w:rPr>
-        <w:t xml:space="preserve"> </w:t>
-      </w:r>
-      <w:proofErr w:type="spellStart"/>
-      <w:r>
-        <w:rPr>
-          <w:rFonts w:ascii="Times New Roman" w:eastAsia="Times New Roman" w:hAnsi="Times New Roman" w:cs="Times New Roman"/>
-          <w:sz w:val="28"/>
-          <w:szCs w:val="28"/>
-          <w:lang w:eastAsia="ru-RU"/>
-        </w:rPr>
-        <w:t>Turn</w:t>
-      </w:r>
-      <w:proofErr w:type="spellEnd"/>
-      <w:r>
-        <w:rPr>
-          <w:rFonts w:ascii="Times New Roman" w:eastAsia="Times New Roman" w:hAnsi="Times New Roman" w:cs="Times New Roman"/>
-          <w:sz w:val="28"/>
-          <w:szCs w:val="28"/>
-          <w:lang w:eastAsia="ru-RU"/>
-        </w:rPr>
-        <w:t xml:space="preserve">» осуществляется в соответствии с календарным планом работ. Сроки определены исходя из трудоемкости этапов, доступных ресурсов (1 разработчик-программист, 1 администратор, 1 </w:t>
-      </w:r>
-      <w:proofErr w:type="spellStart"/>
-      <w:r>
-        <w:rPr>
-          <w:rFonts w:ascii="Times New Roman" w:eastAsia="Times New Roman" w:hAnsi="Times New Roman" w:cs="Times New Roman"/>
-          <w:sz w:val="28"/>
-          <w:szCs w:val="28"/>
-          <w:lang w:eastAsia="ru-RU"/>
-        </w:rPr>
-        <w:t>тестировщик</w:t>
-      </w:r>
-      <w:proofErr w:type="spellEnd"/>
-      <w:r>
-        <w:rPr>
-          <w:rFonts w:ascii="Times New Roman" w:eastAsia="Times New Roman" w:hAnsi="Times New Roman" w:cs="Times New Roman"/>
-          <w:sz w:val="28"/>
-          <w:szCs w:val="28"/>
-          <w:lang w:eastAsia="ru-RU"/>
-        </w:rPr>
-        <w:t>).</w:t>
+        <w:t>Разработка и внедрение информационной системы «Wrong Turn» осуществляется в соответствии с календарным планом работ. Сроки определены исходя из трудоемкости этапов, доступных ресурсов (1 разработчик-программист, 1 администратор, 1 тестировщик).</w:t>
       </w:r>
     </w:p>
     <w:p>
@@ -12211,25 +11480,7 @@
                 <w:sz w:val="24"/>
                 <w:szCs w:val="24"/>
               </w:rPr>
-              <w:t>Разработка серверной части (</w:t>
-            </w:r>
-            <w:proofErr w:type="spellStart"/>
-            <w:r>
-              <w:rPr>
-                <w:rFonts w:ascii="Times New Roman" w:hAnsi="Times New Roman" w:cs="Times New Roman"/>
-                <w:sz w:val="24"/>
-                <w:szCs w:val="24"/>
-              </w:rPr>
-              <w:t>бэкенд</w:t>
-            </w:r>
-            <w:proofErr w:type="spellEnd"/>
-            <w:r>
-              <w:rPr>
-                <w:rFonts w:ascii="Times New Roman" w:hAnsi="Times New Roman" w:cs="Times New Roman"/>
-                <w:sz w:val="24"/>
-                <w:szCs w:val="24"/>
-              </w:rPr>
-              <w:t>)</w:t>
+              <w:t>Разработка серверной части (бэкенд)</w:t>
             </w:r>
           </w:p>
         </w:tc>
@@ -12378,25 +11629,7 @@
                 <w:sz w:val="24"/>
                 <w:szCs w:val="24"/>
               </w:rPr>
-              <w:t>Разработка клиентской части (</w:t>
-            </w:r>
-            <w:proofErr w:type="spellStart"/>
-            <w:r>
-              <w:rPr>
-                <w:rFonts w:ascii="Times New Roman" w:hAnsi="Times New Roman" w:cs="Times New Roman"/>
-                <w:sz w:val="24"/>
-                <w:szCs w:val="24"/>
-              </w:rPr>
-              <w:t>фронтенд</w:t>
-            </w:r>
-            <w:proofErr w:type="spellEnd"/>
-            <w:r>
-              <w:rPr>
-                <w:rFonts w:ascii="Times New Roman" w:hAnsi="Times New Roman" w:cs="Times New Roman"/>
-                <w:sz w:val="24"/>
-                <w:szCs w:val="24"/>
-              </w:rPr>
-              <w:t>)</w:t>
+              <w:t>Разработка клиентской части (фронтенд)</w:t>
             </w:r>
           </w:p>
         </w:tc>
@@ -12490,25 +11723,7 @@
                 <w:sz w:val="24"/>
                 <w:szCs w:val="24"/>
               </w:rPr>
-              <w:t xml:space="preserve">Веб-интерфейс (адаптивный), реализация таймера, счетчика ошибок, </w:t>
-            </w:r>
-            <w:proofErr w:type="spellStart"/>
-            <w:r>
-              <w:rPr>
-                <w:rFonts w:ascii="Times New Roman" w:hAnsi="Times New Roman" w:cs="Times New Roman"/>
-                <w:sz w:val="24"/>
-                <w:szCs w:val="24"/>
-              </w:rPr>
-              <w:t>оффлайн</w:t>
-            </w:r>
-            <w:proofErr w:type="spellEnd"/>
-            <w:r>
-              <w:rPr>
-                <w:rFonts w:ascii="Times New Roman" w:hAnsi="Times New Roman" w:cs="Times New Roman"/>
-                <w:sz w:val="24"/>
-                <w:szCs w:val="24"/>
-              </w:rPr>
-              <w:t>-режима</w:t>
+              <w:t>Веб-интерфейс (адаптивный), реализация таймера, счетчика ошибок, оффлайн-режима</w:t>
             </w:r>
           </w:p>
         </w:tc>
@@ -13110,47 +12325,7 @@
           <w:szCs w:val="28"/>
           <w:lang w:eastAsia="ru-RU"/>
         </w:rPr>
-        <w:t>Таблица 10 - Описание функций и задач для ИС «</w:t>
-      </w:r>
-      <w:proofErr w:type="spellStart"/>
-      <w:r>
-        <w:rPr>
-          <w:rFonts w:ascii="Times New Roman" w:eastAsia="Times New Roman" w:hAnsi="Times New Roman" w:cs="Times New Roman"/>
-          <w:sz w:val="28"/>
-          <w:szCs w:val="28"/>
-          <w:lang w:eastAsia="ru-RU"/>
-        </w:rPr>
-        <w:t>Wrong</w:t>
-      </w:r>
-      <w:proofErr w:type="spellEnd"/>
-      <w:r>
-        <w:rPr>
-          <w:rFonts w:ascii="Times New Roman" w:eastAsia="Times New Roman" w:hAnsi="Times New Roman" w:cs="Times New Roman"/>
-          <w:sz w:val="28"/>
-          <w:szCs w:val="28"/>
-          <w:lang w:eastAsia="ru-RU"/>
-        </w:rPr>
-        <w:t xml:space="preserve"> </w:t>
-      </w:r>
-      <w:proofErr w:type="spellStart"/>
-      <w:r>
-        <w:rPr>
-          <w:rFonts w:ascii="Times New Roman" w:eastAsia="Times New Roman" w:hAnsi="Times New Roman" w:cs="Times New Roman"/>
-          <w:sz w:val="28"/>
-          <w:szCs w:val="28"/>
-          <w:lang w:eastAsia="ru-RU"/>
-        </w:rPr>
-        <w:t>Turn</w:t>
-      </w:r>
-      <w:proofErr w:type="spellEnd"/>
-      <w:r>
-        <w:rPr>
-          <w:rFonts w:ascii="Times New Roman" w:eastAsia="Times New Roman" w:hAnsi="Times New Roman" w:cs="Times New Roman"/>
-          <w:sz w:val="28"/>
-          <w:szCs w:val="28"/>
-          <w:lang w:eastAsia="ru-RU"/>
-        </w:rPr>
-        <w:t>»</w:t>
+        <w:t>Таблица 10 - Описание функций и задач для ИС «Wrong Turn»</w:t>
       </w:r>
     </w:p>
     <w:tbl>
@@ -13540,21 +12715,12 @@
                 <w:sz w:val="24"/>
               </w:rPr>
             </w:pPr>
-            <w:proofErr w:type="spellStart"/>
-            <w:r>
-              <w:rPr>
-                <w:rFonts w:ascii="Times New Roman" w:hAnsi="Times New Roman" w:cs="Times New Roman"/>
-                <w:sz w:val="24"/>
-              </w:rPr>
-              <w:t>Дашборд</w:t>
-            </w:r>
-            <w:proofErr w:type="spellEnd"/>
-            <w:r>
-              <w:rPr>
-                <w:rFonts w:ascii="Times New Roman" w:hAnsi="Times New Roman" w:cs="Times New Roman"/>
-                <w:sz w:val="24"/>
-              </w:rPr>
-              <w:t xml:space="preserve"> (личный кабинет)</w:t>
+            <w:r>
+              <w:rPr>
+                <w:rFonts w:ascii="Times New Roman" w:hAnsi="Times New Roman" w:cs="Times New Roman"/>
+                <w:sz w:val="24"/>
+              </w:rPr>
+              <w:t>Дашборд (личный кабинет)</w:t>
             </w:r>
           </w:p>
         </w:tc>
@@ -14419,47 +13585,7 @@
           <w:szCs w:val="28"/>
           <w:lang w:eastAsia="ru-RU"/>
         </w:rPr>
-        <w:t>Создание информационной системы «</w:t>
-      </w:r>
-      <w:proofErr w:type="spellStart"/>
-      <w:r>
-        <w:rPr>
-          <w:rFonts w:ascii="Times New Roman" w:eastAsia="Times New Roman" w:hAnsi="Times New Roman" w:cs="Times New Roman"/>
-          <w:sz w:val="28"/>
-          <w:szCs w:val="28"/>
-          <w:lang w:eastAsia="ru-RU"/>
-        </w:rPr>
-        <w:t>Wrong</w:t>
-      </w:r>
-      <w:proofErr w:type="spellEnd"/>
-      <w:r>
-        <w:rPr>
-          <w:rFonts w:ascii="Times New Roman" w:eastAsia="Times New Roman" w:hAnsi="Times New Roman" w:cs="Times New Roman"/>
-          <w:sz w:val="28"/>
-          <w:szCs w:val="28"/>
-          <w:lang w:eastAsia="ru-RU"/>
-        </w:rPr>
-        <w:t xml:space="preserve"> </w:t>
-      </w:r>
-      <w:proofErr w:type="spellStart"/>
-      <w:r>
-        <w:rPr>
-          <w:rFonts w:ascii="Times New Roman" w:eastAsia="Times New Roman" w:hAnsi="Times New Roman" w:cs="Times New Roman"/>
-          <w:sz w:val="28"/>
-          <w:szCs w:val="28"/>
-          <w:lang w:eastAsia="ru-RU"/>
-        </w:rPr>
-        <w:t>Turn</w:t>
-      </w:r>
-      <w:proofErr w:type="spellEnd"/>
-      <w:r>
-        <w:rPr>
-          <w:rFonts w:ascii="Times New Roman" w:eastAsia="Times New Roman" w:hAnsi="Times New Roman" w:cs="Times New Roman"/>
-          <w:sz w:val="28"/>
-          <w:szCs w:val="28"/>
-          <w:lang w:eastAsia="ru-RU"/>
-        </w:rPr>
-        <w:t>» представляет собой комплекс взаимоувязанных организационных, технических и программных мероприятий, направленных на разработку, внедрение и ввод в эксплуатацию системы автоматизированного тестирования знаний ПДД.</w:t>
+        <w:t>Создание информационной системы «Wrong Turn» представляет собой комплекс взаимоувязанных организационных, технических и программных мероприятий, направленных на разработку, внедрение и ввод в эксплуатацию системы автоматизированного тестирования знаний ПДД.</w:t>
       </w:r>
     </w:p>
     <w:p>
@@ -14597,47 +13723,7 @@
           <w:szCs w:val="28"/>
           <w:lang w:eastAsia="ru-RU"/>
         </w:rPr>
-        <w:t>Общий процесс создания ИС «</w:t>
-      </w:r>
-      <w:proofErr w:type="spellStart"/>
-      <w:r>
-        <w:rPr>
-          <w:rFonts w:ascii="Times New Roman" w:eastAsia="Times New Roman" w:hAnsi="Times New Roman" w:cs="Times New Roman"/>
-          <w:sz w:val="28"/>
-          <w:szCs w:val="28"/>
-          <w:lang w:eastAsia="ru-RU"/>
-        </w:rPr>
-        <w:t>Wrong</w:t>
-      </w:r>
-      <w:proofErr w:type="spellEnd"/>
-      <w:r>
-        <w:rPr>
-          <w:rFonts w:ascii="Times New Roman" w:eastAsia="Times New Roman" w:hAnsi="Times New Roman" w:cs="Times New Roman"/>
-          <w:sz w:val="28"/>
-          <w:szCs w:val="28"/>
-          <w:lang w:eastAsia="ru-RU"/>
-        </w:rPr>
-        <w:t xml:space="preserve"> </w:t>
-      </w:r>
-      <w:proofErr w:type="spellStart"/>
-      <w:r>
-        <w:rPr>
-          <w:rFonts w:ascii="Times New Roman" w:eastAsia="Times New Roman" w:hAnsi="Times New Roman" w:cs="Times New Roman"/>
-          <w:sz w:val="28"/>
-          <w:szCs w:val="28"/>
-          <w:lang w:eastAsia="ru-RU"/>
-        </w:rPr>
-        <w:t>Turn</w:t>
-      </w:r>
-      <w:proofErr w:type="spellEnd"/>
-      <w:r>
-        <w:rPr>
-          <w:rFonts w:ascii="Times New Roman" w:eastAsia="Times New Roman" w:hAnsi="Times New Roman" w:cs="Times New Roman"/>
-          <w:sz w:val="28"/>
-          <w:szCs w:val="28"/>
-          <w:lang w:eastAsia="ru-RU"/>
-        </w:rPr>
-        <w:t>» разделен на 7 основных этапов. Для каждого этапа определены: состав работ, ожидаемые результаты, документация и трудоемкость.</w:t>
+        <w:t>Общий процесс создания ИС «Wrong Turn» разделен на 7 основных этапов. Для каждого этапа определены: состав работ, ожидаемые результаты, документация и трудоемкость.</w:t>
       </w:r>
     </w:p>
     <w:p>
@@ -15322,61 +14408,7 @@
                 <w:sz w:val="24"/>
                 <w:szCs w:val="24"/>
               </w:rPr>
-              <w:t>Выбор клиент-серверной архитектуры, определение компонентов (</w:t>
-            </w:r>
-            <w:proofErr w:type="spellStart"/>
-            <w:r>
-              <w:rPr>
-                <w:rFonts w:ascii="Times New Roman" w:hAnsi="Times New Roman" w:cs="Times New Roman"/>
-                <w:sz w:val="24"/>
-                <w:szCs w:val="24"/>
-              </w:rPr>
-              <w:t>фронтенд</w:t>
-            </w:r>
-            <w:proofErr w:type="spellEnd"/>
-            <w:r>
-              <w:rPr>
-                <w:rFonts w:ascii="Times New Roman" w:hAnsi="Times New Roman" w:cs="Times New Roman"/>
-                <w:sz w:val="24"/>
-                <w:szCs w:val="24"/>
-              </w:rPr>
-              <w:t xml:space="preserve">, </w:t>
-            </w:r>
-            <w:proofErr w:type="spellStart"/>
-            <w:r>
-              <w:rPr>
-                <w:rFonts w:ascii="Times New Roman" w:hAnsi="Times New Roman" w:cs="Times New Roman"/>
-                <w:sz w:val="24"/>
-                <w:szCs w:val="24"/>
-              </w:rPr>
-              <w:t>бэкенд</w:t>
-            </w:r>
-            <w:proofErr w:type="spellEnd"/>
-            <w:r>
-              <w:rPr>
-                <w:rFonts w:ascii="Times New Roman" w:hAnsi="Times New Roman" w:cs="Times New Roman"/>
-                <w:sz w:val="24"/>
-                <w:szCs w:val="24"/>
-              </w:rPr>
-              <w:t xml:space="preserve">, БД, </w:t>
-            </w:r>
-            <w:proofErr w:type="spellStart"/>
-            <w:r>
-              <w:rPr>
-                <w:rFonts w:ascii="Times New Roman" w:hAnsi="Times New Roman" w:cs="Times New Roman"/>
-                <w:sz w:val="24"/>
-                <w:szCs w:val="24"/>
-              </w:rPr>
-              <w:t>оффлайн</w:t>
-            </w:r>
-            <w:proofErr w:type="spellEnd"/>
-            <w:r>
-              <w:rPr>
-                <w:rFonts w:ascii="Times New Roman" w:hAnsi="Times New Roman" w:cs="Times New Roman"/>
-                <w:sz w:val="24"/>
-                <w:szCs w:val="24"/>
-              </w:rPr>
-              <w:t>-хранилище)</w:t>
+              <w:t>Выбор клиент-серверной архитектуры, определение компонентов (фронтенд, бэкенд, БД, оффлайн-хранилище)</w:t>
             </w:r>
           </w:p>
         </w:tc>
@@ -15736,27 +14768,7 @@
           <w:szCs w:val="28"/>
           <w:lang w:eastAsia="ru-RU"/>
         </w:rPr>
-        <w:t>Таблица 15 – Состав работ (</w:t>
-      </w:r>
-      <w:proofErr w:type="spellStart"/>
-      <w:r>
-        <w:rPr>
-          <w:rFonts w:ascii="Times New Roman" w:eastAsia="Times New Roman" w:hAnsi="Times New Roman" w:cs="Times New Roman"/>
-          <w:sz w:val="28"/>
-          <w:szCs w:val="28"/>
-          <w:lang w:eastAsia="ru-RU"/>
-        </w:rPr>
-        <w:t>бэкенд</w:t>
-      </w:r>
-      <w:proofErr w:type="spellEnd"/>
-      <w:r>
-        <w:rPr>
-          <w:rFonts w:ascii="Times New Roman" w:eastAsia="Times New Roman" w:hAnsi="Times New Roman" w:cs="Times New Roman"/>
-          <w:sz w:val="28"/>
-          <w:szCs w:val="28"/>
-          <w:lang w:eastAsia="ru-RU"/>
-        </w:rPr>
-        <w:t>)</w:t>
+        <w:t>Таблица 15 – Состав работ (бэкенд)</w:t>
       </w:r>
     </w:p>
     <w:tbl>
@@ -15994,47 +15006,7 @@
                 <w:szCs w:val="24"/>
                 <w:highlight w:val="red"/>
               </w:rPr>
-              <w:t>Создание таблиц БД через ORM (</w:t>
-            </w:r>
-            <w:proofErr w:type="spellStart"/>
-            <w:r>
-              <w:rPr>
-                <w:rFonts w:ascii="Times New Roman" w:hAnsi="Times New Roman" w:cs="Times New Roman"/>
-                <w:sz w:val="24"/>
-                <w:szCs w:val="24"/>
-                <w:highlight w:val="red"/>
-              </w:rPr>
-              <w:t>Django</w:t>
-            </w:r>
-            <w:proofErr w:type="spellEnd"/>
-            <w:r>
-              <w:rPr>
-                <w:rFonts w:ascii="Times New Roman" w:hAnsi="Times New Roman" w:cs="Times New Roman"/>
-                <w:sz w:val="24"/>
-                <w:szCs w:val="24"/>
-                <w:highlight w:val="red"/>
-              </w:rPr>
-              <w:t xml:space="preserve"> </w:t>
-            </w:r>
-            <w:proofErr w:type="spellStart"/>
-            <w:r>
-              <w:rPr>
-                <w:rFonts w:ascii="Times New Roman" w:hAnsi="Times New Roman" w:cs="Times New Roman"/>
-                <w:sz w:val="24"/>
-                <w:szCs w:val="24"/>
-                <w:highlight w:val="red"/>
-              </w:rPr>
-              <w:t>Models</w:t>
-            </w:r>
-            <w:proofErr w:type="spellEnd"/>
-            <w:r>
-              <w:rPr>
-                <w:rFonts w:ascii="Times New Roman" w:hAnsi="Times New Roman" w:cs="Times New Roman"/>
-                <w:sz w:val="24"/>
-                <w:szCs w:val="24"/>
-                <w:highlight w:val="red"/>
-              </w:rPr>
-              <w:t>), миграции</w:t>
+              <w:t>Создание таблиц БД через ORM (Django Models), миграции</w:t>
             </w:r>
           </w:p>
         </w:tc>
@@ -16445,27 +15417,7 @@
           <w:szCs w:val="28"/>
           <w:lang w:eastAsia="ru-RU"/>
         </w:rPr>
-        <w:t>Таблица 16 – Состав работ(</w:t>
-      </w:r>
-      <w:proofErr w:type="spellStart"/>
-      <w:r>
-        <w:rPr>
-          <w:rFonts w:ascii="Times New Roman" w:eastAsia="Times New Roman" w:hAnsi="Times New Roman" w:cs="Times New Roman"/>
-          <w:sz w:val="28"/>
-          <w:szCs w:val="28"/>
-          <w:lang w:eastAsia="ru-RU"/>
-        </w:rPr>
-        <w:t>фронтед</w:t>
-      </w:r>
-      <w:proofErr w:type="spellEnd"/>
-      <w:r>
-        <w:rPr>
-          <w:rFonts w:ascii="Times New Roman" w:eastAsia="Times New Roman" w:hAnsi="Times New Roman" w:cs="Times New Roman"/>
-          <w:sz w:val="28"/>
-          <w:szCs w:val="28"/>
-          <w:lang w:eastAsia="ru-RU"/>
-        </w:rPr>
-        <w:t>)</w:t>
+        <w:t>Таблица 16 – Состав работ(фронтед)</w:t>
       </w:r>
     </w:p>
     <w:tbl>
@@ -16610,25 +15562,7 @@
                 <w:sz w:val="24"/>
                 <w:szCs w:val="24"/>
               </w:rPr>
-              <w:t xml:space="preserve">HTML/CSS, </w:t>
-            </w:r>
-            <w:proofErr w:type="spellStart"/>
-            <w:r>
-              <w:rPr>
-                <w:rFonts w:ascii="Times New Roman" w:hAnsi="Times New Roman" w:cs="Times New Roman"/>
-                <w:sz w:val="24"/>
-                <w:szCs w:val="24"/>
-              </w:rPr>
-              <w:t>адаптив</w:t>
-            </w:r>
-            <w:proofErr w:type="spellEnd"/>
-            <w:r>
-              <w:rPr>
-                <w:rFonts w:ascii="Times New Roman" w:hAnsi="Times New Roman" w:cs="Times New Roman"/>
-                <w:sz w:val="24"/>
-                <w:szCs w:val="24"/>
-              </w:rPr>
-              <w:t>, темная/светлая тема</w:t>
+              <w:t>HTML/CSS, адаптив, темная/светлая тема</w:t>
             </w:r>
           </w:p>
         </w:tc>
@@ -16696,18 +15630,8 @@
                 <w:sz w:val="24"/>
                 <w:szCs w:val="24"/>
               </w:rPr>
-              <w:t xml:space="preserve">Формы, </w:t>
-            </w:r>
-            <w:proofErr w:type="spellStart"/>
-            <w:r>
-              <w:rPr>
-                <w:rFonts w:ascii="Times New Roman" w:hAnsi="Times New Roman" w:cs="Times New Roman"/>
-                <w:sz w:val="24"/>
-                <w:szCs w:val="24"/>
-              </w:rPr>
-              <w:t>валидация</w:t>
-            </w:r>
-            <w:proofErr w:type="spellEnd"/>
+              <w:t>Формы, валидация</w:t>
+            </w:r>
           </w:p>
         </w:tc>
       </w:tr>
@@ -17109,27 +16033,7 @@
           <w:szCs w:val="28"/>
           <w:lang w:eastAsia="ru-RU"/>
         </w:rPr>
-        <w:t>Таблица 17 – Состав работ(</w:t>
-      </w:r>
-      <w:proofErr w:type="spellStart"/>
-      <w:r>
-        <w:rPr>
-          <w:rFonts w:ascii="Times New Roman" w:eastAsia="Times New Roman" w:hAnsi="Times New Roman" w:cs="Times New Roman"/>
-          <w:sz w:val="28"/>
-          <w:szCs w:val="28"/>
-          <w:lang w:eastAsia="ru-RU"/>
-        </w:rPr>
-        <w:t>фронтед</w:t>
-      </w:r>
-      <w:proofErr w:type="spellEnd"/>
-      <w:r>
-        <w:rPr>
-          <w:rFonts w:ascii="Times New Roman" w:eastAsia="Times New Roman" w:hAnsi="Times New Roman" w:cs="Times New Roman"/>
-          <w:sz w:val="28"/>
-          <w:szCs w:val="28"/>
-          <w:lang w:eastAsia="ru-RU"/>
-        </w:rPr>
-        <w:t>)</w:t>
+        <w:t>Таблица 17 – Состав работ(фронтед)</w:t>
       </w:r>
     </w:p>
     <w:tbl>
@@ -17611,49 +16515,7 @@
               <w:rPr>
                 <w:rFonts w:ascii="Times New Roman" w:hAnsi="Times New Roman" w:cs="Times New Roman"/>
               </w:rPr>
-              <w:t>х (</w:t>
-            </w:r>
-            <w:proofErr w:type="spellStart"/>
-            <w:r>
-              <w:rPr>
-                <w:rFonts w:ascii="Times New Roman" w:hAnsi="Times New Roman" w:cs="Times New Roman"/>
-              </w:rPr>
-              <w:t>Chrome</w:t>
-            </w:r>
-            <w:proofErr w:type="spellEnd"/>
-            <w:r>
-              <w:rPr>
-                <w:rFonts w:ascii="Times New Roman" w:hAnsi="Times New Roman" w:cs="Times New Roman"/>
-              </w:rPr>
-              <w:t xml:space="preserve">, </w:t>
-            </w:r>
-            <w:proofErr w:type="spellStart"/>
-            <w:r>
-              <w:rPr>
-                <w:rFonts w:ascii="Times New Roman" w:hAnsi="Times New Roman" w:cs="Times New Roman"/>
-              </w:rPr>
-              <w:t>Firefox</w:t>
-            </w:r>
-            <w:proofErr w:type="spellEnd"/>
-            <w:r>
-              <w:rPr>
-                <w:rFonts w:ascii="Times New Roman" w:hAnsi="Times New Roman" w:cs="Times New Roman"/>
-              </w:rPr>
-              <w:t xml:space="preserve">, </w:t>
-            </w:r>
-            <w:proofErr w:type="spellStart"/>
-            <w:r>
-              <w:rPr>
-                <w:rFonts w:ascii="Times New Roman" w:hAnsi="Times New Roman" w:cs="Times New Roman"/>
-              </w:rPr>
-              <w:t>Yandex</w:t>
-            </w:r>
-            <w:proofErr w:type="spellEnd"/>
-            <w:r>
-              <w:rPr>
-                <w:rFonts w:ascii="Times New Roman" w:hAnsi="Times New Roman" w:cs="Times New Roman"/>
-              </w:rPr>
-              <w:t xml:space="preserve">) и 3 </w:t>
+              <w:t xml:space="preserve">х (Chrome, Firefox, Yandex) и 3 </w:t>
             </w:r>
             <w:r>
               <w:rPr>
@@ -17734,21 +16596,7 @@
               <w:rPr>
                 <w:rFonts w:ascii="Times New Roman" w:hAnsi="Times New Roman" w:cs="Times New Roman"/>
               </w:rPr>
-              <w:t>Заведение баг-репортов, классификация по критичности (</w:t>
-            </w:r>
-            <w:proofErr w:type="spellStart"/>
-            <w:r>
-              <w:rPr>
-                <w:rFonts w:ascii="Times New Roman" w:hAnsi="Times New Roman" w:cs="Times New Roman"/>
-              </w:rPr>
-              <w:t>Severity</w:t>
-            </w:r>
-            <w:proofErr w:type="spellEnd"/>
-            <w:r>
-              <w:rPr>
-                <w:rFonts w:ascii="Times New Roman" w:hAnsi="Times New Roman" w:cs="Times New Roman"/>
-              </w:rPr>
-              <w:t xml:space="preserve"> 1–4), исправление критических ошибок</w:t>
+              <w:t>Заведение баг-репортов, классификация по критичности (Severity 1–4), исправление критических ошибок</w:t>
             </w:r>
           </w:p>
         </w:tc>
@@ -19930,8 +18778,8 @@
           <w:lang w:eastAsia="ru-RU"/>
         </w:rPr>
       </w:pPr>
-      <w:bookmarkStart w:id="11" w:name="_Toc229829443"/>
-      <w:bookmarkStart w:id="12" w:name="_Toc229829729"/>
+      <w:bookmarkStart w:id="10" w:name="_Toc229829443"/>
+      <w:bookmarkStart w:id="11" w:name="_Toc229829729"/>
       <w:r>
         <w:rPr>
           <w:rFonts w:eastAsia="Times New Roman"/>
@@ -19941,8 +18789,8 @@
         <w:lastRenderedPageBreak/>
         <w:t>Описание основных модулей и распределение ролей</w:t>
       </w:r>
+      <w:bookmarkEnd w:id="10"/>
       <w:bookmarkEnd w:id="11"/>
-      <w:bookmarkEnd w:id="12"/>
     </w:p>
     <w:p>
       <w:pPr>
@@ -19979,8 +18827,8 @@
           <w:lang w:eastAsia="ru-RU"/>
         </w:rPr>
       </w:pPr>
-      <w:bookmarkStart w:id="13" w:name="_Toc229829444"/>
-      <w:bookmarkStart w:id="14" w:name="_Toc229829730"/>
+      <w:bookmarkStart w:id="12" w:name="_Toc229829444"/>
+      <w:bookmarkStart w:id="13" w:name="_Toc229829730"/>
       <w:r>
         <w:rPr>
           <w:rFonts w:eastAsia="Times New Roman"/>
@@ -19988,8 +18836,8 @@
         </w:rPr>
         <w:t>Модуль «Авторизация и регистрация»</w:t>
       </w:r>
+      <w:bookmarkEnd w:id="12"/>
       <w:bookmarkEnd w:id="13"/>
-      <w:bookmarkEnd w:id="14"/>
     </w:p>
     <w:p>
       <w:pPr>
@@ -20003,8 +18851,8 @@
           <w:lang w:eastAsia="ru-RU"/>
         </w:rPr>
       </w:pPr>
-      <w:bookmarkStart w:id="15" w:name="_Toc229829445"/>
-      <w:bookmarkStart w:id="16" w:name="_Toc229829731"/>
+      <w:bookmarkStart w:id="14" w:name="_Toc229829445"/>
+      <w:bookmarkStart w:id="15" w:name="_Toc229829731"/>
       <w:r>
         <w:rPr>
           <w:rFonts w:eastAsia="Times New Roman"/>
@@ -20012,8 +18860,8 @@
         </w:rPr>
         <w:t>Основное описание модуля</w:t>
       </w:r>
+      <w:bookmarkEnd w:id="14"/>
       <w:bookmarkEnd w:id="15"/>
-      <w:bookmarkEnd w:id="16"/>
     </w:p>
     <w:p>
       <w:pPr>
@@ -20162,27 +19010,7 @@
           <w:szCs w:val="28"/>
           <w:lang w:eastAsia="ru-RU"/>
         </w:rPr>
-        <w:t>Выход из системы (</w:t>
-      </w:r>
-      <w:proofErr w:type="spellStart"/>
-      <w:r>
-        <w:rPr>
-          <w:rFonts w:ascii="Times New Roman" w:eastAsia="Times New Roman" w:hAnsi="Times New Roman" w:cs="Times New Roman"/>
-          <w:sz w:val="28"/>
-          <w:szCs w:val="28"/>
-          <w:lang w:eastAsia="ru-RU"/>
-        </w:rPr>
-        <w:t>logout</w:t>
-      </w:r>
-      <w:proofErr w:type="spellEnd"/>
-      <w:r>
-        <w:rPr>
-          <w:rFonts w:ascii="Times New Roman" w:eastAsia="Times New Roman" w:hAnsi="Times New Roman" w:cs="Times New Roman"/>
-          <w:sz w:val="28"/>
-          <w:szCs w:val="28"/>
-          <w:lang w:eastAsia="ru-RU"/>
-        </w:rPr>
-        <w:t>)</w:t>
+        <w:t>Выход из системы (logout)</w:t>
       </w:r>
     </w:p>
     <w:p>
@@ -20209,47 +19037,7 @@
           <w:szCs w:val="28"/>
           <w:lang w:eastAsia="ru-RU"/>
         </w:rPr>
-        <w:t>Проверка роли пользователя (</w:t>
-      </w:r>
-      <w:proofErr w:type="spellStart"/>
-      <w:r>
-        <w:rPr>
-          <w:rFonts w:ascii="Times New Roman" w:eastAsia="Times New Roman" w:hAnsi="Times New Roman" w:cs="Times New Roman"/>
-          <w:sz w:val="28"/>
-          <w:szCs w:val="28"/>
-          <w:lang w:eastAsia="ru-RU"/>
-        </w:rPr>
-        <w:t>user</w:t>
-      </w:r>
-      <w:proofErr w:type="spellEnd"/>
-      <w:r>
-        <w:rPr>
-          <w:rFonts w:ascii="Times New Roman" w:eastAsia="Times New Roman" w:hAnsi="Times New Roman" w:cs="Times New Roman"/>
-          <w:sz w:val="28"/>
-          <w:szCs w:val="28"/>
-          <w:lang w:eastAsia="ru-RU"/>
-        </w:rPr>
-        <w:t xml:space="preserve"> / </w:t>
-      </w:r>
-      <w:proofErr w:type="spellStart"/>
-      <w:r>
-        <w:rPr>
-          <w:rFonts w:ascii="Times New Roman" w:eastAsia="Times New Roman" w:hAnsi="Times New Roman" w:cs="Times New Roman"/>
-          <w:sz w:val="28"/>
-          <w:szCs w:val="28"/>
-          <w:lang w:eastAsia="ru-RU"/>
-        </w:rPr>
-        <w:t>admin</w:t>
-      </w:r>
-      <w:proofErr w:type="spellEnd"/>
-      <w:r>
-        <w:rPr>
-          <w:rFonts w:ascii="Times New Roman" w:eastAsia="Times New Roman" w:hAnsi="Times New Roman" w:cs="Times New Roman"/>
-          <w:sz w:val="28"/>
-          <w:szCs w:val="28"/>
-          <w:lang w:eastAsia="ru-RU"/>
-        </w:rPr>
-        <w:t>) после входа</w:t>
+        <w:t>Проверка роли пользователя (user / admin) после входа</w:t>
       </w:r>
     </w:p>
     <w:p>
@@ -20324,67 +19112,7 @@
           <w:szCs w:val="28"/>
           <w:lang w:eastAsia="ru-RU"/>
         </w:rPr>
-        <w:t>Запрашивает / сохраняет данные в Базу данных (таблицы `</w:t>
-      </w:r>
-      <w:proofErr w:type="spellStart"/>
-      <w:r>
-        <w:rPr>
-          <w:rFonts w:ascii="Times New Roman" w:eastAsia="Times New Roman" w:hAnsi="Times New Roman" w:cs="Times New Roman"/>
-          <w:sz w:val="28"/>
-          <w:szCs w:val="28"/>
-          <w:lang w:eastAsia="ru-RU"/>
-        </w:rPr>
-        <w:t>users</w:t>
-      </w:r>
-      <w:proofErr w:type="spellEnd"/>
-      <w:r>
-        <w:rPr>
-          <w:rFonts w:ascii="Times New Roman" w:eastAsia="Times New Roman" w:hAnsi="Times New Roman" w:cs="Times New Roman"/>
-          <w:sz w:val="28"/>
-          <w:szCs w:val="28"/>
-          <w:lang w:eastAsia="ru-RU"/>
-        </w:rPr>
-        <w:t>`, `</w:t>
-      </w:r>
-      <w:proofErr w:type="spellStart"/>
-      <w:r>
-        <w:rPr>
-          <w:rFonts w:ascii="Times New Roman" w:eastAsia="Times New Roman" w:hAnsi="Times New Roman" w:cs="Times New Roman"/>
-          <w:sz w:val="28"/>
-          <w:szCs w:val="28"/>
-          <w:lang w:eastAsia="ru-RU"/>
-        </w:rPr>
-        <w:t>roles</w:t>
-      </w:r>
-      <w:proofErr w:type="spellEnd"/>
-      <w:r>
-        <w:rPr>
-          <w:rFonts w:ascii="Times New Roman" w:eastAsia="Times New Roman" w:hAnsi="Times New Roman" w:cs="Times New Roman"/>
-          <w:sz w:val="28"/>
-          <w:szCs w:val="28"/>
-          <w:lang w:eastAsia="ru-RU"/>
-        </w:rPr>
-        <w:t>`, `</w:t>
-      </w:r>
-      <w:proofErr w:type="spellStart"/>
-      <w:r>
-        <w:rPr>
-          <w:rFonts w:ascii="Times New Roman" w:eastAsia="Times New Roman" w:hAnsi="Times New Roman" w:cs="Times New Roman"/>
-          <w:sz w:val="28"/>
-          <w:szCs w:val="28"/>
-          <w:lang w:eastAsia="ru-RU"/>
-        </w:rPr>
-        <w:t>sessions</w:t>
-      </w:r>
-      <w:proofErr w:type="spellEnd"/>
-      <w:r>
-        <w:rPr>
-          <w:rFonts w:ascii="Times New Roman" w:eastAsia="Times New Roman" w:hAnsi="Times New Roman" w:cs="Times New Roman"/>
-          <w:sz w:val="28"/>
-          <w:szCs w:val="28"/>
-          <w:lang w:eastAsia="ru-RU"/>
-        </w:rPr>
-        <w:t>`)</w:t>
+        <w:t>Запрашивает / сохраняет данные в Базу данных (таблицы `users`, `roles`, `sessions`)</w:t>
       </w:r>
     </w:p>
     <w:p>
@@ -20399,8 +19127,8 @@
           <w:lang w:eastAsia="ru-RU"/>
         </w:rPr>
       </w:pPr>
-      <w:bookmarkStart w:id="17" w:name="_Toc229829446"/>
-      <w:bookmarkStart w:id="18" w:name="_Toc229829732"/>
+      <w:bookmarkStart w:id="16" w:name="_Toc229829446"/>
+      <w:bookmarkStart w:id="17" w:name="_Toc229829732"/>
       <w:r>
         <w:rPr>
           <w:rFonts w:eastAsia="Times New Roman"/>
@@ -20408,8 +19136,8 @@
         </w:rPr>
         <w:t>Распределение ролей членов команды</w:t>
       </w:r>
+      <w:bookmarkEnd w:id="16"/>
       <w:bookmarkEnd w:id="17"/>
-      <w:bookmarkEnd w:id="18"/>
     </w:p>
     <w:p>
       <w:pPr>
@@ -20451,8 +19179,8 @@
           <w:lang w:eastAsia="ru-RU"/>
         </w:rPr>
       </w:pPr>
-      <w:bookmarkStart w:id="19" w:name="_Toc229829447"/>
-      <w:bookmarkStart w:id="20" w:name="_Toc229829733"/>
+      <w:bookmarkStart w:id="18" w:name="_Toc229829447"/>
+      <w:bookmarkStart w:id="19" w:name="_Toc229829733"/>
       <w:r>
         <w:rPr>
           <w:rFonts w:eastAsia="Times New Roman"/>
@@ -20461,8 +19189,8 @@
         <w:lastRenderedPageBreak/>
         <w:t>Модуль «Интерфейс пользователя»</w:t>
       </w:r>
+      <w:bookmarkEnd w:id="18"/>
       <w:bookmarkEnd w:id="19"/>
-      <w:bookmarkEnd w:id="20"/>
     </w:p>
     <w:p>
       <w:pPr>
@@ -20476,8 +19204,8 @@
           <w:lang w:eastAsia="ru-RU"/>
         </w:rPr>
       </w:pPr>
-      <w:bookmarkStart w:id="21" w:name="_Toc229829448"/>
-      <w:bookmarkStart w:id="22" w:name="_Toc229829734"/>
+      <w:bookmarkStart w:id="20" w:name="_Toc229829448"/>
+      <w:bookmarkStart w:id="21" w:name="_Toc229829734"/>
       <w:r>
         <w:rPr>
           <w:rFonts w:eastAsia="Times New Roman"/>
@@ -20485,8 +19213,8 @@
         </w:rPr>
         <w:t>Основное описание модуля</w:t>
       </w:r>
+      <w:bookmarkEnd w:id="20"/>
       <w:bookmarkEnd w:id="21"/>
-      <w:bookmarkEnd w:id="22"/>
     </w:p>
     <w:p>
       <w:pPr>
@@ -20878,8 +19606,8 @@
           <w:lang w:eastAsia="ru-RU"/>
         </w:rPr>
       </w:pPr>
-      <w:bookmarkStart w:id="23" w:name="_Toc229829449"/>
-      <w:bookmarkStart w:id="24" w:name="_Toc229829735"/>
+      <w:bookmarkStart w:id="22" w:name="_Toc229829449"/>
+      <w:bookmarkStart w:id="23" w:name="_Toc229829735"/>
       <w:r>
         <w:rPr>
           <w:rFonts w:eastAsia="Times New Roman"/>
@@ -20887,8 +19615,8 @@
         </w:rPr>
         <w:t>Распределение ролей членов команды</w:t>
       </w:r>
+      <w:bookmarkEnd w:id="22"/>
       <w:bookmarkEnd w:id="23"/>
-      <w:bookmarkEnd w:id="24"/>
     </w:p>
     <w:p>
       <w:pPr>
@@ -20916,8 +19644,8 @@
           <w:lang w:eastAsia="ru-RU"/>
         </w:rPr>
       </w:pPr>
-      <w:bookmarkStart w:id="25" w:name="_Toc229829450"/>
-      <w:bookmarkStart w:id="26" w:name="_Toc229829736"/>
+      <w:bookmarkStart w:id="24" w:name="_Toc229829450"/>
+      <w:bookmarkStart w:id="25" w:name="_Toc229829736"/>
       <w:r>
         <w:rPr>
           <w:rFonts w:eastAsia="Times New Roman"/>
@@ -20925,8 +19653,8 @@
         </w:rPr>
         <w:t>Модуль «Интерфейс администратора»</w:t>
       </w:r>
+      <w:bookmarkEnd w:id="24"/>
       <w:bookmarkEnd w:id="25"/>
-      <w:bookmarkEnd w:id="26"/>
     </w:p>
     <w:p>
       <w:pPr>
@@ -20940,8 +19668,8 @@
           <w:lang w:eastAsia="ru-RU"/>
         </w:rPr>
       </w:pPr>
-      <w:bookmarkStart w:id="27" w:name="_Toc229829451"/>
-      <w:bookmarkStart w:id="28" w:name="_Toc229829737"/>
+      <w:bookmarkStart w:id="26" w:name="_Toc229829451"/>
+      <w:bookmarkStart w:id="27" w:name="_Toc229829737"/>
       <w:r>
         <w:rPr>
           <w:rFonts w:eastAsia="Times New Roman"/>
@@ -20949,8 +19677,8 @@
         </w:rPr>
         <w:t>Основное описание модуля</w:t>
       </w:r>
+      <w:bookmarkEnd w:id="26"/>
       <w:bookmarkEnd w:id="27"/>
-      <w:bookmarkEnd w:id="28"/>
     </w:p>
     <w:p>
       <w:pPr>
@@ -21057,7 +19785,7 @@
           <w:lang w:eastAsia="ru-RU"/>
         </w:rPr>
       </w:pPr>
-      <w:bookmarkStart w:id="29" w:name="_Toc229829738"/>
+      <w:bookmarkStart w:id="28" w:name="_Toc229829738"/>
       <w:r>
         <w:rPr>
           <w:rFonts w:eastAsia="Times New Roman"/>
@@ -21065,7 +19793,7 @@
         </w:rPr>
         <w:t>Управление билетами и вопросами</w:t>
       </w:r>
-      <w:bookmarkEnd w:id="29"/>
+      <w:bookmarkEnd w:id="28"/>
     </w:p>
     <w:p>
       <w:pPr>
@@ -21157,7 +19885,7 @@
           <w:lang w:eastAsia="ru-RU"/>
         </w:rPr>
       </w:pPr>
-      <w:bookmarkStart w:id="30" w:name="_Toc229829739"/>
+      <w:bookmarkStart w:id="29" w:name="_Toc229829739"/>
       <w:r>
         <w:rPr>
           <w:rFonts w:eastAsia="Times New Roman"/>
@@ -21165,7 +19893,7 @@
         </w:rPr>
         <w:t>Импорт из CSV</w:t>
       </w:r>
-      <w:bookmarkEnd w:id="30"/>
+      <w:bookmarkEnd w:id="29"/>
     </w:p>
     <w:p>
       <w:pPr>
@@ -21206,145 +19934,14 @@
           <w:lang w:eastAsia="ru-RU"/>
         </w:rPr>
       </w:pPr>
-      <w:proofErr w:type="spellStart"/>
-      <w:r>
-        <w:rPr>
-          <w:rFonts w:ascii="Times New Roman" w:eastAsia="Times New Roman" w:hAnsi="Times New Roman" w:cs="Times New Roman"/>
-          <w:sz w:val="28"/>
-          <w:szCs w:val="28"/>
-          <w:lang w:eastAsia="ru-RU"/>
-        </w:rPr>
-        <w:t>Парсинг</w:t>
-      </w:r>
-      <w:proofErr w:type="spellEnd"/>
-      <w:r>
-        <w:rPr>
-          <w:rFonts w:ascii="Times New Roman" w:eastAsia="Times New Roman" w:hAnsi="Times New Roman" w:cs="Times New Roman"/>
-          <w:sz w:val="28"/>
-          <w:szCs w:val="28"/>
-          <w:lang w:eastAsia="ru-RU"/>
-        </w:rPr>
-        <w:t xml:space="preserve"> CSV (столбцы, </w:t>
-      </w:r>
-      <w:proofErr w:type="gramStart"/>
-      <w:r>
-        <w:rPr>
-          <w:rFonts w:ascii="Times New Roman" w:eastAsia="Times New Roman" w:hAnsi="Times New Roman" w:cs="Times New Roman"/>
-          <w:sz w:val="28"/>
-          <w:szCs w:val="28"/>
-          <w:lang w:eastAsia="ru-RU"/>
-        </w:rPr>
-        <w:t>например</w:t>
-      </w:r>
-      <w:proofErr w:type="gramEnd"/>
-      <w:r>
-        <w:rPr>
-          <w:rFonts w:ascii="Times New Roman" w:eastAsia="Times New Roman" w:hAnsi="Times New Roman" w:cs="Times New Roman"/>
-          <w:sz w:val="28"/>
-          <w:szCs w:val="28"/>
-          <w:lang w:eastAsia="ru-RU"/>
-        </w:rPr>
-        <w:t>: `</w:t>
-      </w:r>
-      <w:proofErr w:type="spellStart"/>
-      <w:r>
-        <w:rPr>
-          <w:rFonts w:ascii="Times New Roman" w:eastAsia="Times New Roman" w:hAnsi="Times New Roman" w:cs="Times New Roman"/>
-          <w:sz w:val="28"/>
-          <w:szCs w:val="28"/>
-          <w:lang w:eastAsia="ru-RU"/>
-        </w:rPr>
-        <w:t>номер_билета</w:t>
-      </w:r>
-      <w:proofErr w:type="spellEnd"/>
-      <w:r>
-        <w:rPr>
-          <w:rFonts w:ascii="Times New Roman" w:eastAsia="Times New Roman" w:hAnsi="Times New Roman" w:cs="Times New Roman"/>
-          <w:sz w:val="28"/>
-          <w:szCs w:val="28"/>
-          <w:lang w:eastAsia="ru-RU"/>
-        </w:rPr>
-        <w:t xml:space="preserve">, вопрос, </w:t>
-      </w:r>
-      <w:proofErr w:type="spellStart"/>
-      <w:r>
-        <w:rPr>
-          <w:rFonts w:ascii="Times New Roman" w:eastAsia="Times New Roman" w:hAnsi="Times New Roman" w:cs="Times New Roman"/>
-          <w:sz w:val="28"/>
-          <w:szCs w:val="28"/>
-          <w:lang w:eastAsia="ru-RU"/>
-        </w:rPr>
-        <w:t>вариант_A</w:t>
-      </w:r>
-      <w:proofErr w:type="spellEnd"/>
-      <w:r>
-        <w:rPr>
-          <w:rFonts w:ascii="Times New Roman" w:eastAsia="Times New Roman" w:hAnsi="Times New Roman" w:cs="Times New Roman"/>
-          <w:sz w:val="28"/>
-          <w:szCs w:val="28"/>
-          <w:lang w:eastAsia="ru-RU"/>
-        </w:rPr>
-        <w:t xml:space="preserve">, </w:t>
-      </w:r>
-      <w:proofErr w:type="spellStart"/>
-      <w:r>
-        <w:rPr>
-          <w:rFonts w:ascii="Times New Roman" w:eastAsia="Times New Roman" w:hAnsi="Times New Roman" w:cs="Times New Roman"/>
-          <w:sz w:val="28"/>
-          <w:szCs w:val="28"/>
-          <w:lang w:eastAsia="ru-RU"/>
-        </w:rPr>
-        <w:t>вариант_B</w:t>
-      </w:r>
-      <w:proofErr w:type="spellEnd"/>
-      <w:r>
-        <w:rPr>
-          <w:rFonts w:ascii="Times New Roman" w:eastAsia="Times New Roman" w:hAnsi="Times New Roman" w:cs="Times New Roman"/>
-          <w:sz w:val="28"/>
-          <w:szCs w:val="28"/>
-          <w:lang w:eastAsia="ru-RU"/>
-        </w:rPr>
-        <w:t xml:space="preserve">, </w:t>
-      </w:r>
-      <w:proofErr w:type="spellStart"/>
-      <w:r>
-        <w:rPr>
-          <w:rFonts w:ascii="Times New Roman" w:eastAsia="Times New Roman" w:hAnsi="Times New Roman" w:cs="Times New Roman"/>
-          <w:sz w:val="28"/>
-          <w:szCs w:val="28"/>
-          <w:lang w:eastAsia="ru-RU"/>
-        </w:rPr>
-        <w:t>вариант_C</w:t>
-      </w:r>
-      <w:proofErr w:type="spellEnd"/>
-      <w:r>
-        <w:rPr>
-          <w:rFonts w:ascii="Times New Roman" w:eastAsia="Times New Roman" w:hAnsi="Times New Roman" w:cs="Times New Roman"/>
-          <w:sz w:val="28"/>
-          <w:szCs w:val="28"/>
-          <w:lang w:eastAsia="ru-RU"/>
-        </w:rPr>
-        <w:t xml:space="preserve">, </w:t>
-      </w:r>
-      <w:proofErr w:type="spellStart"/>
-      <w:r>
-        <w:rPr>
-          <w:rFonts w:ascii="Times New Roman" w:eastAsia="Times New Roman" w:hAnsi="Times New Roman" w:cs="Times New Roman"/>
-          <w:sz w:val="28"/>
-          <w:szCs w:val="28"/>
-          <w:lang w:eastAsia="ru-RU"/>
-        </w:rPr>
-        <w:t>правильный_ответ</w:t>
-      </w:r>
-      <w:proofErr w:type="spellEnd"/>
-      <w:r>
-        <w:rPr>
-          <w:rFonts w:ascii="Times New Roman" w:eastAsia="Times New Roman" w:hAnsi="Times New Roman" w:cs="Times New Roman"/>
-          <w:sz w:val="28"/>
-          <w:szCs w:val="28"/>
-          <w:lang w:eastAsia="ru-RU"/>
-        </w:rPr>
-        <w:t>`)</w:t>
+      <w:r>
+        <w:rPr>
+          <w:rFonts w:ascii="Times New Roman" w:eastAsia="Times New Roman" w:hAnsi="Times New Roman" w:cs="Times New Roman"/>
+          <w:sz w:val="28"/>
+          <w:szCs w:val="28"/>
+          <w:lang w:eastAsia="ru-RU"/>
+        </w:rPr>
+        <w:t>Парсинг CSV (столбцы, например: `номер_билета, вопрос, вариант_A, вариант_B, вариант_C, правильный_ответ`)</w:t>
       </w:r>
     </w:p>
     <w:p>
@@ -21363,25 +19960,14 @@
           <w:lang w:eastAsia="ru-RU"/>
         </w:rPr>
       </w:pPr>
-      <w:proofErr w:type="spellStart"/>
-      <w:r>
-        <w:rPr>
-          <w:rFonts w:ascii="Times New Roman" w:eastAsia="Times New Roman" w:hAnsi="Times New Roman" w:cs="Times New Roman"/>
-          <w:sz w:val="28"/>
-          <w:szCs w:val="28"/>
-          <w:lang w:eastAsia="ru-RU"/>
-        </w:rPr>
-        <w:t>Валидация</w:t>
-      </w:r>
-      <w:proofErr w:type="spellEnd"/>
-      <w:r>
-        <w:rPr>
-          <w:rFonts w:ascii="Times New Roman" w:eastAsia="Times New Roman" w:hAnsi="Times New Roman" w:cs="Times New Roman"/>
-          <w:sz w:val="28"/>
-          <w:szCs w:val="28"/>
-          <w:lang w:eastAsia="ru-RU"/>
-        </w:rPr>
-        <w:t xml:space="preserve"> данных перед добавлением</w:t>
+      <w:r>
+        <w:rPr>
+          <w:rFonts w:ascii="Times New Roman" w:eastAsia="Times New Roman" w:hAnsi="Times New Roman" w:cs="Times New Roman"/>
+          <w:sz w:val="28"/>
+          <w:szCs w:val="28"/>
+          <w:lang w:eastAsia="ru-RU"/>
+        </w:rPr>
+        <w:t>Валидация данных перед добавлением</w:t>
       </w:r>
     </w:p>
     <w:p>
@@ -21448,7 +20034,7 @@
           <w:lang w:eastAsia="ru-RU"/>
         </w:rPr>
       </w:pPr>
-      <w:bookmarkStart w:id="31" w:name="_Toc229829740"/>
+      <w:bookmarkStart w:id="30" w:name="_Toc229829740"/>
       <w:r>
         <w:rPr>
           <w:rFonts w:eastAsia="Times New Roman"/>
@@ -21456,7 +20042,7 @@
         </w:rPr>
         <w:t>Управление пользователями (опционально)</w:t>
       </w:r>
-      <w:bookmarkEnd w:id="31"/>
+      <w:bookmarkEnd w:id="30"/>
     </w:p>
     <w:p>
       <w:pPr>
@@ -21682,25 +20268,14 @@
           <w:lang w:eastAsia="ru-RU"/>
         </w:rPr>
       </w:pPr>
-      <w:proofErr w:type="spellStart"/>
-      <w:r>
-        <w:rPr>
-          <w:rFonts w:ascii="Times New Roman" w:eastAsia="Times New Roman" w:hAnsi="Times New Roman" w:cs="Times New Roman"/>
-          <w:sz w:val="28"/>
-          <w:szCs w:val="28"/>
-          <w:lang w:eastAsia="ru-RU"/>
-        </w:rPr>
-        <w:t>Предпросмотр</w:t>
-      </w:r>
-      <w:proofErr w:type="spellEnd"/>
-      <w:r>
-        <w:rPr>
-          <w:rFonts w:ascii="Times New Roman" w:eastAsia="Times New Roman" w:hAnsi="Times New Roman" w:cs="Times New Roman"/>
-          <w:sz w:val="28"/>
-          <w:szCs w:val="28"/>
-          <w:lang w:eastAsia="ru-RU"/>
-        </w:rPr>
-        <w:t xml:space="preserve"> первых строк</w:t>
+      <w:r>
+        <w:rPr>
+          <w:rFonts w:ascii="Times New Roman" w:eastAsia="Times New Roman" w:hAnsi="Times New Roman" w:cs="Times New Roman"/>
+          <w:sz w:val="28"/>
+          <w:szCs w:val="28"/>
+          <w:lang w:eastAsia="ru-RU"/>
+        </w:rPr>
+        <w:t>Предпросмотр первых строк</w:t>
       </w:r>
     </w:p>
     <w:p>
@@ -21755,8 +20330,8 @@
           <w:lang w:eastAsia="ru-RU"/>
         </w:rPr>
       </w:pPr>
-      <w:bookmarkStart w:id="32" w:name="_Toc229829452"/>
-      <w:bookmarkStart w:id="33" w:name="_Toc229829741"/>
+      <w:bookmarkStart w:id="31" w:name="_Toc229829452"/>
+      <w:bookmarkStart w:id="32" w:name="_Toc229829741"/>
       <w:r>
         <w:rPr>
           <w:rFonts w:eastAsia="Times New Roman"/>
@@ -21764,8 +20339,8 @@
         </w:rPr>
         <w:t>Распределение ролей членов команды</w:t>
       </w:r>
+      <w:bookmarkEnd w:id="31"/>
       <w:bookmarkEnd w:id="32"/>
-      <w:bookmarkEnd w:id="33"/>
     </w:p>
     <w:p>
       <w:pPr>
@@ -21793,8 +20368,8 @@
           <w:lang w:eastAsia="ru-RU"/>
         </w:rPr>
       </w:pPr>
-      <w:bookmarkStart w:id="34" w:name="_Toc229829453"/>
-      <w:bookmarkStart w:id="35" w:name="_Toc229829742"/>
+      <w:bookmarkStart w:id="33" w:name="_Toc229829453"/>
+      <w:bookmarkStart w:id="34" w:name="_Toc229829742"/>
       <w:r>
         <w:rPr>
           <w:rFonts w:eastAsia="Times New Roman"/>
@@ -21802,8 +20377,8 @@
         </w:rPr>
         <w:t>Модуль «Тестирование»</w:t>
       </w:r>
+      <w:bookmarkEnd w:id="33"/>
       <w:bookmarkEnd w:id="34"/>
-      <w:bookmarkEnd w:id="35"/>
     </w:p>
     <w:p>
       <w:pPr>
@@ -21817,7 +20392,7 @@
           <w:lang w:eastAsia="ru-RU"/>
         </w:rPr>
       </w:pPr>
-      <w:bookmarkStart w:id="36" w:name="_Toc229829743"/>
+      <w:bookmarkStart w:id="35" w:name="_Toc229829743"/>
       <w:r>
         <w:rPr>
           <w:rFonts w:eastAsia="Times New Roman"/>
@@ -21825,7 +20400,7 @@
         </w:rPr>
         <w:t>Основное описание модуля</w:t>
       </w:r>
-      <w:bookmarkEnd w:id="36"/>
+      <w:bookmarkEnd w:id="35"/>
     </w:p>
     <w:p>
       <w:pPr>
@@ -21917,8 +20492,8 @@
           <w:lang w:eastAsia="ru-RU"/>
         </w:rPr>
       </w:pPr>
-      <w:bookmarkStart w:id="37" w:name="_Toc229829454"/>
-      <w:bookmarkStart w:id="38" w:name="_Toc229829744"/>
+      <w:bookmarkStart w:id="36" w:name="_Toc229829454"/>
+      <w:bookmarkStart w:id="37" w:name="_Toc229829744"/>
       <w:r>
         <w:rPr>
           <w:rFonts w:eastAsia="Times New Roman"/>
@@ -21933,8 +20508,8 @@
         </w:rPr>
         <w:t>билета</w:t>
       </w:r>
+      <w:bookmarkEnd w:id="36"/>
       <w:bookmarkEnd w:id="37"/>
-      <w:bookmarkEnd w:id="38"/>
     </w:p>
     <w:p>
       <w:pPr>
@@ -22087,8 +20662,8 @@
           <w:lang w:eastAsia="ru-RU"/>
         </w:rPr>
       </w:pPr>
-      <w:bookmarkStart w:id="39" w:name="_Toc229829455"/>
-      <w:bookmarkStart w:id="40" w:name="_Toc229829745"/>
+      <w:bookmarkStart w:id="38" w:name="_Toc229829455"/>
+      <w:bookmarkStart w:id="39" w:name="_Toc229829745"/>
       <w:r>
         <w:rPr>
           <w:rFonts w:eastAsia="Times New Roman"/>
@@ -22096,8 +20671,8 @@
         </w:rPr>
         <w:t>Завершение теста и подсчёт результата</w:t>
       </w:r>
+      <w:bookmarkEnd w:id="38"/>
       <w:bookmarkEnd w:id="39"/>
-      <w:bookmarkEnd w:id="40"/>
     </w:p>
     <w:p>
       <w:pPr>
@@ -22285,8 +20860,8 @@
           <w:lang w:eastAsia="ru-RU"/>
         </w:rPr>
       </w:pPr>
-      <w:bookmarkStart w:id="41" w:name="_Toc229829456"/>
-      <w:bookmarkStart w:id="42" w:name="_Toc229829746"/>
+      <w:bookmarkStart w:id="40" w:name="_Toc229829456"/>
+      <w:bookmarkStart w:id="41" w:name="_Toc229829746"/>
       <w:r>
         <w:rPr>
           <w:rFonts w:eastAsia="Times New Roman"/>
@@ -22295,8 +20870,8 @@
         <w:lastRenderedPageBreak/>
         <w:t>Детальный результат</w:t>
       </w:r>
+      <w:bookmarkEnd w:id="40"/>
       <w:bookmarkEnd w:id="41"/>
-      <w:bookmarkEnd w:id="42"/>
     </w:p>
     <w:p>
       <w:pPr>
@@ -22406,8 +20981,8 @@
           <w:lang w:eastAsia="ru-RU"/>
         </w:rPr>
       </w:pPr>
-      <w:bookmarkStart w:id="43" w:name="_Toc229829457"/>
-      <w:bookmarkStart w:id="44" w:name="_Toc229829747"/>
+      <w:bookmarkStart w:id="42" w:name="_Toc229829457"/>
+      <w:bookmarkStart w:id="43" w:name="_Toc229829747"/>
       <w:r>
         <w:rPr>
           <w:rFonts w:eastAsia="Times New Roman"/>
@@ -22415,8 +20990,8 @@
         </w:rPr>
         <w:t>Ограничения и защита</w:t>
       </w:r>
+      <w:bookmarkEnd w:id="42"/>
       <w:bookmarkEnd w:id="43"/>
-      <w:bookmarkEnd w:id="44"/>
     </w:p>
     <w:p>
       <w:pPr>
@@ -22482,7 +21057,7 @@
           <w:lang w:eastAsia="ru-RU"/>
         </w:rPr>
       </w:pPr>
-      <w:bookmarkStart w:id="45" w:name="_Toc229829748"/>
+      <w:bookmarkStart w:id="44" w:name="_Toc229829748"/>
       <w:r>
         <w:rPr>
           <w:rFonts w:eastAsia="Times New Roman"/>
@@ -22490,7 +21065,80 @@
         </w:rPr>
         <w:t>Распределение ролей членов команды</w:t>
       </w:r>
+      <w:bookmarkEnd w:id="44"/>
+    </w:p>
+    <w:p>
+      <w:pPr>
+        <w:spacing w:after="100" w:afterAutospacing="1" w:line="360" w:lineRule="auto"/>
+        <w:ind w:firstLine="709"/>
+        <w:contextualSpacing/>
+        <w:jc w:val="both"/>
+        <w:rPr>
+          <w:rFonts w:ascii="Times New Roman" w:eastAsia="Times New Roman" w:hAnsi="Times New Roman" w:cs="Times New Roman"/>
+          <w:sz w:val="28"/>
+          <w:szCs w:val="28"/>
+          <w:lang w:eastAsia="ru-RU"/>
+        </w:rPr>
+      </w:pPr>
+    </w:p>
+    <w:p>
+      <w:pPr>
+        <w:spacing w:after="100" w:afterAutospacing="1" w:line="360" w:lineRule="auto"/>
+        <w:ind w:firstLine="709"/>
+        <w:contextualSpacing/>
+        <w:jc w:val="both"/>
+        <w:rPr>
+          <w:rFonts w:ascii="Times New Roman" w:eastAsia="Times New Roman" w:hAnsi="Times New Roman" w:cs="Times New Roman"/>
+          <w:sz w:val="28"/>
+          <w:szCs w:val="28"/>
+          <w:lang w:eastAsia="ru-RU"/>
+        </w:rPr>
+      </w:pPr>
+    </w:p>
+    <w:p>
+      <w:pPr>
+        <w:spacing w:after="160" w:line="259" w:lineRule="auto"/>
+        <w:rPr>
+          <w:rFonts w:ascii="Times New Roman" w:eastAsia="Times New Roman" w:hAnsi="Times New Roman" w:cs="Times New Roman"/>
+          <w:sz w:val="28"/>
+          <w:szCs w:val="28"/>
+          <w:lang w:eastAsia="ru-RU"/>
+        </w:rPr>
+      </w:pPr>
+      <w:r>
+        <w:rPr>
+          <w:rFonts w:ascii="Times New Roman" w:eastAsia="Times New Roman" w:hAnsi="Times New Roman" w:cs="Times New Roman"/>
+          <w:sz w:val="28"/>
+          <w:szCs w:val="28"/>
+          <w:lang w:eastAsia="ru-RU"/>
+        </w:rPr>
+        <w:br w:type="page"/>
+      </w:r>
+    </w:p>
+    <w:p>
+      <w:pPr>
+        <w:pStyle w:val="1"/>
+        <w:numPr>
+          <w:ilvl w:val="0"/>
+          <w:numId w:val="4"/>
+        </w:numPr>
+        <w:rPr>
+          <w:rFonts w:eastAsia="Times New Roman"/>
+          <w:lang w:eastAsia="ru-RU"/>
+        </w:rPr>
+      </w:pPr>
+      <w:bookmarkStart w:id="45" w:name="_Toc229829459"/>
+      <w:bookmarkStart w:id="46" w:name="_Toc229829750"/>
+      <w:r>
+        <w:rPr>
+          <w:rFonts w:eastAsia="Times New Roman"/>
+          <w:lang w:eastAsia="ru-RU"/>
+        </w:rPr>
+        <w:lastRenderedPageBreak/>
+        <w:t>Создание плановой документации</w:t>
+      </w:r>
       <w:bookmarkEnd w:id="45"/>
+      <w:bookmarkEnd w:id="46"/>
     </w:p>
     <w:p>
       <w:pPr>
@@ -22505,20 +21153,42 @@
           <w:lang w:eastAsia="ru-RU"/>
         </w:rPr>
       </w:pPr>
-    </w:p>
-    <w:p>
-      <w:pPr>
-        <w:spacing w:after="100" w:afterAutospacing="1" w:line="360" w:lineRule="auto"/>
-        <w:ind w:firstLine="709"/>
-        <w:contextualSpacing/>
-        <w:jc w:val="both"/>
-        <w:rPr>
-          <w:rFonts w:ascii="Times New Roman" w:eastAsia="Times New Roman" w:hAnsi="Times New Roman" w:cs="Times New Roman"/>
-          <w:sz w:val="28"/>
-          <w:szCs w:val="28"/>
-          <w:lang w:eastAsia="ru-RU"/>
-        </w:rPr>
-      </w:pPr>
+      <w:r>
+        <w:rPr>
+          <w:rFonts w:ascii="Times New Roman" w:eastAsia="Times New Roman" w:hAnsi="Times New Roman" w:cs="Times New Roman"/>
+          <w:sz w:val="28"/>
+          <w:szCs w:val="28"/>
+          <w:lang w:eastAsia="ru-RU"/>
+        </w:rPr>
+        <w:t xml:space="preserve">Для более подробного описания системы </w:t>
+      </w:r>
+      <w:r>
+        <w:rPr>
+          <w:rFonts w:ascii="Times New Roman" w:eastAsia="Times New Roman" w:hAnsi="Times New Roman" w:cs="Times New Roman"/>
+          <w:sz w:val="28"/>
+          <w:szCs w:val="28"/>
+          <w:lang w:eastAsia="ru-RU"/>
+        </w:rPr>
+        <w:t xml:space="preserve">были составлены с помощью языка </w:t>
+      </w:r>
+      <w:r>
+        <w:rPr>
+          <w:rFonts w:ascii="Times New Roman" w:eastAsia="Times New Roman" w:hAnsi="Times New Roman" w:cs="Times New Roman"/>
+          <w:sz w:val="28"/>
+          <w:szCs w:val="28"/>
+          <w:lang w:val="en-US" w:eastAsia="ru-RU"/>
+        </w:rPr>
+        <w:t>UML</w:t>
+      </w:r>
+      <w:r>
+        <w:rPr>
+          <w:rFonts w:ascii="Times New Roman" w:eastAsia="Times New Roman" w:hAnsi="Times New Roman" w:cs="Times New Roman"/>
+          <w:sz w:val="28"/>
+          <w:szCs w:val="28"/>
+          <w:lang w:eastAsia="ru-RU"/>
+        </w:rPr>
+        <w:t xml:space="preserve"> диаграммы.</w:t>
+      </w:r>
     </w:p>
     <w:p>
       <w:pPr>
@@ -22529,616 +21199,20 @@
         </w:numPr>
         <w:rPr>
           <w:rFonts w:eastAsia="Times New Roman"/>
-          <w:highlight w:val="yellow"/>
-          <w:lang w:eastAsia="ru-RU"/>
-        </w:rPr>
-      </w:pPr>
-      <w:bookmarkStart w:id="46" w:name="_Toc229829458"/>
-      <w:bookmarkStart w:id="47" w:name="_Toc229829749"/>
+          <w:lang w:eastAsia="ru-RU"/>
+        </w:rPr>
+      </w:pPr>
+      <w:bookmarkStart w:id="47" w:name="_Toc229829460"/>
+      <w:bookmarkStart w:id="48" w:name="_Toc229829751"/>
       <w:r>
         <w:rPr>
           <w:rFonts w:eastAsia="Times New Roman"/>
-          <w:highlight w:val="yellow"/>
-          <w:lang w:eastAsia="ru-RU"/>
-        </w:rPr>
-        <w:t>С</w:t>
-      </w:r>
-      <w:r>
-        <w:rPr>
-          <w:rFonts w:eastAsia="Times New Roman"/>
-          <w:highlight w:val="yellow"/>
-          <w:lang w:eastAsia="ru-RU"/>
-        </w:rPr>
-        <w:t>труктура данных</w:t>
-      </w:r>
-      <w:bookmarkEnd w:id="46"/>
+          <w:lang w:eastAsia="ru-RU"/>
+        </w:rPr>
+        <w:t>Диаграмма Использования</w:t>
+      </w:r>
       <w:bookmarkEnd w:id="47"/>
-    </w:p>
-    <w:p>
-      <w:pPr>
-        <w:spacing w:after="100" w:afterAutospacing="1" w:line="360" w:lineRule="auto"/>
-        <w:ind w:firstLine="709"/>
-        <w:contextualSpacing/>
-        <w:jc w:val="both"/>
-        <w:rPr>
-          <w:rFonts w:ascii="Times New Roman" w:eastAsia="Times New Roman" w:hAnsi="Times New Roman" w:cs="Times New Roman"/>
-          <w:sz w:val="28"/>
-          <w:szCs w:val="28"/>
-          <w:lang w:eastAsia="ru-RU"/>
-        </w:rPr>
-      </w:pPr>
-      <w:r>
-        <w:rPr>
-          <w:rFonts w:ascii="Times New Roman" w:eastAsia="Times New Roman" w:hAnsi="Times New Roman" w:cs="Times New Roman"/>
-          <w:sz w:val="28"/>
-          <w:szCs w:val="28"/>
-          <w:lang w:eastAsia="ru-RU"/>
-        </w:rPr>
-        <w:t>В базе данных (таблицы</w:t>
-      </w:r>
-      <w:proofErr w:type="gramStart"/>
-      <w:r>
-        <w:rPr>
-          <w:rFonts w:ascii="Times New Roman" w:eastAsia="Times New Roman" w:hAnsi="Times New Roman" w:cs="Times New Roman"/>
-          <w:sz w:val="28"/>
-          <w:szCs w:val="28"/>
-          <w:lang w:eastAsia="ru-RU"/>
-        </w:rPr>
-        <w:t>):*</w:t>
-      </w:r>
-      <w:proofErr w:type="gramEnd"/>
-      <w:r>
-        <w:rPr>
-          <w:rFonts w:ascii="Times New Roman" w:eastAsia="Times New Roman" w:hAnsi="Times New Roman" w:cs="Times New Roman"/>
-          <w:sz w:val="28"/>
-          <w:szCs w:val="28"/>
-          <w:lang w:eastAsia="ru-RU"/>
-        </w:rPr>
-        <w:t>*</w:t>
-      </w:r>
-    </w:p>
-    <w:p>
-      <w:pPr>
-        <w:spacing w:after="100" w:afterAutospacing="1" w:line="360" w:lineRule="auto"/>
-        <w:ind w:firstLine="709"/>
-        <w:contextualSpacing/>
-        <w:jc w:val="both"/>
-        <w:rPr>
-          <w:rFonts w:ascii="Times New Roman" w:eastAsia="Times New Roman" w:hAnsi="Times New Roman" w:cs="Times New Roman"/>
-          <w:sz w:val="28"/>
-          <w:szCs w:val="28"/>
-          <w:lang w:eastAsia="ru-RU"/>
-        </w:rPr>
-      </w:pPr>
-      <w:r>
-        <w:rPr>
-          <w:rFonts w:ascii="Times New Roman" w:eastAsia="Times New Roman" w:hAnsi="Times New Roman" w:cs="Times New Roman"/>
-          <w:sz w:val="28"/>
-          <w:szCs w:val="28"/>
-          <w:lang w:eastAsia="ru-RU"/>
-        </w:rPr>
-        <w:t>`</w:t>
-      </w:r>
-      <w:proofErr w:type="spellStart"/>
-      <w:r>
-        <w:rPr>
-          <w:rFonts w:ascii="Times New Roman" w:eastAsia="Times New Roman" w:hAnsi="Times New Roman" w:cs="Times New Roman"/>
-          <w:sz w:val="28"/>
-          <w:szCs w:val="28"/>
-          <w:lang w:eastAsia="ru-RU"/>
-        </w:rPr>
-        <w:t>tickets</w:t>
-      </w:r>
-      <w:proofErr w:type="spellEnd"/>
-      <w:r>
-        <w:rPr>
-          <w:rFonts w:ascii="Times New Roman" w:eastAsia="Times New Roman" w:hAnsi="Times New Roman" w:cs="Times New Roman"/>
-          <w:sz w:val="28"/>
-          <w:szCs w:val="28"/>
-          <w:lang w:eastAsia="ru-RU"/>
-        </w:rPr>
-        <w:t>` — билеты (название, описание, время на прохождение, проходной балл)</w:t>
-      </w:r>
-    </w:p>
-    <w:p>
-      <w:pPr>
-        <w:spacing w:after="100" w:afterAutospacing="1" w:line="360" w:lineRule="auto"/>
-        <w:ind w:firstLine="709"/>
-        <w:contextualSpacing/>
-        <w:jc w:val="both"/>
-        <w:rPr>
-          <w:rFonts w:ascii="Times New Roman" w:eastAsia="Times New Roman" w:hAnsi="Times New Roman" w:cs="Times New Roman"/>
-          <w:sz w:val="28"/>
-          <w:szCs w:val="28"/>
-          <w:lang w:eastAsia="ru-RU"/>
-        </w:rPr>
-      </w:pPr>
-      <w:r>
-        <w:rPr>
-          <w:rFonts w:ascii="Times New Roman" w:eastAsia="Times New Roman" w:hAnsi="Times New Roman" w:cs="Times New Roman"/>
-          <w:sz w:val="28"/>
-          <w:szCs w:val="28"/>
-          <w:lang w:eastAsia="ru-RU"/>
-        </w:rPr>
-        <w:t>`</w:t>
-      </w:r>
-      <w:proofErr w:type="spellStart"/>
-      <w:r>
-        <w:rPr>
-          <w:rFonts w:ascii="Times New Roman" w:eastAsia="Times New Roman" w:hAnsi="Times New Roman" w:cs="Times New Roman"/>
-          <w:sz w:val="28"/>
-          <w:szCs w:val="28"/>
-          <w:lang w:eastAsia="ru-RU"/>
-        </w:rPr>
-        <w:t>questions</w:t>
-      </w:r>
-      <w:proofErr w:type="spellEnd"/>
-      <w:r>
-        <w:rPr>
-          <w:rFonts w:ascii="Times New Roman" w:eastAsia="Times New Roman" w:hAnsi="Times New Roman" w:cs="Times New Roman"/>
-          <w:sz w:val="28"/>
-          <w:szCs w:val="28"/>
-          <w:lang w:eastAsia="ru-RU"/>
-        </w:rPr>
-        <w:t xml:space="preserve">` — вопросы (текст вопроса, тип, </w:t>
-      </w:r>
-      <w:proofErr w:type="spellStart"/>
-      <w:r>
-        <w:rPr>
-          <w:rFonts w:ascii="Times New Roman" w:eastAsia="Times New Roman" w:hAnsi="Times New Roman" w:cs="Times New Roman"/>
-          <w:sz w:val="28"/>
-          <w:szCs w:val="28"/>
-          <w:lang w:eastAsia="ru-RU"/>
-        </w:rPr>
-        <w:t>id</w:t>
-      </w:r>
-      <w:proofErr w:type="spellEnd"/>
-      <w:r>
-        <w:rPr>
-          <w:rFonts w:ascii="Times New Roman" w:eastAsia="Times New Roman" w:hAnsi="Times New Roman" w:cs="Times New Roman"/>
-          <w:sz w:val="28"/>
-          <w:szCs w:val="28"/>
-          <w:lang w:eastAsia="ru-RU"/>
-        </w:rPr>
-        <w:t xml:space="preserve"> билета)</w:t>
-      </w:r>
-    </w:p>
-    <w:p>
-      <w:pPr>
-        <w:spacing w:after="100" w:afterAutospacing="1" w:line="360" w:lineRule="auto"/>
-        <w:ind w:firstLine="709"/>
-        <w:contextualSpacing/>
-        <w:jc w:val="both"/>
-        <w:rPr>
-          <w:rFonts w:ascii="Times New Roman" w:eastAsia="Times New Roman" w:hAnsi="Times New Roman" w:cs="Times New Roman"/>
-          <w:sz w:val="28"/>
-          <w:szCs w:val="28"/>
-          <w:lang w:eastAsia="ru-RU"/>
-        </w:rPr>
-      </w:pPr>
-      <w:r>
-        <w:rPr>
-          <w:rFonts w:ascii="Times New Roman" w:eastAsia="Times New Roman" w:hAnsi="Times New Roman" w:cs="Times New Roman"/>
-          <w:sz w:val="28"/>
-          <w:szCs w:val="28"/>
-          <w:lang w:eastAsia="ru-RU"/>
-        </w:rPr>
-        <w:t>`</w:t>
-      </w:r>
-      <w:proofErr w:type="spellStart"/>
-      <w:r>
-        <w:rPr>
-          <w:rFonts w:ascii="Times New Roman" w:eastAsia="Times New Roman" w:hAnsi="Times New Roman" w:cs="Times New Roman"/>
-          <w:sz w:val="28"/>
-          <w:szCs w:val="28"/>
-          <w:lang w:eastAsia="ru-RU"/>
-        </w:rPr>
-        <w:t>answers</w:t>
-      </w:r>
-      <w:proofErr w:type="spellEnd"/>
-      <w:r>
-        <w:rPr>
-          <w:rFonts w:ascii="Times New Roman" w:eastAsia="Times New Roman" w:hAnsi="Times New Roman" w:cs="Times New Roman"/>
-          <w:sz w:val="28"/>
-          <w:szCs w:val="28"/>
-          <w:lang w:eastAsia="ru-RU"/>
-        </w:rPr>
-        <w:t xml:space="preserve">` — варианты ответов (текст, правильный ли, </w:t>
-      </w:r>
-      <w:proofErr w:type="spellStart"/>
-      <w:r>
-        <w:rPr>
-          <w:rFonts w:ascii="Times New Roman" w:eastAsia="Times New Roman" w:hAnsi="Times New Roman" w:cs="Times New Roman"/>
-          <w:sz w:val="28"/>
-          <w:szCs w:val="28"/>
-          <w:lang w:eastAsia="ru-RU"/>
-        </w:rPr>
-        <w:t>id</w:t>
-      </w:r>
-      <w:proofErr w:type="spellEnd"/>
-      <w:r>
-        <w:rPr>
-          <w:rFonts w:ascii="Times New Roman" w:eastAsia="Times New Roman" w:hAnsi="Times New Roman" w:cs="Times New Roman"/>
-          <w:sz w:val="28"/>
-          <w:szCs w:val="28"/>
-          <w:lang w:eastAsia="ru-RU"/>
-        </w:rPr>
-        <w:t xml:space="preserve"> вопроса)</w:t>
-      </w:r>
-    </w:p>
-    <w:p>
-      <w:pPr>
-        <w:spacing w:after="100" w:afterAutospacing="1" w:line="360" w:lineRule="auto"/>
-        <w:ind w:firstLine="709"/>
-        <w:contextualSpacing/>
-        <w:jc w:val="both"/>
-        <w:rPr>
-          <w:rFonts w:ascii="Times New Roman" w:eastAsia="Times New Roman" w:hAnsi="Times New Roman" w:cs="Times New Roman"/>
-          <w:sz w:val="28"/>
-          <w:szCs w:val="28"/>
-          <w:lang w:eastAsia="ru-RU"/>
-        </w:rPr>
-      </w:pPr>
-      <w:r>
-        <w:rPr>
-          <w:rFonts w:ascii="Times New Roman" w:eastAsia="Times New Roman" w:hAnsi="Times New Roman" w:cs="Times New Roman"/>
-          <w:sz w:val="28"/>
-          <w:szCs w:val="28"/>
-          <w:lang w:eastAsia="ru-RU"/>
-        </w:rPr>
-        <w:t>`</w:t>
-      </w:r>
-      <w:proofErr w:type="spellStart"/>
-      <w:r>
-        <w:rPr>
-          <w:rFonts w:ascii="Times New Roman" w:eastAsia="Times New Roman" w:hAnsi="Times New Roman" w:cs="Times New Roman"/>
-          <w:sz w:val="28"/>
-          <w:szCs w:val="28"/>
-          <w:lang w:eastAsia="ru-RU"/>
-        </w:rPr>
-        <w:t>test_sessions</w:t>
-      </w:r>
-      <w:proofErr w:type="spellEnd"/>
-      <w:r>
-        <w:rPr>
-          <w:rFonts w:ascii="Times New Roman" w:eastAsia="Times New Roman" w:hAnsi="Times New Roman" w:cs="Times New Roman"/>
-          <w:sz w:val="28"/>
-          <w:szCs w:val="28"/>
-          <w:lang w:eastAsia="ru-RU"/>
-        </w:rPr>
-        <w:t>` — сессии прохождения (пользователь, билет, дата начала, статус: в процессе / завершён)</w:t>
-      </w:r>
-    </w:p>
-    <w:p>
-      <w:pPr>
-        <w:spacing w:after="100" w:afterAutospacing="1" w:line="360" w:lineRule="auto"/>
-        <w:ind w:firstLine="709"/>
-        <w:contextualSpacing/>
-        <w:jc w:val="both"/>
-        <w:rPr>
-          <w:rFonts w:ascii="Times New Roman" w:eastAsia="Times New Roman" w:hAnsi="Times New Roman" w:cs="Times New Roman"/>
-          <w:sz w:val="28"/>
-          <w:szCs w:val="28"/>
-          <w:lang w:eastAsia="ru-RU"/>
-        </w:rPr>
-      </w:pPr>
-      <w:r>
-        <w:rPr>
-          <w:rFonts w:ascii="Times New Roman" w:eastAsia="Times New Roman" w:hAnsi="Times New Roman" w:cs="Times New Roman"/>
-          <w:sz w:val="28"/>
-          <w:szCs w:val="28"/>
-          <w:lang w:eastAsia="ru-RU"/>
-        </w:rPr>
-        <w:t>`</w:t>
-      </w:r>
-      <w:proofErr w:type="spellStart"/>
-      <w:r>
-        <w:rPr>
-          <w:rFonts w:ascii="Times New Roman" w:eastAsia="Times New Roman" w:hAnsi="Times New Roman" w:cs="Times New Roman"/>
-          <w:sz w:val="28"/>
-          <w:szCs w:val="28"/>
-          <w:lang w:eastAsia="ru-RU"/>
-        </w:rPr>
-        <w:t>user_answers</w:t>
-      </w:r>
-      <w:proofErr w:type="spellEnd"/>
-      <w:r>
-        <w:rPr>
-          <w:rFonts w:ascii="Times New Roman" w:eastAsia="Times New Roman" w:hAnsi="Times New Roman" w:cs="Times New Roman"/>
-          <w:sz w:val="28"/>
-          <w:szCs w:val="28"/>
-          <w:lang w:eastAsia="ru-RU"/>
-        </w:rPr>
-        <w:t>` — ответы пользователя (</w:t>
-      </w:r>
-      <w:proofErr w:type="spellStart"/>
-      <w:r>
-        <w:rPr>
-          <w:rFonts w:ascii="Times New Roman" w:eastAsia="Times New Roman" w:hAnsi="Times New Roman" w:cs="Times New Roman"/>
-          <w:sz w:val="28"/>
-          <w:szCs w:val="28"/>
-          <w:lang w:eastAsia="ru-RU"/>
-        </w:rPr>
-        <w:t>id</w:t>
-      </w:r>
-      <w:proofErr w:type="spellEnd"/>
-      <w:r>
-        <w:rPr>
-          <w:rFonts w:ascii="Times New Roman" w:eastAsia="Times New Roman" w:hAnsi="Times New Roman" w:cs="Times New Roman"/>
-          <w:sz w:val="28"/>
-          <w:szCs w:val="28"/>
-          <w:lang w:eastAsia="ru-RU"/>
-        </w:rPr>
-        <w:t xml:space="preserve"> сессии, </w:t>
-      </w:r>
-      <w:proofErr w:type="spellStart"/>
-      <w:r>
-        <w:rPr>
-          <w:rFonts w:ascii="Times New Roman" w:eastAsia="Times New Roman" w:hAnsi="Times New Roman" w:cs="Times New Roman"/>
-          <w:sz w:val="28"/>
-          <w:szCs w:val="28"/>
-          <w:lang w:eastAsia="ru-RU"/>
-        </w:rPr>
-        <w:t>id</w:t>
-      </w:r>
-      <w:proofErr w:type="spellEnd"/>
-      <w:r>
-        <w:rPr>
-          <w:rFonts w:ascii="Times New Roman" w:eastAsia="Times New Roman" w:hAnsi="Times New Roman" w:cs="Times New Roman"/>
-          <w:sz w:val="28"/>
-          <w:szCs w:val="28"/>
-          <w:lang w:eastAsia="ru-RU"/>
-        </w:rPr>
-        <w:t xml:space="preserve"> вопроса, выбранный ответ, правильный ли)</w:t>
-      </w:r>
-    </w:p>
-    <w:p>
-      <w:pPr>
-        <w:spacing w:after="100" w:afterAutospacing="1" w:line="360" w:lineRule="auto"/>
-        <w:ind w:firstLine="709"/>
-        <w:contextualSpacing/>
-        <w:jc w:val="both"/>
-        <w:rPr>
-          <w:rFonts w:ascii="Times New Roman" w:eastAsia="Times New Roman" w:hAnsi="Times New Roman" w:cs="Times New Roman"/>
-          <w:sz w:val="28"/>
-          <w:szCs w:val="28"/>
-          <w:lang w:eastAsia="ru-RU"/>
-        </w:rPr>
-      </w:pPr>
-      <w:r>
-        <w:rPr>
-          <w:rFonts w:ascii="Times New Roman" w:eastAsia="Times New Roman" w:hAnsi="Times New Roman" w:cs="Times New Roman"/>
-          <w:sz w:val="28"/>
-          <w:szCs w:val="28"/>
-          <w:lang w:eastAsia="ru-RU"/>
-        </w:rPr>
-        <w:t>`</w:t>
-      </w:r>
-      <w:proofErr w:type="spellStart"/>
-      <w:r>
-        <w:rPr>
-          <w:rFonts w:ascii="Times New Roman" w:eastAsia="Times New Roman" w:hAnsi="Times New Roman" w:cs="Times New Roman"/>
-          <w:sz w:val="28"/>
-          <w:szCs w:val="28"/>
-          <w:lang w:eastAsia="ru-RU"/>
-        </w:rPr>
-        <w:t>test_results</w:t>
-      </w:r>
-      <w:proofErr w:type="spellEnd"/>
-      <w:r>
-        <w:rPr>
-          <w:rFonts w:ascii="Times New Roman" w:eastAsia="Times New Roman" w:hAnsi="Times New Roman" w:cs="Times New Roman"/>
-          <w:sz w:val="28"/>
-          <w:szCs w:val="28"/>
-          <w:lang w:eastAsia="ru-RU"/>
-        </w:rPr>
-        <w:t>` — итоговые результаты (</w:t>
-      </w:r>
-      <w:proofErr w:type="spellStart"/>
-      <w:r>
-        <w:rPr>
-          <w:rFonts w:ascii="Times New Roman" w:eastAsia="Times New Roman" w:hAnsi="Times New Roman" w:cs="Times New Roman"/>
-          <w:sz w:val="28"/>
-          <w:szCs w:val="28"/>
-          <w:lang w:eastAsia="ru-RU"/>
-        </w:rPr>
-        <w:t>id</w:t>
-      </w:r>
-      <w:proofErr w:type="spellEnd"/>
-      <w:r>
-        <w:rPr>
-          <w:rFonts w:ascii="Times New Roman" w:eastAsia="Times New Roman" w:hAnsi="Times New Roman" w:cs="Times New Roman"/>
-          <w:sz w:val="28"/>
-          <w:szCs w:val="28"/>
-          <w:lang w:eastAsia="ru-RU"/>
-        </w:rPr>
-        <w:t xml:space="preserve"> сессии, </w:t>
-      </w:r>
-      <w:r>
-        <w:rPr>
-          <w:rFonts w:ascii="Times New Roman" w:eastAsia="Times New Roman" w:hAnsi="Times New Roman" w:cs="Times New Roman"/>
-          <w:sz w:val="28"/>
-          <w:szCs w:val="28"/>
-          <w:lang w:eastAsia="ru-RU"/>
-        </w:rPr>
-        <w:t>балл, процент, дата завершения)</w:t>
-      </w:r>
-    </w:p>
-    <w:p>
-      <w:pPr>
-        <w:spacing w:after="100" w:afterAutospacing="1" w:line="360" w:lineRule="auto"/>
-        <w:ind w:firstLine="709"/>
-        <w:contextualSpacing/>
-        <w:jc w:val="both"/>
-        <w:rPr>
-          <w:rFonts w:ascii="Times New Roman" w:eastAsia="Times New Roman" w:hAnsi="Times New Roman" w:cs="Times New Roman"/>
-          <w:sz w:val="28"/>
-          <w:szCs w:val="28"/>
-          <w:lang w:eastAsia="ru-RU"/>
-        </w:rPr>
-      </w:pPr>
-    </w:p>
-    <w:p>
-      <w:pPr>
-        <w:spacing w:after="100" w:afterAutospacing="1" w:line="360" w:lineRule="auto"/>
-        <w:ind w:firstLine="709"/>
-        <w:contextualSpacing/>
-        <w:jc w:val="both"/>
-        <w:rPr>
-          <w:rFonts w:ascii="Times New Roman" w:eastAsia="Times New Roman" w:hAnsi="Times New Roman" w:cs="Times New Roman"/>
-          <w:sz w:val="28"/>
-          <w:szCs w:val="28"/>
-          <w:lang w:eastAsia="ru-RU"/>
-        </w:rPr>
-      </w:pPr>
-    </w:p>
-    <w:p>
-      <w:pPr>
-        <w:spacing w:after="100" w:afterAutospacing="1" w:line="360" w:lineRule="auto"/>
-        <w:ind w:firstLine="709"/>
-        <w:contextualSpacing/>
-        <w:jc w:val="both"/>
-        <w:rPr>
-          <w:rFonts w:ascii="Times New Roman" w:eastAsia="Times New Roman" w:hAnsi="Times New Roman" w:cs="Times New Roman"/>
-          <w:sz w:val="28"/>
-          <w:szCs w:val="28"/>
-          <w:lang w:eastAsia="ru-RU"/>
-        </w:rPr>
-      </w:pPr>
-    </w:p>
-    <w:p>
-      <w:pPr>
-        <w:spacing w:after="100" w:afterAutospacing="1" w:line="360" w:lineRule="auto"/>
-        <w:ind w:firstLine="709"/>
-        <w:contextualSpacing/>
-        <w:jc w:val="both"/>
-        <w:rPr>
-          <w:rFonts w:ascii="Times New Roman" w:eastAsia="Times New Roman" w:hAnsi="Times New Roman" w:cs="Times New Roman"/>
-          <w:sz w:val="28"/>
-          <w:szCs w:val="28"/>
-          <w:lang w:eastAsia="ru-RU"/>
-        </w:rPr>
-      </w:pPr>
-    </w:p>
-    <w:p>
-      <w:pPr>
-        <w:spacing w:after="160" w:line="259" w:lineRule="auto"/>
-        <w:rPr>
-          <w:rFonts w:ascii="Times New Roman" w:eastAsia="Times New Roman" w:hAnsi="Times New Roman" w:cs="Times New Roman"/>
-          <w:sz w:val="28"/>
-          <w:szCs w:val="28"/>
-          <w:lang w:eastAsia="ru-RU"/>
-        </w:rPr>
-      </w:pPr>
-      <w:r>
-        <w:rPr>
-          <w:rFonts w:ascii="Times New Roman" w:eastAsia="Times New Roman" w:hAnsi="Times New Roman" w:cs="Times New Roman"/>
-          <w:sz w:val="28"/>
-          <w:szCs w:val="28"/>
-          <w:lang w:eastAsia="ru-RU"/>
-        </w:rPr>
-        <w:lastRenderedPageBreak/>
-        <w:br w:type="page"/>
-      </w:r>
-    </w:p>
-    <w:p>
-      <w:pPr>
-        <w:pStyle w:val="1"/>
-        <w:numPr>
-          <w:ilvl w:val="0"/>
-          <w:numId w:val="4"/>
-        </w:numPr>
-        <w:rPr>
-          <w:rFonts w:eastAsia="Times New Roman"/>
-          <w:lang w:eastAsia="ru-RU"/>
-        </w:rPr>
-      </w:pPr>
-      <w:bookmarkStart w:id="48" w:name="_Toc229829459"/>
-      <w:bookmarkStart w:id="49" w:name="_Toc229829750"/>
-      <w:r>
-        <w:rPr>
-          <w:rFonts w:eastAsia="Times New Roman"/>
-          <w:lang w:eastAsia="ru-RU"/>
-        </w:rPr>
-        <w:lastRenderedPageBreak/>
-        <w:t>Создание плановой документации</w:t>
-      </w:r>
       <w:bookmarkEnd w:id="48"/>
-      <w:bookmarkEnd w:id="49"/>
-    </w:p>
-    <w:p>
-      <w:pPr>
-        <w:spacing w:after="100" w:afterAutospacing="1" w:line="360" w:lineRule="auto"/>
-        <w:ind w:firstLine="709"/>
-        <w:contextualSpacing/>
-        <w:jc w:val="both"/>
-        <w:rPr>
-          <w:rFonts w:ascii="Times New Roman" w:eastAsia="Times New Roman" w:hAnsi="Times New Roman" w:cs="Times New Roman"/>
-          <w:sz w:val="28"/>
-          <w:szCs w:val="28"/>
-          <w:lang w:eastAsia="ru-RU"/>
-        </w:rPr>
-      </w:pPr>
-      <w:r>
-        <w:rPr>
-          <w:rFonts w:ascii="Times New Roman" w:eastAsia="Times New Roman" w:hAnsi="Times New Roman" w:cs="Times New Roman"/>
-          <w:sz w:val="28"/>
-          <w:szCs w:val="28"/>
-          <w:lang w:eastAsia="ru-RU"/>
-        </w:rPr>
-        <w:t xml:space="preserve">Для более подробного описания системы </w:t>
-      </w:r>
-      <w:r>
-        <w:rPr>
-          <w:rFonts w:ascii="Times New Roman" w:eastAsia="Times New Roman" w:hAnsi="Times New Roman" w:cs="Times New Roman"/>
-          <w:sz w:val="28"/>
-          <w:szCs w:val="28"/>
-          <w:lang w:eastAsia="ru-RU"/>
-        </w:rPr>
-        <w:t xml:space="preserve">были составлены с помощью языка </w:t>
-      </w:r>
-      <w:r>
-        <w:rPr>
-          <w:rFonts w:ascii="Times New Roman" w:eastAsia="Times New Roman" w:hAnsi="Times New Roman" w:cs="Times New Roman"/>
-          <w:sz w:val="28"/>
-          <w:szCs w:val="28"/>
-          <w:lang w:val="en-US" w:eastAsia="ru-RU"/>
-        </w:rPr>
-        <w:t>UML</w:t>
-      </w:r>
-      <w:r>
-        <w:rPr>
-          <w:rFonts w:ascii="Times New Roman" w:eastAsia="Times New Roman" w:hAnsi="Times New Roman" w:cs="Times New Roman"/>
-          <w:sz w:val="28"/>
-          <w:szCs w:val="28"/>
-          <w:lang w:eastAsia="ru-RU"/>
-        </w:rPr>
-        <w:t xml:space="preserve"> диаграммы.</w:t>
-      </w:r>
-    </w:p>
-    <w:p>
-      <w:pPr>
-        <w:pStyle w:val="2"/>
-        <w:numPr>
-          <w:ilvl w:val="1"/>
-          <w:numId w:val="4"/>
-        </w:numPr>
-        <w:rPr>
-          <w:rFonts w:eastAsia="Times New Roman"/>
-          <w:lang w:eastAsia="ru-RU"/>
-        </w:rPr>
-      </w:pPr>
-      <w:bookmarkStart w:id="50" w:name="_Toc229829460"/>
-      <w:bookmarkStart w:id="51" w:name="_Toc229829751"/>
-      <w:r>
-        <w:rPr>
-          <w:rFonts w:eastAsia="Times New Roman"/>
-          <w:lang w:eastAsia="ru-RU"/>
-        </w:rPr>
-        <w:t>Диаграмма Использования</w:t>
-      </w:r>
-      <w:bookmarkEnd w:id="50"/>
-      <w:bookmarkEnd w:id="51"/>
     </w:p>
     <w:p>
       <w:pPr>
@@ -23344,25 +21418,7 @@
           <w:sz w:val="28"/>
           <w:szCs w:val="28"/>
         </w:rPr>
-        <w:t>Личный кабинет: содержит основную информацию о пользователе (</w:t>
-      </w:r>
-      <w:proofErr w:type="spellStart"/>
-      <w:r>
-        <w:rPr>
-          <w:rFonts w:ascii="Times New Roman" w:hAnsi="Times New Roman" w:cs="Times New Roman"/>
-          <w:sz w:val="28"/>
-          <w:szCs w:val="28"/>
-        </w:rPr>
-        <w:t>никнейм</w:t>
-      </w:r>
-      <w:proofErr w:type="spellEnd"/>
-      <w:r>
-        <w:rPr>
-          <w:rFonts w:ascii="Times New Roman" w:hAnsi="Times New Roman" w:cs="Times New Roman"/>
-          <w:sz w:val="28"/>
-          <w:szCs w:val="28"/>
-        </w:rPr>
-        <w:t xml:space="preserve"> и статистику)</w:t>
+        <w:t>Личный кабинет: содержит основную информацию о пользователе (никнейм и статистику)</w:t>
       </w:r>
     </w:p>
     <w:p>
@@ -23825,25 +21881,7 @@
           <w:sz w:val="28"/>
           <w:szCs w:val="28"/>
         </w:rPr>
-        <w:t xml:space="preserve">Чтобы начать проходить тестирование необходимо выбрать Режим тестирования и </w:t>
-      </w:r>
-      <w:proofErr w:type="gramStart"/>
-      <w:r>
-        <w:rPr>
-          <w:rFonts w:ascii="Times New Roman" w:hAnsi="Times New Roman" w:cs="Times New Roman"/>
-          <w:sz w:val="28"/>
-          <w:szCs w:val="28"/>
-        </w:rPr>
-        <w:t>Загрузить</w:t>
-      </w:r>
-      <w:proofErr w:type="gramEnd"/>
-      <w:r>
-        <w:rPr>
-          <w:rFonts w:ascii="Times New Roman" w:hAnsi="Times New Roman" w:cs="Times New Roman"/>
-          <w:sz w:val="28"/>
-          <w:szCs w:val="28"/>
-        </w:rPr>
-        <w:t xml:space="preserve"> билеты</w:t>
+        <w:t>Чтобы начать проходить тестирование необходимо выбрать Режим тестирования и Загрузить билеты</w:t>
       </w:r>
     </w:p>
     <w:p>
@@ -24017,13 +22055,13 @@
           <w:numId w:val="10"/>
         </w:numPr>
       </w:pPr>
-      <w:bookmarkStart w:id="52" w:name="_Toc229829461"/>
-      <w:bookmarkStart w:id="53" w:name="_Toc229829752"/>
+      <w:bookmarkStart w:id="49" w:name="_Toc229829461"/>
+      <w:bookmarkStart w:id="50" w:name="_Toc229829752"/>
       <w:r>
         <w:t>Диаграмма классов</w:t>
       </w:r>
-      <w:bookmarkEnd w:id="52"/>
-      <w:bookmarkEnd w:id="53"/>
+      <w:bookmarkEnd w:id="49"/>
+      <w:bookmarkEnd w:id="50"/>
     </w:p>
     <w:p>
       <w:pPr>
@@ -24062,13 +22100,13 @@
         </w:numPr>
         <w:ind w:left="1418"/>
       </w:pPr>
-      <w:bookmarkStart w:id="54" w:name="_Toc229829462"/>
-      <w:bookmarkStart w:id="55" w:name="_Toc229829753"/>
+      <w:bookmarkStart w:id="51" w:name="_Toc229829462"/>
+      <w:bookmarkStart w:id="52" w:name="_Toc229829753"/>
       <w:r>
         <w:t>Гость и ограниченный доступ</w:t>
       </w:r>
-      <w:bookmarkEnd w:id="54"/>
-      <w:bookmarkEnd w:id="55"/>
+      <w:bookmarkEnd w:id="51"/>
+      <w:bookmarkEnd w:id="52"/>
     </w:p>
     <w:p>
       <w:pPr>
@@ -24116,13 +22154,13 @@
         </w:numPr>
         <w:ind w:left="1418"/>
       </w:pPr>
-      <w:bookmarkStart w:id="56" w:name="_Toc229829463"/>
-      <w:bookmarkStart w:id="57" w:name="_Toc229829754"/>
+      <w:bookmarkStart w:id="53" w:name="_Toc229829463"/>
+      <w:bookmarkStart w:id="54" w:name="_Toc229829754"/>
       <w:r>
         <w:t>Зарегистрированный пользователь: полный цикл тестирования</w:t>
       </w:r>
-      <w:bookmarkEnd w:id="56"/>
-      <w:bookmarkEnd w:id="57"/>
+      <w:bookmarkEnd w:id="53"/>
+      <w:bookmarkEnd w:id="54"/>
     </w:p>
     <w:p>
       <w:pPr>
@@ -24521,13 +22559,13 @@
         </w:numPr>
         <w:ind w:left="1418"/>
       </w:pPr>
-      <w:bookmarkStart w:id="58" w:name="_Toc229829464"/>
-      <w:bookmarkStart w:id="59" w:name="_Toc229829755"/>
+      <w:bookmarkStart w:id="55" w:name="_Toc229829464"/>
+      <w:bookmarkStart w:id="56" w:name="_Toc229829755"/>
       <w:r>
         <w:t>Администратор: управление контентом</w:t>
       </w:r>
-      <w:bookmarkEnd w:id="58"/>
-      <w:bookmarkEnd w:id="59"/>
+      <w:bookmarkEnd w:id="55"/>
+      <w:bookmarkEnd w:id="56"/>
     </w:p>
     <w:p>
       <w:pPr>
@@ -24762,13 +22800,13 @@
           <w:numId w:val="10"/>
         </w:numPr>
       </w:pPr>
-      <w:bookmarkStart w:id="60" w:name="_Toc229829465"/>
-      <w:bookmarkStart w:id="61" w:name="_Toc229829756"/>
+      <w:bookmarkStart w:id="57" w:name="_Toc229829465"/>
+      <w:bookmarkStart w:id="58" w:name="_Toc229829756"/>
       <w:r>
         <w:t>Связи между процессами</w:t>
       </w:r>
-      <w:bookmarkEnd w:id="60"/>
-      <w:bookmarkEnd w:id="61"/>
+      <w:bookmarkEnd w:id="57"/>
+      <w:bookmarkEnd w:id="58"/>
     </w:p>
     <w:p>
       <w:pPr>
@@ -25007,13 +23045,13 @@
           <w:numId w:val="10"/>
         </w:numPr>
       </w:pPr>
-      <w:bookmarkStart w:id="62" w:name="_Toc229829466"/>
-      <w:bookmarkStart w:id="63" w:name="_Toc229829757"/>
+      <w:bookmarkStart w:id="59" w:name="_Toc229829466"/>
+      <w:bookmarkStart w:id="60" w:name="_Toc229829757"/>
       <w:r>
         <w:t>Диаграмма компонентов</w:t>
       </w:r>
-      <w:bookmarkEnd w:id="62"/>
-      <w:bookmarkEnd w:id="63"/>
+      <w:bookmarkEnd w:id="59"/>
+      <w:bookmarkEnd w:id="60"/>
     </w:p>
     <w:p>
       <w:pPr>
@@ -25275,13 +23313,13 @@
           <w:numId w:val="10"/>
         </w:numPr>
       </w:pPr>
-      <w:bookmarkStart w:id="64" w:name="_Toc229829467"/>
-      <w:bookmarkStart w:id="65" w:name="_Toc229829758"/>
+      <w:bookmarkStart w:id="61" w:name="_Toc229829467"/>
+      <w:bookmarkStart w:id="62" w:name="_Toc229829758"/>
       <w:r>
         <w:t>Диаграмма развертывания</w:t>
       </w:r>
-      <w:bookmarkEnd w:id="64"/>
-      <w:bookmarkEnd w:id="65"/>
+      <w:bookmarkEnd w:id="61"/>
+      <w:bookmarkEnd w:id="62"/>
     </w:p>
     <w:p>
       <w:pPr>
@@ -25320,13 +23358,13 @@
         </w:numPr>
         <w:ind w:left="1418"/>
       </w:pPr>
-      <w:bookmarkStart w:id="66" w:name="_Toc229829468"/>
-      <w:bookmarkStart w:id="67" w:name="_Toc229829759"/>
+      <w:bookmarkStart w:id="63" w:name="_Toc229829468"/>
+      <w:bookmarkStart w:id="64" w:name="_Toc229829759"/>
       <w:r>
         <w:t>Узлы и устройства</w:t>
       </w:r>
-      <w:bookmarkEnd w:id="66"/>
-      <w:bookmarkEnd w:id="67"/>
+      <w:bookmarkEnd w:id="63"/>
+      <w:bookmarkEnd w:id="64"/>
     </w:p>
     <w:p>
       <w:pPr>
@@ -25429,33 +23467,15 @@
           <w:sz w:val="28"/>
           <w:szCs w:val="28"/>
         </w:rPr>
-        <w:t xml:space="preserve">Оба клиента подключаются к серверной части через </w:t>
-      </w:r>
-      <w:proofErr w:type="spellStart"/>
+        <w:t>Оба клиента подключаются к серверной части через интернет-соед</w:t>
+      </w:r>
       <w:r>
         <w:rPr>
           <w:rFonts w:ascii="Times New Roman" w:hAnsi="Times New Roman" w:cs="Times New Roman"/>
           <w:sz w:val="28"/>
           <w:szCs w:val="28"/>
         </w:rPr>
-        <w:t>интернет-соед</w:t>
-      </w:r>
-      <w:r>
-        <w:rPr>
-          <w:rFonts w:ascii="Times New Roman" w:hAnsi="Times New Roman" w:cs="Times New Roman"/>
-          <w:sz w:val="28"/>
-          <w:szCs w:val="28"/>
-        </w:rPr>
-        <w:t>инение</w:t>
-      </w:r>
-      <w:proofErr w:type="spellEnd"/>
-      <w:r>
-        <w:rPr>
-          <w:rFonts w:ascii="Times New Roman" w:hAnsi="Times New Roman" w:cs="Times New Roman"/>
-          <w:sz w:val="28"/>
-          <w:szCs w:val="28"/>
-        </w:rPr>
-        <w:t xml:space="preserve"> (защищённое соединение).</w:t>
+        <w:t>инение (защищённое соединение).</w:t>
       </w:r>
     </w:p>
     <w:p>
@@ -25535,16 +23555,16 @@
           <w:szCs w:val="24"/>
         </w:rPr>
       </w:pPr>
-      <w:bookmarkStart w:id="68" w:name="_Toc229829469"/>
-      <w:bookmarkStart w:id="69" w:name="_Toc229829760"/>
+      <w:bookmarkStart w:id="65" w:name="_Toc229829469"/>
+      <w:bookmarkStart w:id="66" w:name="_Toc229829760"/>
       <w:r>
         <w:rPr>
           <w:rStyle w:val="30"/>
         </w:rPr>
         <w:t>Сервисы, размещённые на серверном узле</w:t>
       </w:r>
-      <w:bookmarkEnd w:id="68"/>
-      <w:bookmarkEnd w:id="69"/>
+      <w:bookmarkEnd w:id="65"/>
+      <w:bookmarkEnd w:id="66"/>
     </w:p>
     <w:p>
       <w:pPr>
@@ -25842,13 +23862,13 @@
           <w:numId w:val="10"/>
         </w:numPr>
       </w:pPr>
-      <w:bookmarkStart w:id="70" w:name="_Toc229829470"/>
-      <w:bookmarkStart w:id="71" w:name="_Toc229829761"/>
+      <w:bookmarkStart w:id="67" w:name="_Toc229829470"/>
+      <w:bookmarkStart w:id="68" w:name="_Toc229829761"/>
       <w:r>
         <w:t>Базы данных</w:t>
       </w:r>
-      <w:bookmarkEnd w:id="70"/>
-      <w:bookmarkEnd w:id="71"/>
+      <w:bookmarkEnd w:id="67"/>
+      <w:bookmarkEnd w:id="68"/>
     </w:p>
     <w:p>
       <w:pPr>
@@ -26209,131 +24229,361 @@
           <w:lang w:eastAsia="ru-RU"/>
         </w:rPr>
       </w:pPr>
-      <w:bookmarkStart w:id="72" w:name="_Toc229829471"/>
-      <w:bookmarkStart w:id="73" w:name="_Toc229829762"/>
+      <w:bookmarkStart w:id="69" w:name="_Toc229829471"/>
+      <w:bookmarkStart w:id="70" w:name="_Toc229829762"/>
       <w:r>
         <w:rPr>
           <w:rFonts w:eastAsia="Times New Roman"/>
+          <w:lang w:eastAsia="ru-RU"/>
+        </w:rPr>
+        <w:lastRenderedPageBreak/>
+        <w:t>Создание и организация базы данных сервиса</w:t>
+      </w:r>
+      <w:r>
+        <w:rPr>
+          <w:rFonts w:eastAsia="Times New Roman"/>
+          <w:lang w:eastAsia="ru-RU"/>
+        </w:rPr>
+        <w:t>.</w:t>
+      </w:r>
+      <w:bookmarkEnd w:id="69"/>
+      <w:bookmarkEnd w:id="70"/>
+    </w:p>
+    <w:p>
+      <w:pPr>
+        <w:spacing w:after="100" w:afterAutospacing="1" w:line="360" w:lineRule="auto"/>
+        <w:ind w:firstLine="709"/>
+        <w:contextualSpacing/>
+        <w:jc w:val="both"/>
+        <w:rPr>
+          <w:rFonts w:ascii="Times New Roman" w:eastAsia="Times New Roman" w:hAnsi="Times New Roman" w:cs="Times New Roman"/>
+          <w:sz w:val="28"/>
+          <w:szCs w:val="28"/>
+          <w:lang w:eastAsia="ru-RU"/>
+        </w:rPr>
+      </w:pPr>
+      <w:r>
+        <w:rPr>
+          <w:rFonts w:ascii="Times New Roman" w:eastAsia="Times New Roman" w:hAnsi="Times New Roman" w:cs="Times New Roman"/>
+          <w:sz w:val="28"/>
+          <w:szCs w:val="28"/>
+          <w:lang w:eastAsia="ru-RU"/>
+        </w:rPr>
+        <w:t>На основе изученной предметной области для сервиса была разработана база данных.</w:t>
+      </w:r>
+    </w:p>
+    <w:p>
+      <w:pPr>
+        <w:spacing w:after="100" w:afterAutospacing="1" w:line="360" w:lineRule="auto"/>
+        <w:ind w:firstLine="709"/>
+        <w:contextualSpacing/>
+        <w:jc w:val="both"/>
+        <w:rPr>
+          <w:rFonts w:ascii="Times New Roman" w:eastAsia="Times New Roman" w:hAnsi="Times New Roman" w:cs="Times New Roman"/>
+          <w:sz w:val="28"/>
+          <w:szCs w:val="28"/>
+          <w:lang w:eastAsia="ru-RU"/>
+        </w:rPr>
+      </w:pPr>
+      <w:r>
+        <w:rPr>
+          <w:rFonts w:ascii="Times New Roman" w:eastAsia="Times New Roman" w:hAnsi="Times New Roman" w:cs="Times New Roman"/>
+          <w:sz w:val="28"/>
+          <w:szCs w:val="28"/>
+          <w:lang w:eastAsia="ru-RU"/>
+        </w:rPr>
+        <w:t xml:space="preserve">Для успешной разработки и наглядного представления базы данных (бд) была создана </w:t>
+      </w:r>
+      <w:r>
+        <w:rPr>
+          <w:rFonts w:ascii="Times New Roman" w:eastAsia="Times New Roman" w:hAnsi="Times New Roman" w:cs="Times New Roman"/>
+          <w:sz w:val="28"/>
+          <w:szCs w:val="28"/>
+          <w:lang w:val="en-US" w:eastAsia="ru-RU"/>
+        </w:rPr>
+        <w:t>ER</w:t>
+      </w:r>
+      <w:r>
+        <w:rPr>
+          <w:rFonts w:ascii="Times New Roman" w:eastAsia="Times New Roman" w:hAnsi="Times New Roman" w:cs="Times New Roman"/>
+          <w:sz w:val="28"/>
+          <w:szCs w:val="28"/>
+          <w:lang w:eastAsia="ru-RU"/>
+        </w:rPr>
+        <w:t>-диаграмма.</w:t>
+      </w:r>
+    </w:p>
+    <w:p>
+      <w:pPr>
+        <w:spacing w:after="100" w:afterAutospacing="1" w:line="360" w:lineRule="auto"/>
+        <w:ind w:firstLine="709"/>
+        <w:contextualSpacing/>
+        <w:jc w:val="center"/>
+        <w:rPr>
+          <w:rFonts w:ascii="Times New Roman" w:eastAsia="Times New Roman" w:hAnsi="Times New Roman" w:cs="Times New Roman"/>
+          <w:sz w:val="28"/>
+          <w:szCs w:val="28"/>
+          <w:lang w:eastAsia="ru-RU"/>
+        </w:rPr>
+      </w:pPr>
+      <w:r>
+        <w:rPr>
+          <w:rFonts w:ascii="Times New Roman" w:eastAsia="Times New Roman" w:hAnsi="Times New Roman" w:cs="Times New Roman"/>
+          <w:sz w:val="28"/>
+          <w:szCs w:val="28"/>
+          <w:lang w:eastAsia="ru-RU"/>
+        </w:rPr>
+        <w:drawing>
+          <wp:inline distT="0" distB="0" distL="0" distR="0" wp14:anchorId="4C4FA6DD" wp14:editId="7D53E32E">
+            <wp:extent cx="5939790" cy="4589780"/>
+            <wp:effectExtent l="0" t="0" r="3810" b="1270"/>
+            <wp:docPr id="4" name="Рисунок 4"/>
+            <wp:cNvGraphicFramePr>
+              <a:graphicFrameLocks xmlns:a="http://schemas.openxmlformats.org/drawingml/2006/main" noChangeAspect="1"/>
+            </wp:cNvGraphicFramePr>
+            <a:graphic xmlns:a="http://schemas.openxmlformats.org/drawingml/2006/main">
+              <a:graphicData uri="http://schemas.openxmlformats.org/drawingml/2006/picture">
+                <pic:pic xmlns:pic="http://schemas.openxmlformats.org/drawingml/2006/picture">
+                  <pic:nvPicPr>
+                    <pic:cNvPr id="1" name=""/>
+                    <pic:cNvPicPr/>
+                  </pic:nvPicPr>
+                  <pic:blipFill>
+                    <a:blip r:embed="rId12"/>
+                    <a:stretch>
+                      <a:fillRect/>
+                    </a:stretch>
+                  </pic:blipFill>
+                  <pic:spPr>
+                    <a:xfrm>
+                      <a:off x="0" y="0"/>
+                      <a:ext cx="5939790" cy="4589780"/>
+                    </a:xfrm>
+                    <a:prstGeom prst="rect">
+                      <a:avLst/>
+                    </a:prstGeom>
+                  </pic:spPr>
+                </pic:pic>
+              </a:graphicData>
+            </a:graphic>
+          </wp:inline>
+        </w:drawing>
+      </w:r>
+    </w:p>
+    <w:p>
+      <w:pPr>
+        <w:spacing w:after="100" w:afterAutospacing="1" w:line="360" w:lineRule="auto"/>
+        <w:ind w:firstLine="709"/>
+        <w:contextualSpacing/>
+        <w:jc w:val="center"/>
+        <w:rPr>
+          <w:rFonts w:ascii="Times New Roman" w:eastAsia="Times New Roman" w:hAnsi="Times New Roman" w:cs="Times New Roman"/>
+          <w:sz w:val="28"/>
+          <w:szCs w:val="28"/>
+          <w:lang w:eastAsia="ru-RU"/>
+        </w:rPr>
+      </w:pPr>
+      <w:r>
+        <w:rPr>
+          <w:rFonts w:ascii="Times New Roman" w:eastAsia="Times New Roman" w:hAnsi="Times New Roman" w:cs="Times New Roman"/>
+          <w:sz w:val="28"/>
+          <w:szCs w:val="28"/>
+          <w:lang w:eastAsia="ru-RU"/>
+        </w:rPr>
+        <w:t xml:space="preserve">Рисунок 5 – </w:t>
+      </w:r>
+      <w:r>
+        <w:rPr>
+          <w:rFonts w:ascii="Times New Roman" w:eastAsia="Times New Roman" w:hAnsi="Times New Roman" w:cs="Times New Roman"/>
+          <w:sz w:val="28"/>
+          <w:szCs w:val="28"/>
+          <w:lang w:val="en-US" w:eastAsia="ru-RU"/>
+        </w:rPr>
+        <w:t>ER</w:t>
+      </w:r>
+      <w:r>
+        <w:rPr>
+          <w:rFonts w:ascii="Times New Roman" w:eastAsia="Times New Roman" w:hAnsi="Times New Roman" w:cs="Times New Roman"/>
+          <w:sz w:val="28"/>
+          <w:szCs w:val="28"/>
+          <w:lang w:eastAsia="ru-RU"/>
+        </w:rPr>
+        <w:t>-</w:t>
+      </w:r>
+      <w:r>
+        <w:rPr>
+          <w:rFonts w:ascii="Times New Roman" w:eastAsia="Times New Roman" w:hAnsi="Times New Roman" w:cs="Times New Roman"/>
+          <w:sz w:val="28"/>
+          <w:szCs w:val="28"/>
+          <w:lang w:eastAsia="ru-RU"/>
+        </w:rPr>
+        <w:t>диаграмма бд.</w:t>
+      </w:r>
+    </w:p>
+    <w:p>
+      <w:pPr>
+        <w:spacing w:after="100" w:afterAutospacing="1" w:line="360" w:lineRule="auto"/>
+        <w:ind w:firstLine="709"/>
+        <w:contextualSpacing/>
+        <w:jc w:val="both"/>
+        <w:rPr>
+          <w:rFonts w:ascii="Times New Roman" w:eastAsia="Times New Roman" w:hAnsi="Times New Roman" w:cs="Times New Roman"/>
+          <w:sz w:val="28"/>
+          <w:szCs w:val="28"/>
+          <w:lang w:eastAsia="ru-RU"/>
+        </w:rPr>
+      </w:pPr>
+      <w:r>
+        <w:rPr>
+          <w:rFonts w:ascii="Times New Roman" w:eastAsia="Times New Roman" w:hAnsi="Times New Roman" w:cs="Times New Roman"/>
+          <w:sz w:val="28"/>
+          <w:szCs w:val="28"/>
+          <w:lang w:eastAsia="ru-RU"/>
+        </w:rPr>
+        <w:t xml:space="preserve">На основе предоставленной диаграммы на сервере </w:t>
+      </w:r>
+      <w:r>
+        <w:rPr>
+          <w:rFonts w:ascii="Times New Roman" w:eastAsia="Times New Roman" w:hAnsi="Times New Roman" w:cs="Times New Roman"/>
+          <w:sz w:val="28"/>
+          <w:szCs w:val="28"/>
+          <w:lang w:val="en-US" w:eastAsia="ru-RU"/>
+        </w:rPr>
+        <w:t>Django</w:t>
+      </w:r>
+      <w:r>
+        <w:rPr>
+          <w:rFonts w:ascii="Times New Roman" w:eastAsia="Times New Roman" w:hAnsi="Times New Roman" w:cs="Times New Roman"/>
+          <w:sz w:val="28"/>
+          <w:szCs w:val="28"/>
+          <w:lang w:eastAsia="ru-RU"/>
+        </w:rPr>
+        <w:t xml:space="preserve"> </w:t>
+      </w:r>
+      <w:r>
+        <w:rPr>
+          <w:rFonts w:ascii="Times New Roman" w:eastAsia="Times New Roman" w:hAnsi="Times New Roman" w:cs="Times New Roman"/>
+          <w:sz w:val="28"/>
+          <w:szCs w:val="28"/>
+          <w:lang w:eastAsia="ru-RU"/>
+        </w:rPr>
+        <w:t>были созданы сущности (модели).</w:t>
+      </w:r>
+      <w:bookmarkStart w:id="71" w:name="_GoBack"/>
+      <w:bookmarkEnd w:id="71"/>
+    </w:p>
+    <w:p>
+      <w:pPr>
+        <w:spacing w:after="100" w:afterAutospacing="1" w:line="360" w:lineRule="auto"/>
+        <w:ind w:firstLine="709"/>
+        <w:contextualSpacing/>
+        <w:jc w:val="both"/>
+        <w:rPr>
+          <w:rFonts w:ascii="Times New Roman" w:eastAsia="Times New Roman" w:hAnsi="Times New Roman" w:cs="Times New Roman"/>
+          <w:sz w:val="28"/>
+          <w:szCs w:val="28"/>
+          <w:lang w:eastAsia="ru-RU"/>
+        </w:rPr>
+      </w:pPr>
+    </w:p>
+    <w:p>
+      <w:pPr>
+        <w:spacing w:after="100" w:afterAutospacing="1" w:line="360" w:lineRule="auto"/>
+        <w:ind w:firstLine="709"/>
+        <w:contextualSpacing/>
+        <w:jc w:val="both"/>
+        <w:rPr>
+          <w:rFonts w:ascii="Times New Roman" w:eastAsia="Times New Roman" w:hAnsi="Times New Roman" w:cs="Times New Roman"/>
+          <w:sz w:val="28"/>
+          <w:szCs w:val="28"/>
+          <w:lang w:eastAsia="ru-RU"/>
+        </w:rPr>
+      </w:pPr>
+      <w:r>
+        <w:rPr>
+          <w:rFonts w:ascii="Times New Roman" w:eastAsia="Times New Roman" w:hAnsi="Times New Roman" w:cs="Times New Roman"/>
+          <w:sz w:val="28"/>
+          <w:szCs w:val="28"/>
           <w:highlight w:val="yellow"/>
           <w:lang w:eastAsia="ru-RU"/>
         </w:rPr>
+        <w:t>Описание что делали индивидуально</w:t>
+      </w:r>
+    </w:p>
+    <w:p>
+      <w:pPr>
+        <w:spacing w:after="100" w:afterAutospacing="1" w:line="360" w:lineRule="auto"/>
+        <w:ind w:firstLine="709"/>
+        <w:contextualSpacing/>
+        <w:jc w:val="both"/>
+        <w:rPr>
+          <w:rFonts w:ascii="Times New Roman" w:eastAsia="Times New Roman" w:hAnsi="Times New Roman" w:cs="Times New Roman"/>
+          <w:sz w:val="28"/>
+          <w:szCs w:val="28"/>
+          <w:lang w:eastAsia="ru-RU"/>
+        </w:rPr>
+      </w:pPr>
+    </w:p>
+    <w:p>
+      <w:pPr>
+        <w:spacing w:after="100" w:afterAutospacing="1" w:line="360" w:lineRule="auto"/>
+        <w:ind w:firstLine="709"/>
+        <w:contextualSpacing/>
+        <w:jc w:val="both"/>
+        <w:rPr>
+          <w:rFonts w:ascii="Times New Roman" w:eastAsia="Times New Roman" w:hAnsi="Times New Roman" w:cs="Times New Roman"/>
+          <w:sz w:val="28"/>
+          <w:szCs w:val="28"/>
+          <w:lang w:eastAsia="ru-RU"/>
+        </w:rPr>
+      </w:pPr>
+    </w:p>
+    <w:p>
+      <w:pPr>
+        <w:spacing w:after="100" w:afterAutospacing="1" w:line="360" w:lineRule="auto"/>
+        <w:ind w:firstLine="709"/>
+        <w:contextualSpacing/>
+        <w:jc w:val="both"/>
+        <w:rPr>
+          <w:rFonts w:ascii="Times New Roman" w:eastAsia="Times New Roman" w:hAnsi="Times New Roman" w:cs="Times New Roman"/>
+          <w:sz w:val="28"/>
+          <w:szCs w:val="28"/>
+          <w:lang w:eastAsia="ru-RU"/>
+        </w:rPr>
+      </w:pPr>
+    </w:p>
+    <w:p>
+      <w:pPr>
+        <w:spacing w:after="100" w:afterAutospacing="1" w:line="360" w:lineRule="auto"/>
+        <w:ind w:firstLine="709"/>
+        <w:contextualSpacing/>
+        <w:jc w:val="both"/>
+        <w:rPr>
+          <w:rFonts w:ascii="Times New Roman" w:eastAsia="Times New Roman" w:hAnsi="Times New Roman" w:cs="Times New Roman"/>
+          <w:sz w:val="28"/>
+          <w:szCs w:val="28"/>
+          <w:lang w:eastAsia="ru-RU"/>
+        </w:rPr>
+      </w:pPr>
+    </w:p>
+    <w:p>
+      <w:pPr>
+        <w:spacing w:after="160" w:line="259" w:lineRule="auto"/>
+        <w:rPr>
+          <w:rFonts w:ascii="Times New Roman" w:eastAsia="Times New Roman" w:hAnsi="Times New Roman" w:cs="Times New Roman"/>
+          <w:sz w:val="28"/>
+          <w:szCs w:val="28"/>
+          <w:lang w:eastAsia="ru-RU"/>
+        </w:rPr>
+      </w:pPr>
+      <w:r>
+        <w:rPr>
+          <w:rFonts w:ascii="Times New Roman" w:eastAsia="Times New Roman" w:hAnsi="Times New Roman" w:cs="Times New Roman"/>
+          <w:sz w:val="28"/>
+          <w:szCs w:val="28"/>
+          <w:lang w:eastAsia="ru-RU"/>
+        </w:rPr>
         <w:lastRenderedPageBreak/>
-        <w:t>Индивидуальные задание и создание индивидуальных диаграмм, разделенных по модулям.</w:t>
-      </w:r>
-      <w:bookmarkEnd w:id="72"/>
-      <w:bookmarkEnd w:id="73"/>
-    </w:p>
-    <w:p>
-      <w:pPr>
-        <w:spacing w:after="100" w:afterAutospacing="1" w:line="360" w:lineRule="auto"/>
-        <w:ind w:firstLine="709"/>
-        <w:contextualSpacing/>
-        <w:jc w:val="both"/>
-        <w:rPr>
-          <w:rFonts w:ascii="Times New Roman" w:eastAsia="Times New Roman" w:hAnsi="Times New Roman" w:cs="Times New Roman"/>
-          <w:sz w:val="28"/>
-          <w:szCs w:val="28"/>
-          <w:lang w:eastAsia="ru-RU"/>
-        </w:rPr>
-      </w:pPr>
-    </w:p>
-    <w:p>
-      <w:pPr>
-        <w:spacing w:after="100" w:afterAutospacing="1" w:line="360" w:lineRule="auto"/>
-        <w:ind w:firstLine="709"/>
-        <w:contextualSpacing/>
-        <w:jc w:val="both"/>
-        <w:rPr>
-          <w:rFonts w:ascii="Times New Roman" w:eastAsia="Times New Roman" w:hAnsi="Times New Roman" w:cs="Times New Roman"/>
-          <w:sz w:val="28"/>
-          <w:szCs w:val="28"/>
-          <w:lang w:eastAsia="ru-RU"/>
-        </w:rPr>
-      </w:pPr>
-      <w:r>
-        <w:rPr>
-          <w:rFonts w:ascii="Times New Roman" w:eastAsia="Times New Roman" w:hAnsi="Times New Roman" w:cs="Times New Roman"/>
-          <w:sz w:val="28"/>
-          <w:szCs w:val="28"/>
-          <w:highlight w:val="yellow"/>
-          <w:lang w:eastAsia="ru-RU"/>
-        </w:rPr>
-        <w:t>Описание что делали индивидуально</w:t>
-      </w:r>
-    </w:p>
-    <w:p>
-      <w:pPr>
-        <w:spacing w:after="100" w:afterAutospacing="1" w:line="360" w:lineRule="auto"/>
-        <w:ind w:firstLine="709"/>
-        <w:contextualSpacing/>
-        <w:jc w:val="both"/>
-        <w:rPr>
-          <w:rFonts w:ascii="Times New Roman" w:eastAsia="Times New Roman" w:hAnsi="Times New Roman" w:cs="Times New Roman"/>
-          <w:sz w:val="28"/>
-          <w:szCs w:val="28"/>
-          <w:lang w:eastAsia="ru-RU"/>
-        </w:rPr>
-      </w:pPr>
-    </w:p>
-    <w:p>
-      <w:pPr>
-        <w:spacing w:after="100" w:afterAutospacing="1" w:line="360" w:lineRule="auto"/>
-        <w:ind w:firstLine="709"/>
-        <w:contextualSpacing/>
-        <w:jc w:val="both"/>
-        <w:rPr>
-          <w:rFonts w:ascii="Times New Roman" w:eastAsia="Times New Roman" w:hAnsi="Times New Roman" w:cs="Times New Roman"/>
-          <w:sz w:val="28"/>
-          <w:szCs w:val="28"/>
-          <w:lang w:eastAsia="ru-RU"/>
-        </w:rPr>
-      </w:pPr>
-    </w:p>
-    <w:p>
-      <w:pPr>
-        <w:spacing w:after="100" w:afterAutospacing="1" w:line="360" w:lineRule="auto"/>
-        <w:ind w:firstLine="709"/>
-        <w:contextualSpacing/>
-        <w:jc w:val="both"/>
-        <w:rPr>
-          <w:rFonts w:ascii="Times New Roman" w:eastAsia="Times New Roman" w:hAnsi="Times New Roman" w:cs="Times New Roman"/>
-          <w:sz w:val="28"/>
-          <w:szCs w:val="28"/>
-          <w:lang w:eastAsia="ru-RU"/>
-        </w:rPr>
-      </w:pPr>
-    </w:p>
-    <w:p>
-      <w:pPr>
-        <w:spacing w:after="100" w:afterAutospacing="1" w:line="360" w:lineRule="auto"/>
-        <w:ind w:firstLine="709"/>
-        <w:contextualSpacing/>
-        <w:jc w:val="both"/>
-        <w:rPr>
-          <w:rFonts w:ascii="Times New Roman" w:eastAsia="Times New Roman" w:hAnsi="Times New Roman" w:cs="Times New Roman"/>
-          <w:sz w:val="28"/>
-          <w:szCs w:val="28"/>
-          <w:lang w:eastAsia="ru-RU"/>
-        </w:rPr>
-      </w:pPr>
-    </w:p>
-    <w:p>
-      <w:pPr>
-        <w:spacing w:after="160" w:line="259" w:lineRule="auto"/>
-        <w:rPr>
-          <w:rFonts w:ascii="Times New Roman" w:eastAsia="Times New Roman" w:hAnsi="Times New Roman" w:cs="Times New Roman"/>
-          <w:sz w:val="28"/>
-          <w:szCs w:val="28"/>
-          <w:lang w:eastAsia="ru-RU"/>
-        </w:rPr>
-      </w:pPr>
-      <w:r>
-        <w:rPr>
-          <w:rFonts w:ascii="Times New Roman" w:eastAsia="Times New Roman" w:hAnsi="Times New Roman" w:cs="Times New Roman"/>
-          <w:sz w:val="28"/>
-          <w:szCs w:val="28"/>
-          <w:lang w:eastAsia="ru-RU"/>
-        </w:rPr>
         <w:br w:type="page"/>
       </w:r>
     </w:p>
@@ -26350,8 +24600,8 @@
           <w:lang w:eastAsia="ru-RU"/>
         </w:rPr>
       </w:pPr>
-      <w:bookmarkStart w:id="74" w:name="_Toc229829472"/>
-      <w:bookmarkStart w:id="75" w:name="_Toc229829763"/>
+      <w:bookmarkStart w:id="72" w:name="_Toc229829472"/>
+      <w:bookmarkStart w:id="73" w:name="_Toc229829763"/>
       <w:r>
         <w:rPr>
           <w:rFonts w:eastAsia="Times New Roman"/>
@@ -26361,8 +24611,8 @@
         <w:lastRenderedPageBreak/>
         <w:t>Тестирование</w:t>
       </w:r>
-      <w:bookmarkEnd w:id="74"/>
-      <w:bookmarkEnd w:id="75"/>
+      <w:bookmarkEnd w:id="72"/>
+      <w:bookmarkEnd w:id="73"/>
     </w:p>
     <w:p>
       <w:pPr>
@@ -26477,8 +24727,8 @@
           <w:lang w:eastAsia="ru-RU"/>
         </w:rPr>
       </w:pPr>
-      <w:bookmarkStart w:id="76" w:name="_Toc229829473"/>
-      <w:bookmarkStart w:id="77" w:name="_Toc229829764"/>
+      <w:bookmarkStart w:id="74" w:name="_Toc229829473"/>
+      <w:bookmarkStart w:id="75" w:name="_Toc229829764"/>
       <w:r>
         <w:rPr>
           <w:rFonts w:eastAsia="Times New Roman"/>
@@ -26488,6 +24738,115 @@
         <w:lastRenderedPageBreak/>
         <w:t>Описание организации реализации проекта</w:t>
       </w:r>
+      <w:bookmarkEnd w:id="74"/>
+      <w:bookmarkEnd w:id="75"/>
+    </w:p>
+    <w:p>
+      <w:pPr>
+        <w:spacing w:after="100" w:afterAutospacing="1" w:line="360" w:lineRule="auto"/>
+        <w:ind w:firstLine="709"/>
+        <w:contextualSpacing/>
+        <w:jc w:val="both"/>
+        <w:rPr>
+          <w:rFonts w:ascii="Times New Roman" w:eastAsia="Times New Roman" w:hAnsi="Times New Roman" w:cs="Times New Roman"/>
+          <w:sz w:val="28"/>
+          <w:szCs w:val="28"/>
+          <w:lang w:eastAsia="ru-RU"/>
+        </w:rPr>
+      </w:pPr>
+      <w:r>
+        <w:rPr>
+          <w:rFonts w:ascii="Times New Roman" w:eastAsia="Times New Roman" w:hAnsi="Times New Roman" w:cs="Times New Roman"/>
+          <w:sz w:val="28"/>
+          <w:szCs w:val="28"/>
+          <w:highlight w:val="yellow"/>
+          <w:lang w:eastAsia="ru-RU"/>
+        </w:rPr>
+        <w:t>Про канбан</w:t>
+      </w:r>
+    </w:p>
+    <w:p>
+      <w:pPr>
+        <w:spacing w:after="100" w:afterAutospacing="1" w:line="360" w:lineRule="auto"/>
+        <w:ind w:firstLine="709"/>
+        <w:contextualSpacing/>
+        <w:jc w:val="both"/>
+        <w:rPr>
+          <w:rFonts w:ascii="Times New Roman" w:eastAsia="Times New Roman" w:hAnsi="Times New Roman" w:cs="Times New Roman"/>
+          <w:sz w:val="28"/>
+          <w:szCs w:val="28"/>
+          <w:lang w:eastAsia="ru-RU"/>
+        </w:rPr>
+      </w:pPr>
+    </w:p>
+    <w:p>
+      <w:pPr>
+        <w:spacing w:after="100" w:afterAutospacing="1" w:line="360" w:lineRule="auto"/>
+        <w:ind w:firstLine="709"/>
+        <w:contextualSpacing/>
+        <w:jc w:val="both"/>
+        <w:rPr>
+          <w:rFonts w:ascii="Times New Roman" w:eastAsia="Times New Roman" w:hAnsi="Times New Roman" w:cs="Times New Roman"/>
+          <w:sz w:val="28"/>
+          <w:szCs w:val="28"/>
+          <w:lang w:eastAsia="ru-RU"/>
+        </w:rPr>
+      </w:pPr>
+    </w:p>
+    <w:p>
+      <w:pPr>
+        <w:spacing w:after="100" w:afterAutospacing="1" w:line="360" w:lineRule="auto"/>
+        <w:ind w:firstLine="709"/>
+        <w:contextualSpacing/>
+        <w:jc w:val="both"/>
+        <w:rPr>
+          <w:rFonts w:ascii="Times New Roman" w:eastAsia="Times New Roman" w:hAnsi="Times New Roman" w:cs="Times New Roman"/>
+          <w:sz w:val="28"/>
+          <w:szCs w:val="28"/>
+          <w:lang w:eastAsia="ru-RU"/>
+        </w:rPr>
+      </w:pPr>
+    </w:p>
+    <w:p>
+      <w:pPr>
+        <w:spacing w:after="160" w:line="259" w:lineRule="auto"/>
+        <w:rPr>
+          <w:rFonts w:ascii="Times New Roman" w:eastAsia="Times New Roman" w:hAnsi="Times New Roman" w:cs="Times New Roman"/>
+          <w:sz w:val="28"/>
+          <w:szCs w:val="28"/>
+          <w:lang w:eastAsia="ru-RU"/>
+        </w:rPr>
+      </w:pPr>
+      <w:r>
+        <w:rPr>
+          <w:rFonts w:ascii="Times New Roman" w:eastAsia="Times New Roman" w:hAnsi="Times New Roman" w:cs="Times New Roman"/>
+          <w:sz w:val="28"/>
+          <w:szCs w:val="28"/>
+          <w:lang w:eastAsia="ru-RU"/>
+        </w:rPr>
+        <w:br w:type="page"/>
+      </w:r>
+    </w:p>
+    <w:p>
+      <w:pPr>
+        <w:pStyle w:val="1"/>
+        <w:rPr>
+          <w:rFonts w:eastAsia="Times New Roman"/>
+          <w:highlight w:val="yellow"/>
+          <w:lang w:eastAsia="ru-RU"/>
+        </w:rPr>
+      </w:pPr>
+      <w:bookmarkStart w:id="76" w:name="_Toc229829474"/>
+      <w:bookmarkStart w:id="77" w:name="_Toc229829765"/>
+      <w:r>
+        <w:rPr>
+          <w:rFonts w:eastAsia="Times New Roman"/>
+          <w:highlight w:val="yellow"/>
+          <w:lang w:eastAsia="ru-RU"/>
+        </w:rPr>
+        <w:lastRenderedPageBreak/>
+        <w:t>Заключение</w:t>
+      </w:r>
       <w:bookmarkEnd w:id="76"/>
       <w:bookmarkEnd w:id="77"/>
     </w:p>
@@ -26501,127 +24860,6 @@
           <w:rFonts w:ascii="Times New Roman" w:eastAsia="Times New Roman" w:hAnsi="Times New Roman" w:cs="Times New Roman"/>
           <w:sz w:val="28"/>
           <w:szCs w:val="28"/>
-          <w:lang w:eastAsia="ru-RU"/>
-        </w:rPr>
-      </w:pPr>
-      <w:r>
-        <w:rPr>
-          <w:rFonts w:ascii="Times New Roman" w:eastAsia="Times New Roman" w:hAnsi="Times New Roman" w:cs="Times New Roman"/>
-          <w:sz w:val="28"/>
-          <w:szCs w:val="28"/>
-          <w:highlight w:val="yellow"/>
-          <w:lang w:eastAsia="ru-RU"/>
-        </w:rPr>
-        <w:t xml:space="preserve">Про </w:t>
-      </w:r>
-      <w:proofErr w:type="spellStart"/>
-      <w:r>
-        <w:rPr>
-          <w:rFonts w:ascii="Times New Roman" w:eastAsia="Times New Roman" w:hAnsi="Times New Roman" w:cs="Times New Roman"/>
-          <w:sz w:val="28"/>
-          <w:szCs w:val="28"/>
-          <w:highlight w:val="yellow"/>
-          <w:lang w:eastAsia="ru-RU"/>
-        </w:rPr>
-        <w:t>канбан</w:t>
-      </w:r>
-      <w:proofErr w:type="spellEnd"/>
-    </w:p>
-    <w:p>
-      <w:pPr>
-        <w:spacing w:after="100" w:afterAutospacing="1" w:line="360" w:lineRule="auto"/>
-        <w:ind w:firstLine="709"/>
-        <w:contextualSpacing/>
-        <w:jc w:val="both"/>
-        <w:rPr>
-          <w:rFonts w:ascii="Times New Roman" w:eastAsia="Times New Roman" w:hAnsi="Times New Roman" w:cs="Times New Roman"/>
-          <w:sz w:val="28"/>
-          <w:szCs w:val="28"/>
-          <w:lang w:eastAsia="ru-RU"/>
-        </w:rPr>
-      </w:pPr>
-    </w:p>
-    <w:p>
-      <w:pPr>
-        <w:spacing w:after="100" w:afterAutospacing="1" w:line="360" w:lineRule="auto"/>
-        <w:ind w:firstLine="709"/>
-        <w:contextualSpacing/>
-        <w:jc w:val="both"/>
-        <w:rPr>
-          <w:rFonts w:ascii="Times New Roman" w:eastAsia="Times New Roman" w:hAnsi="Times New Roman" w:cs="Times New Roman"/>
-          <w:sz w:val="28"/>
-          <w:szCs w:val="28"/>
-          <w:lang w:eastAsia="ru-RU"/>
-        </w:rPr>
-      </w:pPr>
-    </w:p>
-    <w:p>
-      <w:pPr>
-        <w:spacing w:after="100" w:afterAutospacing="1" w:line="360" w:lineRule="auto"/>
-        <w:ind w:firstLine="709"/>
-        <w:contextualSpacing/>
-        <w:jc w:val="both"/>
-        <w:rPr>
-          <w:rFonts w:ascii="Times New Roman" w:eastAsia="Times New Roman" w:hAnsi="Times New Roman" w:cs="Times New Roman"/>
-          <w:sz w:val="28"/>
-          <w:szCs w:val="28"/>
-          <w:lang w:eastAsia="ru-RU"/>
-        </w:rPr>
-      </w:pPr>
-    </w:p>
-    <w:p>
-      <w:pPr>
-        <w:spacing w:after="160" w:line="259" w:lineRule="auto"/>
-        <w:rPr>
-          <w:rFonts w:ascii="Times New Roman" w:eastAsia="Times New Roman" w:hAnsi="Times New Roman" w:cs="Times New Roman"/>
-          <w:sz w:val="28"/>
-          <w:szCs w:val="28"/>
-          <w:lang w:eastAsia="ru-RU"/>
-        </w:rPr>
-      </w:pPr>
-      <w:r>
-        <w:rPr>
-          <w:rFonts w:ascii="Times New Roman" w:eastAsia="Times New Roman" w:hAnsi="Times New Roman" w:cs="Times New Roman"/>
-          <w:sz w:val="28"/>
-          <w:szCs w:val="28"/>
-          <w:lang w:eastAsia="ru-RU"/>
-        </w:rPr>
-        <w:br w:type="page"/>
-      </w:r>
-    </w:p>
-    <w:p>
-      <w:pPr>
-        <w:pStyle w:val="1"/>
-        <w:rPr>
-          <w:rFonts w:eastAsia="Times New Roman"/>
-          <w:highlight w:val="yellow"/>
-          <w:lang w:eastAsia="ru-RU"/>
-        </w:rPr>
-      </w:pPr>
-      <w:bookmarkStart w:id="78" w:name="_Toc229829474"/>
-      <w:bookmarkStart w:id="79" w:name="_Toc229829765"/>
-      <w:r>
-        <w:rPr>
-          <w:rFonts w:eastAsia="Times New Roman"/>
-          <w:highlight w:val="yellow"/>
-          <w:lang w:eastAsia="ru-RU"/>
-        </w:rPr>
-        <w:lastRenderedPageBreak/>
-        <w:t>Заключение</w:t>
-      </w:r>
-      <w:bookmarkEnd w:id="78"/>
-      <w:bookmarkEnd w:id="79"/>
-    </w:p>
-    <w:p>
-      <w:pPr>
-        <w:spacing w:after="100" w:afterAutospacing="1" w:line="360" w:lineRule="auto"/>
-        <w:ind w:firstLine="709"/>
-        <w:contextualSpacing/>
-        <w:jc w:val="both"/>
-        <w:rPr>
-          <w:rFonts w:ascii="Times New Roman" w:eastAsia="Times New Roman" w:hAnsi="Times New Roman" w:cs="Times New Roman"/>
-          <w:sz w:val="28"/>
-          <w:szCs w:val="28"/>
           <w:highlight w:val="yellow"/>
           <w:lang w:eastAsia="ru-RU"/>
         </w:rPr>
@@ -26784,7 +25022,7 @@
       </w:pPr>
     </w:p>
     <w:sectPr>
-      <w:footerReference w:type="default" r:id="rId12"/>
+      <w:footerReference w:type="default" r:id="rId13"/>
       <w:pgSz w:w="11906" w:h="16838"/>
       <w:pgMar w:top="1134" w:right="851" w:bottom="1134" w:left="1701" w:header="709" w:footer="709" w:gutter="0"/>
       <w:pgNumType w:start="0"/>
@@ -26850,7 +25088,7 @@
           <w:rPr>
             <w:noProof/>
           </w:rPr>
-          <w:t>22</w:t>
+          <w:t>43</w:t>
         </w:r>
         <w:r>
           <w:fldChar w:fldCharType="end"/>
@@ -30626,7 +28864,7 @@
 </file>
 
 <file path=customXml/itemProps1.xml><?xml version="1.0" encoding="utf-8"?>
-<ds:datastoreItem xmlns:ds="http://schemas.openxmlformats.org/officeDocument/2006/customXml" ds:itemID="{09F4DE16-0EFA-46FB-A6F8-206D37951564}">
+<ds:datastoreItem xmlns:ds="http://schemas.openxmlformats.org/officeDocument/2006/customXml" ds:itemID="{086BB4E2-32D8-49B6-8CC9-08B1B957B823}">
   <ds:schemaRefs>
     <ds:schemaRef ds:uri="http://schemas.openxmlformats.org/officeDocument/2006/bibliography"/>
   </ds:schemaRefs>

</xml_diff>

<commit_message>
modiffied documentation plus roles for modules
</commit_message>
<xml_diff>
--- a/документация/Отчет.docx
+++ b/документация/Отчет.docx
@@ -1618,25 +1618,7 @@
             <w:noProof/>
             <w:lang w:eastAsia="ru-RU"/>
           </w:rPr>
-          <w:t>Модуль «Авторизация и рег</w:t>
-        </w:r>
-        <w:r>
-          <w:rPr>
-            <w:rStyle w:val="a9"/>
-            <w:rFonts w:eastAsia="Times New Roman"/>
-            <w:noProof/>
-            <w:lang w:eastAsia="ru-RU"/>
-          </w:rPr>
-          <w:t>и</w:t>
-        </w:r>
-        <w:r>
-          <w:rPr>
-            <w:rStyle w:val="a9"/>
-            <w:rFonts w:eastAsia="Times New Roman"/>
-            <w:noProof/>
-            <w:lang w:eastAsia="ru-RU"/>
-          </w:rPr>
-          <w:t>страция»</w:t>
+          <w:t>Модуль «Авторизация и регистрация»</w:t>
         </w:r>
         <w:r>
           <w:rPr>
@@ -1816,25 +1798,7 @@
             <w:noProof/>
             <w:lang w:eastAsia="ru-RU"/>
           </w:rPr>
-          <w:t>Распределение</w:t>
-        </w:r>
-        <w:r>
-          <w:rPr>
-            <w:rStyle w:val="a9"/>
-            <w:rFonts w:eastAsia="Times New Roman"/>
-            <w:noProof/>
-            <w:lang w:eastAsia="ru-RU"/>
-          </w:rPr>
-          <w:t xml:space="preserve"> </w:t>
-        </w:r>
-        <w:r>
-          <w:rPr>
-            <w:rStyle w:val="a9"/>
-            <w:rFonts w:eastAsia="Times New Roman"/>
-            <w:noProof/>
-            <w:lang w:eastAsia="ru-RU"/>
-          </w:rPr>
-          <w:t>ролей членов команды</w:t>
+          <w:t>Распределение ролей членов команды</w:t>
         </w:r>
         <w:r>
           <w:rPr>
@@ -2104,25 +2068,7 @@
             <w:noProof/>
             <w:lang w:eastAsia="ru-RU"/>
           </w:rPr>
-          <w:t>Распре</w:t>
-        </w:r>
-        <w:r>
-          <w:rPr>
-            <w:rStyle w:val="a9"/>
-            <w:rFonts w:eastAsia="Times New Roman"/>
-            <w:noProof/>
-            <w:lang w:eastAsia="ru-RU"/>
-          </w:rPr>
-          <w:t>д</w:t>
-        </w:r>
-        <w:r>
-          <w:rPr>
-            <w:rStyle w:val="a9"/>
-            <w:rFonts w:eastAsia="Times New Roman"/>
-            <w:noProof/>
-            <w:lang w:eastAsia="ru-RU"/>
-          </w:rPr>
-          <w:t>еление ролей членов команды</w:t>
+          <w:t>Распределение ролей членов команды</w:t>
         </w:r>
         <w:r>
           <w:rPr>
@@ -4422,25 +4368,7 @@
             <w:noProof/>
             <w:lang w:eastAsia="ru-RU"/>
           </w:rPr>
-          <w:t>Создание и</w:t>
-        </w:r>
-        <w:r>
-          <w:rPr>
-            <w:rStyle w:val="a9"/>
-            <w:rFonts w:eastAsia="Times New Roman"/>
-            <w:noProof/>
-            <w:lang w:eastAsia="ru-RU"/>
-          </w:rPr>
-          <w:t xml:space="preserve"> </w:t>
-        </w:r>
-        <w:r>
-          <w:rPr>
-            <w:rStyle w:val="a9"/>
-            <w:rFonts w:eastAsia="Times New Roman"/>
-            <w:noProof/>
-            <w:lang w:eastAsia="ru-RU"/>
-          </w:rPr>
-          <w:t>организация базы данных сервиса.</w:t>
+          <w:t>Создание и организация базы данных сервиса.</w:t>
         </w:r>
         <w:r>
           <w:rPr>
@@ -20451,6 +20379,15 @@
         </w:rPr>
         <w:t>Руководитель/проектировщик:</w:t>
       </w:r>
+      <w:r>
+        <w:rPr>
+          <w:rFonts w:ascii="Times New Roman" w:eastAsia="Times New Roman" w:hAnsi="Times New Roman" w:cs="Times New Roman"/>
+          <w:sz w:val="28"/>
+          <w:szCs w:val="28"/>
+          <w:lang w:eastAsia="ru-RU"/>
+        </w:rPr>
+        <w:t xml:space="preserve"> Солдаткина</w:t>
+      </w:r>
     </w:p>
     <w:p>
       <w:pPr>
@@ -20474,6 +20411,15 @@
         </w:rPr>
         <w:t>Разработчик:</w:t>
       </w:r>
+      <w:r>
+        <w:rPr>
+          <w:rFonts w:ascii="Times New Roman" w:eastAsia="Times New Roman" w:hAnsi="Times New Roman" w:cs="Times New Roman"/>
+          <w:sz w:val="28"/>
+          <w:szCs w:val="28"/>
+          <w:lang w:eastAsia="ru-RU"/>
+        </w:rPr>
+        <w:t xml:space="preserve"> Рыжова</w:t>
+      </w:r>
     </w:p>
     <w:p>
       <w:pPr>
@@ -20495,7 +20441,36 @@
           <w:szCs w:val="28"/>
           <w:lang w:eastAsia="ru-RU"/>
         </w:rPr>
-        <w:t>Тестировщик:</w:t>
+        <w:t>Тестер</w:t>
+      </w:r>
+      <w:bookmarkStart w:id="18" w:name="_GoBack"/>
+      <w:bookmarkEnd w:id="18"/>
+      <w:r>
+        <w:rPr>
+          <w:rFonts w:ascii="Times New Roman" w:eastAsia="Times New Roman" w:hAnsi="Times New Roman" w:cs="Times New Roman"/>
+          <w:sz w:val="28"/>
+          <w:szCs w:val="28"/>
+          <w:lang w:eastAsia="ru-RU"/>
+        </w:rPr>
+        <w:t>:</w:t>
+      </w:r>
+      <w:r>
+        <w:rPr>
+          <w:rFonts w:ascii="Times New Roman" w:eastAsia="Times New Roman" w:hAnsi="Times New Roman" w:cs="Times New Roman"/>
+          <w:sz w:val="28"/>
+          <w:szCs w:val="28"/>
+          <w:lang w:eastAsia="ru-RU"/>
+        </w:rPr>
+        <w:t xml:space="preserve"> </w:t>
+      </w:r>
+      <w:r>
+        <w:rPr>
+          <w:rFonts w:ascii="Times New Roman" w:eastAsia="Times New Roman" w:hAnsi="Times New Roman" w:cs="Times New Roman"/>
+          <w:sz w:val="28"/>
+          <w:szCs w:val="28"/>
+          <w:lang w:eastAsia="ru-RU"/>
+        </w:rPr>
+        <w:t>Солдаткина</w:t>
       </w:r>
     </w:p>
     <w:p>
@@ -20510,8 +20485,8 @@
           <w:lang w:eastAsia="ru-RU"/>
         </w:rPr>
       </w:pPr>
-      <w:bookmarkStart w:id="18" w:name="_Toc229829447"/>
-      <w:bookmarkStart w:id="19" w:name="_Toc229835768"/>
+      <w:bookmarkStart w:id="19" w:name="_Toc229829447"/>
+      <w:bookmarkStart w:id="20" w:name="_Toc229835768"/>
       <w:r>
         <w:rPr>
           <w:rFonts w:eastAsia="Times New Roman"/>
@@ -20520,8 +20495,8 @@
         <w:lastRenderedPageBreak/>
         <w:t>Модуль «Интерфейс пользователя»</w:t>
       </w:r>
-      <w:bookmarkEnd w:id="18"/>
       <w:bookmarkEnd w:id="19"/>
+      <w:bookmarkEnd w:id="20"/>
     </w:p>
     <w:p>
       <w:pPr>
@@ -20535,8 +20510,8 @@
           <w:lang w:eastAsia="ru-RU"/>
         </w:rPr>
       </w:pPr>
-      <w:bookmarkStart w:id="20" w:name="_Toc229829448"/>
-      <w:bookmarkStart w:id="21" w:name="_Toc229835769"/>
+      <w:bookmarkStart w:id="21" w:name="_Toc229829448"/>
+      <w:bookmarkStart w:id="22" w:name="_Toc229835769"/>
       <w:r>
         <w:rPr>
           <w:rFonts w:eastAsia="Times New Roman"/>
@@ -20544,8 +20519,8 @@
         </w:rPr>
         <w:t>Основное описание модуля</w:t>
       </w:r>
-      <w:bookmarkEnd w:id="20"/>
       <w:bookmarkEnd w:id="21"/>
+      <w:bookmarkEnd w:id="22"/>
     </w:p>
     <w:p>
       <w:pPr>
@@ -20937,8 +20912,8 @@
           <w:lang w:eastAsia="ru-RU"/>
         </w:rPr>
       </w:pPr>
-      <w:bookmarkStart w:id="22" w:name="_Toc229829449"/>
-      <w:bookmarkStart w:id="23" w:name="_Toc229835770"/>
+      <w:bookmarkStart w:id="23" w:name="_Toc229829449"/>
+      <w:bookmarkStart w:id="24" w:name="_Toc229835770"/>
       <w:r>
         <w:rPr>
           <w:rFonts w:eastAsia="Times New Roman"/>
@@ -20946,8 +20921,8 @@
         </w:rPr>
         <w:t>Распределение ролей членов команды</w:t>
       </w:r>
-      <w:bookmarkEnd w:id="22"/>
       <w:bookmarkEnd w:id="23"/>
+      <w:bookmarkEnd w:id="24"/>
     </w:p>
     <w:p>
       <w:pPr>
@@ -20994,8 +20969,24 @@
         </w:rPr>
         <w:t>Руководитель/проектировщик:</w:t>
       </w:r>
-      <w:bookmarkStart w:id="24" w:name="_GoBack"/>
-      <w:bookmarkEnd w:id="24"/>
+      <w:r>
+        <w:rPr>
+          <w:rFonts w:ascii="Times New Roman" w:eastAsia="Times New Roman" w:hAnsi="Times New Roman" w:cs="Times New Roman"/>
+          <w:sz w:val="28"/>
+          <w:szCs w:val="28"/>
+          <w:lang w:eastAsia="ru-RU"/>
+        </w:rPr>
+        <w:t xml:space="preserve"> </w:t>
+      </w:r>
+      <w:r>
+        <w:rPr>
+          <w:rFonts w:ascii="Times New Roman" w:eastAsia="Times New Roman" w:hAnsi="Times New Roman" w:cs="Times New Roman"/>
+          <w:sz w:val="28"/>
+          <w:szCs w:val="28"/>
+          <w:lang w:eastAsia="ru-RU"/>
+        </w:rPr>
+        <w:t>Солдаткина</w:t>
+      </w:r>
     </w:p>
     <w:p>
       <w:pPr>
@@ -21019,6 +21010,24 @@
         </w:rPr>
         <w:t>Разработчик:</w:t>
       </w:r>
+      <w:r>
+        <w:rPr>
+          <w:rFonts w:ascii="Times New Roman" w:eastAsia="Times New Roman" w:hAnsi="Times New Roman" w:cs="Times New Roman"/>
+          <w:sz w:val="28"/>
+          <w:szCs w:val="28"/>
+          <w:lang w:eastAsia="ru-RU"/>
+        </w:rPr>
+        <w:t xml:space="preserve"> </w:t>
+      </w:r>
+      <w:r>
+        <w:rPr>
+          <w:rFonts w:ascii="Times New Roman" w:eastAsia="Times New Roman" w:hAnsi="Times New Roman" w:cs="Times New Roman"/>
+          <w:sz w:val="28"/>
+          <w:szCs w:val="28"/>
+          <w:lang w:eastAsia="ru-RU"/>
+        </w:rPr>
+        <w:t>Солдаткина</w:t>
+      </w:r>
     </w:p>
     <w:p>
       <w:pPr>
@@ -21040,7 +21049,34 @@
           <w:szCs w:val="28"/>
           <w:lang w:eastAsia="ru-RU"/>
         </w:rPr>
-        <w:t>Тестировщик:</w:t>
+        <w:t>Тестер</w:t>
+      </w:r>
+      <w:r>
+        <w:rPr>
+          <w:rFonts w:ascii="Times New Roman" w:eastAsia="Times New Roman" w:hAnsi="Times New Roman" w:cs="Times New Roman"/>
+          <w:sz w:val="28"/>
+          <w:szCs w:val="28"/>
+          <w:lang w:eastAsia="ru-RU"/>
+        </w:rPr>
+        <w:t>:</w:t>
+      </w:r>
+      <w:r>
+        <w:rPr>
+          <w:rFonts w:ascii="Times New Roman" w:eastAsia="Times New Roman" w:hAnsi="Times New Roman" w:cs="Times New Roman"/>
+          <w:sz w:val="28"/>
+          <w:szCs w:val="28"/>
+          <w:lang w:eastAsia="ru-RU"/>
+        </w:rPr>
+        <w:t xml:space="preserve"> </w:t>
+      </w:r>
+      <w:r>
+        <w:rPr>
+          <w:rFonts w:ascii="Times New Roman" w:eastAsia="Times New Roman" w:hAnsi="Times New Roman" w:cs="Times New Roman"/>
+          <w:sz w:val="28"/>
+          <w:szCs w:val="28"/>
+          <w:lang w:eastAsia="ru-RU"/>
+        </w:rPr>
+        <w:t>Рыжова</w:t>
       </w:r>
     </w:p>
     <w:p>
@@ -21966,6 +22002,24 @@
         </w:rPr>
         <w:t>Руководитель/проектировщик:</w:t>
       </w:r>
+      <w:r>
+        <w:rPr>
+          <w:rFonts w:ascii="Times New Roman" w:eastAsia="Times New Roman" w:hAnsi="Times New Roman" w:cs="Times New Roman"/>
+          <w:sz w:val="28"/>
+          <w:szCs w:val="28"/>
+          <w:lang w:eastAsia="ru-RU"/>
+        </w:rPr>
+        <w:t xml:space="preserve"> </w:t>
+      </w:r>
+      <w:r>
+        <w:rPr>
+          <w:rFonts w:ascii="Times New Roman" w:eastAsia="Times New Roman" w:hAnsi="Times New Roman" w:cs="Times New Roman"/>
+          <w:sz w:val="28"/>
+          <w:szCs w:val="28"/>
+          <w:lang w:eastAsia="ru-RU"/>
+        </w:rPr>
+        <w:t>Рыжова</w:t>
+      </w:r>
     </w:p>
     <w:p>
       <w:pPr>
@@ -21989,6 +22043,24 @@
         </w:rPr>
         <w:t>Разработчик:</w:t>
       </w:r>
+      <w:r>
+        <w:rPr>
+          <w:rFonts w:ascii="Times New Roman" w:eastAsia="Times New Roman" w:hAnsi="Times New Roman" w:cs="Times New Roman"/>
+          <w:sz w:val="28"/>
+          <w:szCs w:val="28"/>
+          <w:lang w:eastAsia="ru-RU"/>
+        </w:rPr>
+        <w:t xml:space="preserve"> </w:t>
+      </w:r>
+      <w:r>
+        <w:rPr>
+          <w:rFonts w:ascii="Times New Roman" w:eastAsia="Times New Roman" w:hAnsi="Times New Roman" w:cs="Times New Roman"/>
+          <w:sz w:val="28"/>
+          <w:szCs w:val="28"/>
+          <w:lang w:eastAsia="ru-RU"/>
+        </w:rPr>
+        <w:t>Рыжова</w:t>
+      </w:r>
     </w:p>
     <w:p>
       <w:pPr>
@@ -22010,7 +22082,34 @@
           <w:szCs w:val="28"/>
           <w:lang w:eastAsia="ru-RU"/>
         </w:rPr>
-        <w:t>Тестировщик:</w:t>
+        <w:t>Тестер</w:t>
+      </w:r>
+      <w:r>
+        <w:rPr>
+          <w:rFonts w:ascii="Times New Roman" w:eastAsia="Times New Roman" w:hAnsi="Times New Roman" w:cs="Times New Roman"/>
+          <w:sz w:val="28"/>
+          <w:szCs w:val="28"/>
+          <w:lang w:eastAsia="ru-RU"/>
+        </w:rPr>
+        <w:t>:</w:t>
+      </w:r>
+      <w:r>
+        <w:rPr>
+          <w:rFonts w:ascii="Times New Roman" w:eastAsia="Times New Roman" w:hAnsi="Times New Roman" w:cs="Times New Roman"/>
+          <w:sz w:val="28"/>
+          <w:szCs w:val="28"/>
+          <w:lang w:eastAsia="ru-RU"/>
+        </w:rPr>
+        <w:t xml:space="preserve"> </w:t>
+      </w:r>
+      <w:r>
+        <w:rPr>
+          <w:rFonts w:ascii="Times New Roman" w:eastAsia="Times New Roman" w:hAnsi="Times New Roman" w:cs="Times New Roman"/>
+          <w:sz w:val="28"/>
+          <w:szCs w:val="28"/>
+          <w:lang w:eastAsia="ru-RU"/>
+        </w:rPr>
+        <w:t>Солдаткина</w:t>
       </w:r>
     </w:p>
     <w:p>
@@ -22783,6 +22882,24 @@
         </w:rPr>
         <w:t>Руководитель/проектировщик:</w:t>
       </w:r>
+      <w:r>
+        <w:rPr>
+          <w:rFonts w:ascii="Times New Roman" w:eastAsia="Times New Roman" w:hAnsi="Times New Roman" w:cs="Times New Roman"/>
+          <w:sz w:val="28"/>
+          <w:szCs w:val="28"/>
+          <w:lang w:eastAsia="ru-RU"/>
+        </w:rPr>
+        <w:t xml:space="preserve"> </w:t>
+      </w:r>
+      <w:r>
+        <w:rPr>
+          <w:rFonts w:ascii="Times New Roman" w:eastAsia="Times New Roman" w:hAnsi="Times New Roman" w:cs="Times New Roman"/>
+          <w:sz w:val="28"/>
+          <w:szCs w:val="28"/>
+          <w:lang w:eastAsia="ru-RU"/>
+        </w:rPr>
+        <w:t>Рыжова</w:t>
+      </w:r>
     </w:p>
     <w:p>
       <w:pPr>
@@ -22806,6 +22923,24 @@
         </w:rPr>
         <w:t>Разработчик:</w:t>
       </w:r>
+      <w:r>
+        <w:rPr>
+          <w:rFonts w:ascii="Times New Roman" w:eastAsia="Times New Roman" w:hAnsi="Times New Roman" w:cs="Times New Roman"/>
+          <w:sz w:val="28"/>
+          <w:szCs w:val="28"/>
+          <w:lang w:eastAsia="ru-RU"/>
+        </w:rPr>
+        <w:t xml:space="preserve"> </w:t>
+      </w:r>
+      <w:r>
+        <w:rPr>
+          <w:rFonts w:ascii="Times New Roman" w:eastAsia="Times New Roman" w:hAnsi="Times New Roman" w:cs="Times New Roman"/>
+          <w:sz w:val="28"/>
+          <w:szCs w:val="28"/>
+          <w:lang w:eastAsia="ru-RU"/>
+        </w:rPr>
+        <w:t>Солдаткина</w:t>
+      </w:r>
     </w:p>
     <w:p>
       <w:pPr>
@@ -22827,7 +22962,34 @@
           <w:szCs w:val="28"/>
           <w:lang w:eastAsia="ru-RU"/>
         </w:rPr>
-        <w:t>Тестировщик:</w:t>
+        <w:t>Тестер</w:t>
+      </w:r>
+      <w:r>
+        <w:rPr>
+          <w:rFonts w:ascii="Times New Roman" w:eastAsia="Times New Roman" w:hAnsi="Times New Roman" w:cs="Times New Roman"/>
+          <w:sz w:val="28"/>
+          <w:szCs w:val="28"/>
+          <w:lang w:eastAsia="ru-RU"/>
+        </w:rPr>
+        <w:t>:</w:t>
+      </w:r>
+      <w:r>
+        <w:rPr>
+          <w:rFonts w:ascii="Times New Roman" w:eastAsia="Times New Roman" w:hAnsi="Times New Roman" w:cs="Times New Roman"/>
+          <w:sz w:val="28"/>
+          <w:szCs w:val="28"/>
+          <w:lang w:eastAsia="ru-RU"/>
+        </w:rPr>
+        <w:t xml:space="preserve"> </w:t>
+      </w:r>
+      <w:r>
+        <w:rPr>
+          <w:rFonts w:ascii="Times New Roman" w:eastAsia="Times New Roman" w:hAnsi="Times New Roman" w:cs="Times New Roman"/>
+          <w:sz w:val="28"/>
+          <w:szCs w:val="28"/>
+          <w:lang w:eastAsia="ru-RU"/>
+        </w:rPr>
+        <w:t>Рыжова</w:t>
       </w:r>
     </w:p>
     <w:p>
@@ -26152,6 +26314,7 @@
       <w:r>
         <w:rPr>
           <w:rFonts w:ascii="Times New Roman" w:eastAsia="Times New Roman" w:hAnsi="Times New Roman" w:cs="Times New Roman"/>
+          <w:noProof/>
           <w:sz w:val="28"/>
           <w:szCs w:val="28"/>
           <w:lang w:eastAsia="ru-RU"/>
@@ -26921,6 +27084,7 @@
         <w:docPartUnique/>
       </w:docPartObj>
     </w:sdtPr>
+    <w:sdtEndPr/>
     <w:sdtContent>
       <w:p>
         <w:pPr>
@@ -26940,7 +27104,7 @@
           <w:rPr>
             <w:noProof/>
           </w:rPr>
-          <w:t>29</w:t>
+          <w:t>27</w:t>
         </w:r>
         <w:r>
           <w:fldChar w:fldCharType="end"/>
@@ -30716,7 +30880,7 @@
 </file>
 
 <file path=customXml/itemProps1.xml><?xml version="1.0" encoding="utf-8"?>
-<ds:datastoreItem xmlns:ds="http://schemas.openxmlformats.org/officeDocument/2006/customXml" ds:itemID="{ED1BCA28-0C1C-400C-92E1-D2A48653959D}">
+<ds:datastoreItem xmlns:ds="http://schemas.openxmlformats.org/officeDocument/2006/customXml" ds:itemID="{887CEFFC-4D05-4CD5-9CCC-86DA9FBEB663}">
   <ds:schemaRefs>
     <ds:schemaRef ds:uri="http://schemas.openxmlformats.org/officeDocument/2006/bibliography"/>
   </ds:schemaRefs>

</xml_diff>

<commit_message>
new diagramm activity and modified main document
</commit_message>
<xml_diff>
--- a/документация/Отчет.docx
+++ b/документация/Отчет.docx
@@ -1798,7 +1798,25 @@
             <w:noProof/>
             <w:lang w:eastAsia="ru-RU"/>
           </w:rPr>
-          <w:t>Распределение ролей членов команды</w:t>
+          <w:t>Распределение ро</w:t>
+        </w:r>
+        <w:r>
+          <w:rPr>
+            <w:rStyle w:val="a9"/>
+            <w:rFonts w:eastAsia="Times New Roman"/>
+            <w:noProof/>
+            <w:lang w:eastAsia="ru-RU"/>
+          </w:rPr>
+          <w:t>л</w:t>
+        </w:r>
+        <w:r>
+          <w:rPr>
+            <w:rStyle w:val="a9"/>
+            <w:rFonts w:eastAsia="Times New Roman"/>
+            <w:noProof/>
+            <w:lang w:eastAsia="ru-RU"/>
+          </w:rPr>
+          <w:t>ей членов команды</w:t>
         </w:r>
         <w:r>
           <w:rPr>
@@ -4368,7 +4386,25 @@
             <w:noProof/>
             <w:lang w:eastAsia="ru-RU"/>
           </w:rPr>
-          <w:t>Создание и организация базы данных сервиса.</w:t>
+          <w:t>Создание и органи</w:t>
+        </w:r>
+        <w:r>
+          <w:rPr>
+            <w:rStyle w:val="a9"/>
+            <w:rFonts w:eastAsia="Times New Roman"/>
+            <w:noProof/>
+            <w:lang w:eastAsia="ru-RU"/>
+          </w:rPr>
+          <w:t>з</w:t>
+        </w:r>
+        <w:r>
+          <w:rPr>
+            <w:rStyle w:val="a9"/>
+            <w:rFonts w:eastAsia="Times New Roman"/>
+            <w:noProof/>
+            <w:lang w:eastAsia="ru-RU"/>
+          </w:rPr>
+          <w:t>ация базы данных сервиса.</w:t>
         </w:r>
         <w:r>
           <w:rPr>
@@ -20443,8 +20479,6 @@
         </w:rPr>
         <w:t>Тестер</w:t>
       </w:r>
-      <w:bookmarkStart w:id="18" w:name="_GoBack"/>
-      <w:bookmarkEnd w:id="18"/>
       <w:r>
         <w:rPr>
           <w:rFonts w:ascii="Times New Roman" w:eastAsia="Times New Roman" w:hAnsi="Times New Roman" w:cs="Times New Roman"/>
@@ -20485,8 +20519,8 @@
           <w:lang w:eastAsia="ru-RU"/>
         </w:rPr>
       </w:pPr>
-      <w:bookmarkStart w:id="19" w:name="_Toc229829447"/>
-      <w:bookmarkStart w:id="20" w:name="_Toc229835768"/>
+      <w:bookmarkStart w:id="18" w:name="_Toc229829447"/>
+      <w:bookmarkStart w:id="19" w:name="_Toc229835768"/>
       <w:r>
         <w:rPr>
           <w:rFonts w:eastAsia="Times New Roman"/>
@@ -20495,8 +20529,8 @@
         <w:lastRenderedPageBreak/>
         <w:t>Модуль «Интерфейс пользователя»</w:t>
       </w:r>
+      <w:bookmarkEnd w:id="18"/>
       <w:bookmarkEnd w:id="19"/>
-      <w:bookmarkEnd w:id="20"/>
     </w:p>
     <w:p>
       <w:pPr>
@@ -20510,8 +20544,8 @@
           <w:lang w:eastAsia="ru-RU"/>
         </w:rPr>
       </w:pPr>
-      <w:bookmarkStart w:id="21" w:name="_Toc229829448"/>
-      <w:bookmarkStart w:id="22" w:name="_Toc229835769"/>
+      <w:bookmarkStart w:id="20" w:name="_Toc229829448"/>
+      <w:bookmarkStart w:id="21" w:name="_Toc229835769"/>
       <w:r>
         <w:rPr>
           <w:rFonts w:eastAsia="Times New Roman"/>
@@ -20519,8 +20553,8 @@
         </w:rPr>
         <w:t>Основное описание модуля</w:t>
       </w:r>
+      <w:bookmarkEnd w:id="20"/>
       <w:bookmarkEnd w:id="21"/>
-      <w:bookmarkEnd w:id="22"/>
     </w:p>
     <w:p>
       <w:pPr>
@@ -20912,8 +20946,8 @@
           <w:lang w:eastAsia="ru-RU"/>
         </w:rPr>
       </w:pPr>
-      <w:bookmarkStart w:id="23" w:name="_Toc229829449"/>
-      <w:bookmarkStart w:id="24" w:name="_Toc229835770"/>
+      <w:bookmarkStart w:id="22" w:name="_Toc229829449"/>
+      <w:bookmarkStart w:id="23" w:name="_Toc229835770"/>
       <w:r>
         <w:rPr>
           <w:rFonts w:eastAsia="Times New Roman"/>
@@ -20921,8 +20955,8 @@
         </w:rPr>
         <w:t>Распределение ролей членов команды</w:t>
       </w:r>
+      <w:bookmarkEnd w:id="22"/>
       <w:bookmarkEnd w:id="23"/>
-      <w:bookmarkEnd w:id="24"/>
     </w:p>
     <w:p>
       <w:pPr>
@@ -20957,7 +20991,7 @@
           <w:rFonts w:ascii="Times New Roman" w:eastAsia="Times New Roman" w:hAnsi="Times New Roman" w:cs="Times New Roman"/>
           <w:sz w:val="28"/>
           <w:szCs w:val="28"/>
-          <w:lang w:val="en-US" w:eastAsia="ru-RU"/>
+          <w:lang w:eastAsia="ru-RU"/>
         </w:rPr>
       </w:pPr>
       <w:r>
@@ -21105,8 +21139,8 @@
           <w:lang w:eastAsia="ru-RU"/>
         </w:rPr>
       </w:pPr>
-      <w:bookmarkStart w:id="25" w:name="_Toc229829450"/>
-      <w:bookmarkStart w:id="26" w:name="_Toc229835771"/>
+      <w:bookmarkStart w:id="24" w:name="_Toc229829450"/>
+      <w:bookmarkStart w:id="25" w:name="_Toc229835771"/>
       <w:r>
         <w:rPr>
           <w:rFonts w:eastAsia="Times New Roman"/>
@@ -21115,8 +21149,8 @@
         <w:lastRenderedPageBreak/>
         <w:t>Модуль «Интерфейс администратора»</w:t>
       </w:r>
+      <w:bookmarkEnd w:id="24"/>
       <w:bookmarkEnd w:id="25"/>
-      <w:bookmarkEnd w:id="26"/>
     </w:p>
     <w:p>
       <w:pPr>
@@ -21130,8 +21164,8 @@
           <w:lang w:eastAsia="ru-RU"/>
         </w:rPr>
       </w:pPr>
-      <w:bookmarkStart w:id="27" w:name="_Toc229829451"/>
-      <w:bookmarkStart w:id="28" w:name="_Toc229835772"/>
+      <w:bookmarkStart w:id="26" w:name="_Toc229829451"/>
+      <w:bookmarkStart w:id="27" w:name="_Toc229835772"/>
       <w:r>
         <w:rPr>
           <w:rFonts w:eastAsia="Times New Roman"/>
@@ -21139,8 +21173,8 @@
         </w:rPr>
         <w:t>Основное описание модуля</w:t>
       </w:r>
+      <w:bookmarkEnd w:id="26"/>
       <w:bookmarkEnd w:id="27"/>
-      <w:bookmarkEnd w:id="28"/>
     </w:p>
     <w:p>
       <w:pPr>
@@ -21246,7 +21280,7 @@
           <w:lang w:eastAsia="ru-RU"/>
         </w:rPr>
       </w:pPr>
-      <w:bookmarkStart w:id="29" w:name="_Toc229835773"/>
+      <w:bookmarkStart w:id="28" w:name="_Toc229835773"/>
       <w:r>
         <w:rPr>
           <w:rFonts w:eastAsia="Times New Roman"/>
@@ -21254,7 +21288,7 @@
         </w:rPr>
         <w:t>Управление билетами и вопросами</w:t>
       </w:r>
-      <w:bookmarkEnd w:id="29"/>
+      <w:bookmarkEnd w:id="28"/>
     </w:p>
     <w:p>
       <w:pPr>
@@ -21346,7 +21380,7 @@
           <w:lang w:eastAsia="ru-RU"/>
         </w:rPr>
       </w:pPr>
-      <w:bookmarkStart w:id="30" w:name="_Toc229835774"/>
+      <w:bookmarkStart w:id="29" w:name="_Toc229835774"/>
       <w:r>
         <w:rPr>
           <w:rFonts w:eastAsia="Times New Roman"/>
@@ -21354,7 +21388,7 @@
         </w:rPr>
         <w:t>Импорт из CSV</w:t>
       </w:r>
-      <w:bookmarkEnd w:id="30"/>
+      <w:bookmarkEnd w:id="29"/>
     </w:p>
     <w:p>
       <w:pPr>
@@ -21637,7 +21671,7 @@
           <w:lang w:eastAsia="ru-RU"/>
         </w:rPr>
       </w:pPr>
-      <w:bookmarkStart w:id="31" w:name="_Toc229835775"/>
+      <w:bookmarkStart w:id="30" w:name="_Toc229835775"/>
       <w:r>
         <w:rPr>
           <w:rFonts w:eastAsia="Times New Roman"/>
@@ -21645,7 +21679,7 @@
         </w:rPr>
         <w:t>Управление пользователями (опционально)</w:t>
       </w:r>
-      <w:bookmarkEnd w:id="31"/>
+      <w:bookmarkEnd w:id="30"/>
     </w:p>
     <w:p>
       <w:pPr>
@@ -21945,8 +21979,8 @@
           <w:lang w:eastAsia="ru-RU"/>
         </w:rPr>
       </w:pPr>
-      <w:bookmarkStart w:id="32" w:name="_Toc229829452"/>
-      <w:bookmarkStart w:id="33" w:name="_Toc229835776"/>
+      <w:bookmarkStart w:id="31" w:name="_Toc229829452"/>
+      <w:bookmarkStart w:id="32" w:name="_Toc229835776"/>
       <w:r>
         <w:rPr>
           <w:rFonts w:eastAsia="Times New Roman"/>
@@ -21954,8 +21988,8 @@
         </w:rPr>
         <w:t>Распределение ролей членов команды</w:t>
       </w:r>
+      <w:bookmarkEnd w:id="31"/>
       <w:bookmarkEnd w:id="32"/>
-      <w:bookmarkEnd w:id="33"/>
     </w:p>
     <w:p>
       <w:pPr>
@@ -22138,8 +22172,8 @@
           <w:lang w:eastAsia="ru-RU"/>
         </w:rPr>
       </w:pPr>
-      <w:bookmarkStart w:id="34" w:name="_Toc229829453"/>
-      <w:bookmarkStart w:id="35" w:name="_Toc229835777"/>
+      <w:bookmarkStart w:id="33" w:name="_Toc229829453"/>
+      <w:bookmarkStart w:id="34" w:name="_Toc229835777"/>
       <w:r>
         <w:rPr>
           <w:rFonts w:eastAsia="Times New Roman"/>
@@ -22147,8 +22181,8 @@
         </w:rPr>
         <w:t>Модуль «Тестирование»</w:t>
       </w:r>
+      <w:bookmarkEnd w:id="33"/>
       <w:bookmarkEnd w:id="34"/>
-      <w:bookmarkEnd w:id="35"/>
     </w:p>
     <w:p>
       <w:pPr>
@@ -22162,7 +22196,7 @@
           <w:lang w:eastAsia="ru-RU"/>
         </w:rPr>
       </w:pPr>
-      <w:bookmarkStart w:id="36" w:name="_Toc229835778"/>
+      <w:bookmarkStart w:id="35" w:name="_Toc229835778"/>
       <w:r>
         <w:rPr>
           <w:rFonts w:eastAsia="Times New Roman"/>
@@ -22170,7 +22204,7 @@
         </w:rPr>
         <w:t>Основное описание модуля</w:t>
       </w:r>
-      <w:bookmarkEnd w:id="36"/>
+      <w:bookmarkEnd w:id="35"/>
     </w:p>
     <w:p>
       <w:pPr>
@@ -22262,8 +22296,8 @@
           <w:lang w:eastAsia="ru-RU"/>
         </w:rPr>
       </w:pPr>
-      <w:bookmarkStart w:id="37" w:name="_Toc229829454"/>
-      <w:bookmarkStart w:id="38" w:name="_Toc229835779"/>
+      <w:bookmarkStart w:id="36" w:name="_Toc229829454"/>
+      <w:bookmarkStart w:id="37" w:name="_Toc229835779"/>
       <w:r>
         <w:rPr>
           <w:rFonts w:eastAsia="Times New Roman"/>
@@ -22278,8 +22312,8 @@
         </w:rPr>
         <w:t>билета</w:t>
       </w:r>
+      <w:bookmarkEnd w:id="36"/>
       <w:bookmarkEnd w:id="37"/>
-      <w:bookmarkEnd w:id="38"/>
     </w:p>
     <w:p>
       <w:pPr>
@@ -22433,8 +22467,8 @@
           <w:lang w:eastAsia="ru-RU"/>
         </w:rPr>
       </w:pPr>
-      <w:bookmarkStart w:id="39" w:name="_Toc229829455"/>
-      <w:bookmarkStart w:id="40" w:name="_Toc229835780"/>
+      <w:bookmarkStart w:id="38" w:name="_Toc229829455"/>
+      <w:bookmarkStart w:id="39" w:name="_Toc229835780"/>
       <w:r>
         <w:rPr>
           <w:rFonts w:eastAsia="Times New Roman"/>
@@ -22442,8 +22476,8 @@
         </w:rPr>
         <w:t>Завершение теста и подсчёт результата</w:t>
       </w:r>
+      <w:bookmarkEnd w:id="38"/>
       <w:bookmarkEnd w:id="39"/>
-      <w:bookmarkEnd w:id="40"/>
     </w:p>
     <w:p>
       <w:pPr>
@@ -22631,8 +22665,8 @@
           <w:lang w:eastAsia="ru-RU"/>
         </w:rPr>
       </w:pPr>
-      <w:bookmarkStart w:id="41" w:name="_Toc229829456"/>
-      <w:bookmarkStart w:id="42" w:name="_Toc229835781"/>
+      <w:bookmarkStart w:id="40" w:name="_Toc229829456"/>
+      <w:bookmarkStart w:id="41" w:name="_Toc229835781"/>
       <w:r>
         <w:rPr>
           <w:rFonts w:eastAsia="Times New Roman"/>
@@ -22640,8 +22674,8 @@
         </w:rPr>
         <w:t>Детальный результат</w:t>
       </w:r>
+      <w:bookmarkEnd w:id="40"/>
       <w:bookmarkEnd w:id="41"/>
-      <w:bookmarkEnd w:id="42"/>
     </w:p>
     <w:p>
       <w:pPr>
@@ -22751,8 +22785,8 @@
           <w:lang w:eastAsia="ru-RU"/>
         </w:rPr>
       </w:pPr>
-      <w:bookmarkStart w:id="43" w:name="_Toc229829457"/>
-      <w:bookmarkStart w:id="44" w:name="_Toc229835782"/>
+      <w:bookmarkStart w:id="42" w:name="_Toc229829457"/>
+      <w:bookmarkStart w:id="43" w:name="_Toc229835782"/>
       <w:r>
         <w:rPr>
           <w:rFonts w:eastAsia="Times New Roman"/>
@@ -22760,8 +22794,8 @@
         </w:rPr>
         <w:t>Ограничения и защита</w:t>
       </w:r>
+      <w:bookmarkEnd w:id="42"/>
       <w:bookmarkEnd w:id="43"/>
-      <w:bookmarkEnd w:id="44"/>
     </w:p>
     <w:p>
       <w:pPr>
@@ -22827,7 +22861,7 @@
           <w:lang w:eastAsia="ru-RU"/>
         </w:rPr>
       </w:pPr>
-      <w:bookmarkStart w:id="45" w:name="_Toc229835783"/>
+      <w:bookmarkStart w:id="44" w:name="_Toc229835783"/>
       <w:r>
         <w:rPr>
           <w:rFonts w:eastAsia="Times New Roman"/>
@@ -22835,7 +22869,7 @@
         </w:rPr>
         <w:t>Распределение ролей членов команды</w:t>
       </w:r>
-      <w:bookmarkEnd w:id="45"/>
+      <w:bookmarkEnd w:id="44"/>
     </w:p>
     <w:p>
       <w:pPr>
@@ -23038,8 +23072,8 @@
           <w:lang w:eastAsia="ru-RU"/>
         </w:rPr>
       </w:pPr>
-      <w:bookmarkStart w:id="46" w:name="_Toc229829459"/>
-      <w:bookmarkStart w:id="47" w:name="_Toc229835784"/>
+      <w:bookmarkStart w:id="45" w:name="_Toc229829459"/>
+      <w:bookmarkStart w:id="46" w:name="_Toc229835784"/>
       <w:r>
         <w:rPr>
           <w:rFonts w:eastAsia="Times New Roman"/>
@@ -23048,8 +23082,8 @@
         <w:lastRenderedPageBreak/>
         <w:t>Создание плановой документации</w:t>
       </w:r>
+      <w:bookmarkEnd w:id="45"/>
       <w:bookmarkEnd w:id="46"/>
-      <w:bookmarkEnd w:id="47"/>
     </w:p>
     <w:p>
       <w:pPr>
@@ -23113,8 +23147,8 @@
           <w:lang w:eastAsia="ru-RU"/>
         </w:rPr>
       </w:pPr>
-      <w:bookmarkStart w:id="48" w:name="_Toc229829460"/>
-      <w:bookmarkStart w:id="49" w:name="_Toc229835785"/>
+      <w:bookmarkStart w:id="47" w:name="_Toc229829460"/>
+      <w:bookmarkStart w:id="48" w:name="_Toc229835785"/>
       <w:r>
         <w:rPr>
           <w:rFonts w:eastAsia="Times New Roman"/>
@@ -23122,8 +23156,8 @@
         </w:rPr>
         <w:t>Диаграмма Использования</w:t>
       </w:r>
+      <w:bookmarkEnd w:id="47"/>
       <w:bookmarkEnd w:id="48"/>
-      <w:bookmarkEnd w:id="49"/>
     </w:p>
     <w:p>
       <w:pPr>
@@ -24002,13 +24036,13 @@
           <w:numId w:val="10"/>
         </w:numPr>
       </w:pPr>
-      <w:bookmarkStart w:id="50" w:name="_Toc229829461"/>
-      <w:bookmarkStart w:id="51" w:name="_Toc229835786"/>
+      <w:bookmarkStart w:id="49" w:name="_Toc229829461"/>
+      <w:bookmarkStart w:id="50" w:name="_Toc229835786"/>
       <w:r>
         <w:t>Диаграмма классов</w:t>
       </w:r>
+      <w:bookmarkEnd w:id="49"/>
       <w:bookmarkEnd w:id="50"/>
-      <w:bookmarkEnd w:id="51"/>
     </w:p>
     <w:p>
       <w:pPr>
@@ -24047,13 +24081,13 @@
         </w:numPr>
         <w:ind w:left="1418"/>
       </w:pPr>
-      <w:bookmarkStart w:id="52" w:name="_Toc229829462"/>
-      <w:bookmarkStart w:id="53" w:name="_Toc229835787"/>
+      <w:bookmarkStart w:id="51" w:name="_Toc229829462"/>
+      <w:bookmarkStart w:id="52" w:name="_Toc229835787"/>
       <w:r>
         <w:t>Гость и ограниченный доступ</w:t>
       </w:r>
+      <w:bookmarkEnd w:id="51"/>
       <w:bookmarkEnd w:id="52"/>
-      <w:bookmarkEnd w:id="53"/>
     </w:p>
     <w:p>
       <w:pPr>
@@ -24101,13 +24135,13 @@
         </w:numPr>
         <w:ind w:left="1418"/>
       </w:pPr>
-      <w:bookmarkStart w:id="54" w:name="_Toc229829463"/>
-      <w:bookmarkStart w:id="55" w:name="_Toc229835788"/>
+      <w:bookmarkStart w:id="53" w:name="_Toc229829463"/>
+      <w:bookmarkStart w:id="54" w:name="_Toc229835788"/>
       <w:r>
         <w:t>Зарегистрированный пользователь: полный цикл тестирования</w:t>
       </w:r>
+      <w:bookmarkEnd w:id="53"/>
       <w:bookmarkEnd w:id="54"/>
-      <w:bookmarkEnd w:id="55"/>
     </w:p>
     <w:p>
       <w:pPr>
@@ -24506,13 +24540,13 @@
         </w:numPr>
         <w:ind w:left="1418"/>
       </w:pPr>
-      <w:bookmarkStart w:id="56" w:name="_Toc229829464"/>
-      <w:bookmarkStart w:id="57" w:name="_Toc229835789"/>
+      <w:bookmarkStart w:id="55" w:name="_Toc229829464"/>
+      <w:bookmarkStart w:id="56" w:name="_Toc229835789"/>
       <w:r>
         <w:t>Администратор: управление контентом</w:t>
       </w:r>
+      <w:bookmarkEnd w:id="55"/>
       <w:bookmarkEnd w:id="56"/>
-      <w:bookmarkEnd w:id="57"/>
     </w:p>
     <w:p>
       <w:pPr>
@@ -24747,13 +24781,13 @@
           <w:numId w:val="10"/>
         </w:numPr>
       </w:pPr>
-      <w:bookmarkStart w:id="58" w:name="_Toc229829465"/>
-      <w:bookmarkStart w:id="59" w:name="_Toc229835790"/>
+      <w:bookmarkStart w:id="57" w:name="_Toc229829465"/>
+      <w:bookmarkStart w:id="58" w:name="_Toc229835790"/>
       <w:r>
         <w:t>Связи между процессами</w:t>
       </w:r>
+      <w:bookmarkEnd w:id="57"/>
       <w:bookmarkEnd w:id="58"/>
-      <w:bookmarkEnd w:id="59"/>
     </w:p>
     <w:p>
       <w:pPr>
@@ -24992,13 +25026,13 @@
           <w:numId w:val="10"/>
         </w:numPr>
       </w:pPr>
-      <w:bookmarkStart w:id="60" w:name="_Toc229829466"/>
-      <w:bookmarkStart w:id="61" w:name="_Toc229835791"/>
+      <w:bookmarkStart w:id="59" w:name="_Toc229829466"/>
+      <w:bookmarkStart w:id="60" w:name="_Toc229835791"/>
       <w:r>
         <w:t>Диаграмма компонентов</w:t>
       </w:r>
+      <w:bookmarkEnd w:id="59"/>
       <w:bookmarkEnd w:id="60"/>
-      <w:bookmarkEnd w:id="61"/>
     </w:p>
     <w:p>
       <w:pPr>
@@ -25260,13 +25294,13 @@
           <w:numId w:val="10"/>
         </w:numPr>
       </w:pPr>
-      <w:bookmarkStart w:id="62" w:name="_Toc229829467"/>
-      <w:bookmarkStart w:id="63" w:name="_Toc229835792"/>
+      <w:bookmarkStart w:id="61" w:name="_Toc229829467"/>
+      <w:bookmarkStart w:id="62" w:name="_Toc229835792"/>
       <w:r>
         <w:t>Диаграмма развертывания</w:t>
       </w:r>
+      <w:bookmarkEnd w:id="61"/>
       <w:bookmarkEnd w:id="62"/>
-      <w:bookmarkEnd w:id="63"/>
     </w:p>
     <w:p>
       <w:pPr>
@@ -25305,13 +25339,13 @@
         </w:numPr>
         <w:ind w:left="1418"/>
       </w:pPr>
-      <w:bookmarkStart w:id="64" w:name="_Toc229829468"/>
-      <w:bookmarkStart w:id="65" w:name="_Toc229835793"/>
+      <w:bookmarkStart w:id="63" w:name="_Toc229829468"/>
+      <w:bookmarkStart w:id="64" w:name="_Toc229835793"/>
       <w:r>
         <w:t>Узлы и устройства</w:t>
       </w:r>
+      <w:bookmarkEnd w:id="63"/>
       <w:bookmarkEnd w:id="64"/>
-      <w:bookmarkEnd w:id="65"/>
     </w:p>
     <w:p>
       <w:pPr>
@@ -25520,16 +25554,16 @@
           <w:szCs w:val="24"/>
         </w:rPr>
       </w:pPr>
-      <w:bookmarkStart w:id="66" w:name="_Toc229829469"/>
-      <w:bookmarkStart w:id="67" w:name="_Toc229835794"/>
+      <w:bookmarkStart w:id="65" w:name="_Toc229829469"/>
+      <w:bookmarkStart w:id="66" w:name="_Toc229835794"/>
       <w:r>
         <w:rPr>
           <w:rStyle w:val="30"/>
         </w:rPr>
         <w:t>Сервисы, размещённые на серверном узле</w:t>
       </w:r>
+      <w:bookmarkEnd w:id="65"/>
       <w:bookmarkEnd w:id="66"/>
-      <w:bookmarkEnd w:id="67"/>
     </w:p>
     <w:p>
       <w:pPr>
@@ -25827,13 +25861,13 @@
           <w:numId w:val="10"/>
         </w:numPr>
       </w:pPr>
-      <w:bookmarkStart w:id="68" w:name="_Toc229829470"/>
-      <w:bookmarkStart w:id="69" w:name="_Toc229835795"/>
+      <w:bookmarkStart w:id="67" w:name="_Toc229829470"/>
+      <w:bookmarkStart w:id="68" w:name="_Toc229835795"/>
       <w:r>
         <w:t>Базы данных</w:t>
       </w:r>
+      <w:bookmarkEnd w:id="67"/>
       <w:bookmarkEnd w:id="68"/>
-      <w:bookmarkEnd w:id="69"/>
     </w:p>
     <w:p>
       <w:pPr>
@@ -26191,14 +26225,16 @@
         </w:numPr>
         <w:rPr>
           <w:rFonts w:eastAsia="Times New Roman"/>
-          <w:lang w:eastAsia="ru-RU"/>
-        </w:rPr>
-      </w:pPr>
-      <w:bookmarkStart w:id="70" w:name="_Toc229829471"/>
-      <w:bookmarkStart w:id="71" w:name="_Toc229835796"/>
+          <w:highlight w:val="yellow"/>
+          <w:lang w:eastAsia="ru-RU"/>
+        </w:rPr>
+      </w:pPr>
+      <w:bookmarkStart w:id="69" w:name="_Toc229829471"/>
+      <w:bookmarkStart w:id="70" w:name="_Toc229835796"/>
       <w:r>
         <w:rPr>
           <w:rFonts w:eastAsia="Times New Roman"/>
+          <w:highlight w:val="yellow"/>
           <w:lang w:eastAsia="ru-RU"/>
         </w:rPr>
         <w:lastRenderedPageBreak/>
@@ -26207,12 +26243,13 @@
       <w:r>
         <w:rPr>
           <w:rFonts w:eastAsia="Times New Roman"/>
+          <w:highlight w:val="yellow"/>
           <w:lang w:eastAsia="ru-RU"/>
         </w:rPr>
         <w:t>.</w:t>
       </w:r>
+      <w:bookmarkEnd w:id="69"/>
       <w:bookmarkEnd w:id="70"/>
-      <w:bookmarkEnd w:id="71"/>
     </w:p>
     <w:p>
       <w:pPr>
@@ -26314,16 +26351,15 @@
       <w:r>
         <w:rPr>
           <w:rFonts w:ascii="Times New Roman" w:eastAsia="Times New Roman" w:hAnsi="Times New Roman" w:cs="Times New Roman"/>
-          <w:noProof/>
           <w:sz w:val="28"/>
           <w:szCs w:val="28"/>
           <w:lang w:eastAsia="ru-RU"/>
         </w:rPr>
         <w:drawing>
-          <wp:inline distT="0" distB="0" distL="0" distR="0" wp14:anchorId="02C054AC" wp14:editId="07F96FA0">
-            <wp:extent cx="5939790" cy="3640455"/>
+          <wp:inline distT="0" distB="0" distL="0" distR="0" wp14:anchorId="765C3D10" wp14:editId="6AA7BF92">
+            <wp:extent cx="5939790" cy="3491230"/>
             <wp:effectExtent l="0" t="0" r="3810" b="0"/>
-            <wp:docPr id="7" name="Рисунок 7"/>
+            <wp:docPr id="4" name="Рисунок 4"/>
             <wp:cNvGraphicFramePr>
               <a:graphicFrameLocks xmlns:a="http://schemas.openxmlformats.org/drawingml/2006/main" noChangeAspect="1"/>
             </wp:cNvGraphicFramePr>
@@ -26343,7 +26379,7 @@
                   <pic:spPr>
                     <a:xfrm>
                       <a:off x="0" y="0"/>
-                      <a:ext cx="5939790" cy="3640455"/>
+                      <a:ext cx="5939790" cy="3491230"/>
                     </a:xfrm>
                     <a:prstGeom prst="rect">
                       <a:avLst/>
@@ -26478,100 +26514,6 @@
     </w:p>
     <w:p>
       <w:pPr>
-        <w:spacing w:after="100" w:afterAutospacing="1" w:line="360" w:lineRule="auto"/>
-        <w:ind w:firstLine="709"/>
-        <w:contextualSpacing/>
-        <w:jc w:val="both"/>
-        <w:rPr>
-          <w:rFonts w:ascii="Times New Roman" w:eastAsia="Times New Roman" w:hAnsi="Times New Roman" w:cs="Times New Roman"/>
-          <w:sz w:val="28"/>
-          <w:szCs w:val="28"/>
-          <w:lang w:eastAsia="ru-RU"/>
-        </w:rPr>
-      </w:pPr>
-    </w:p>
-    <w:p>
-      <w:pPr>
-        <w:spacing w:after="100" w:afterAutospacing="1" w:line="360" w:lineRule="auto"/>
-        <w:ind w:firstLine="709"/>
-        <w:contextualSpacing/>
-        <w:jc w:val="both"/>
-        <w:rPr>
-          <w:rFonts w:ascii="Times New Roman" w:eastAsia="Times New Roman" w:hAnsi="Times New Roman" w:cs="Times New Roman"/>
-          <w:sz w:val="28"/>
-          <w:szCs w:val="28"/>
-          <w:lang w:eastAsia="ru-RU"/>
-        </w:rPr>
-      </w:pPr>
-      <w:r>
-        <w:rPr>
-          <w:rFonts w:ascii="Times New Roman" w:eastAsia="Times New Roman" w:hAnsi="Times New Roman" w:cs="Times New Roman"/>
-          <w:sz w:val="28"/>
-          <w:szCs w:val="28"/>
-          <w:highlight w:val="yellow"/>
-          <w:lang w:eastAsia="ru-RU"/>
-        </w:rPr>
-        <w:t>Описание что делали индивидуально</w:t>
-      </w:r>
-    </w:p>
-    <w:p>
-      <w:pPr>
-        <w:spacing w:after="100" w:afterAutospacing="1" w:line="360" w:lineRule="auto"/>
-        <w:ind w:firstLine="709"/>
-        <w:contextualSpacing/>
-        <w:jc w:val="both"/>
-        <w:rPr>
-          <w:rFonts w:ascii="Times New Roman" w:eastAsia="Times New Roman" w:hAnsi="Times New Roman" w:cs="Times New Roman"/>
-          <w:sz w:val="28"/>
-          <w:szCs w:val="28"/>
-          <w:lang w:eastAsia="ru-RU"/>
-        </w:rPr>
-      </w:pPr>
-    </w:p>
-    <w:p>
-      <w:pPr>
-        <w:spacing w:after="100" w:afterAutospacing="1" w:line="360" w:lineRule="auto"/>
-        <w:ind w:firstLine="709"/>
-        <w:contextualSpacing/>
-        <w:jc w:val="both"/>
-        <w:rPr>
-          <w:rFonts w:ascii="Times New Roman" w:eastAsia="Times New Roman" w:hAnsi="Times New Roman" w:cs="Times New Roman"/>
-          <w:sz w:val="28"/>
-          <w:szCs w:val="28"/>
-          <w:lang w:eastAsia="ru-RU"/>
-        </w:rPr>
-      </w:pPr>
-    </w:p>
-    <w:p>
-      <w:pPr>
-        <w:spacing w:after="100" w:afterAutospacing="1" w:line="360" w:lineRule="auto"/>
-        <w:ind w:firstLine="709"/>
-        <w:contextualSpacing/>
-        <w:jc w:val="both"/>
-        <w:rPr>
-          <w:rFonts w:ascii="Times New Roman" w:eastAsia="Times New Roman" w:hAnsi="Times New Roman" w:cs="Times New Roman"/>
-          <w:sz w:val="28"/>
-          <w:szCs w:val="28"/>
-          <w:lang w:eastAsia="ru-RU"/>
-        </w:rPr>
-      </w:pPr>
-    </w:p>
-    <w:p>
-      <w:pPr>
-        <w:spacing w:after="100" w:afterAutospacing="1" w:line="360" w:lineRule="auto"/>
-        <w:ind w:firstLine="709"/>
-        <w:contextualSpacing/>
-        <w:jc w:val="both"/>
-        <w:rPr>
-          <w:rFonts w:ascii="Times New Roman" w:eastAsia="Times New Roman" w:hAnsi="Times New Roman" w:cs="Times New Roman"/>
-          <w:sz w:val="28"/>
-          <w:szCs w:val="28"/>
-          <w:lang w:eastAsia="ru-RU"/>
-        </w:rPr>
-      </w:pPr>
-    </w:p>
-    <w:p>
-      <w:pPr>
         <w:spacing w:after="160" w:line="259" w:lineRule="auto"/>
         <w:rPr>
           <w:rFonts w:ascii="Times New Roman" w:eastAsia="Times New Roman" w:hAnsi="Times New Roman" w:cs="Times New Roman"/>
@@ -26597,25 +26539,20 @@
           <w:ilvl w:val="0"/>
           <w:numId w:val="4"/>
         </w:numPr>
+        <w:ind w:left="0" w:firstLine="0"/>
         <w:rPr>
           <w:rFonts w:eastAsia="Times New Roman"/>
-          <w:highlight w:val="yellow"/>
-          <w:lang w:eastAsia="ru-RU"/>
-        </w:rPr>
-      </w:pPr>
-      <w:bookmarkStart w:id="72" w:name="_Toc229829472"/>
-      <w:bookmarkStart w:id="73" w:name="_Toc229835797"/>
+          <w:lang w:eastAsia="ru-RU"/>
+        </w:rPr>
+      </w:pPr>
       <w:r>
         <w:rPr>
           <w:rFonts w:eastAsia="Times New Roman"/>
-          <w:highlight w:val="yellow"/>
           <w:lang w:eastAsia="ru-RU"/>
         </w:rPr>
         <w:lastRenderedPageBreak/>
-        <w:t>Тестирование</w:t>
-      </w:r>
-      <w:bookmarkEnd w:id="72"/>
-      <w:bookmarkEnd w:id="73"/>
+        <w:t>Проектирование системы авторизации / регистрации</w:t>
+      </w:r>
     </w:p>
     <w:p>
       <w:pPr>
@@ -26635,10 +26572,65 @@
           <w:rFonts w:ascii="Times New Roman" w:eastAsia="Times New Roman" w:hAnsi="Times New Roman" w:cs="Times New Roman"/>
           <w:sz w:val="28"/>
           <w:szCs w:val="28"/>
-          <w:highlight w:val="yellow"/>
-          <w:lang w:eastAsia="ru-RU"/>
-        </w:rPr>
-        <w:t>Описание что делали с тестами индивидуально и тестовая документация</w:t>
+          <w:lang w:eastAsia="ru-RU"/>
+        </w:rPr>
+        <w:t>Для успешного создания модуля Авторизации и регистрации нашего сервиса была проанализирована деятельность в этом модуле и составлены 4 диаграммы для более эффективной разработки модуля.</w:t>
+      </w:r>
+    </w:p>
+    <w:p>
+      <w:pPr>
+        <w:spacing w:after="100" w:afterAutospacing="1" w:line="360" w:lineRule="auto"/>
+        <w:contextualSpacing/>
+        <w:jc w:val="center"/>
+        <w:rPr>
+          <w:rFonts w:ascii="Times New Roman" w:eastAsia="Times New Roman" w:hAnsi="Times New Roman" w:cs="Times New Roman"/>
+          <w:sz w:val="28"/>
+          <w:szCs w:val="28"/>
+          <w:lang w:eastAsia="ru-RU"/>
+        </w:rPr>
+      </w:pPr>
+      <w:r>
+        <w:rPr>
+          <w:rFonts w:ascii="Times New Roman" w:eastAsia="Times New Roman" w:hAnsi="Times New Roman" w:cs="Times New Roman"/>
+          <w:sz w:val="28"/>
+          <w:szCs w:val="28"/>
+          <w:lang w:eastAsia="ru-RU"/>
+        </w:rPr>
+        <w:drawing>
+          <wp:inline distT="0" distB="0" distL="0" distR="0" wp14:anchorId="0EF48B03" wp14:editId="7A42E018">
+            <wp:extent cx="5939790" cy="3347720"/>
+            <wp:effectExtent l="0" t="0" r="3810" b="5080"/>
+            <wp:docPr id="8" name="Рисунок 8"/>
+            <wp:cNvGraphicFramePr>
+              <a:graphicFrameLocks xmlns:a="http://schemas.openxmlformats.org/drawingml/2006/main" noChangeAspect="1"/>
+            </wp:cNvGraphicFramePr>
+            <a:graphic xmlns:a="http://schemas.openxmlformats.org/drawingml/2006/main">
+              <a:graphicData uri="http://schemas.openxmlformats.org/drawingml/2006/picture">
+                <pic:pic xmlns:pic="http://schemas.openxmlformats.org/drawingml/2006/picture">
+                  <pic:nvPicPr>
+                    <pic:cNvPr id="1" name=""/>
+                    <pic:cNvPicPr/>
+                  </pic:nvPicPr>
+                  <pic:blipFill>
+                    <a:blip r:embed="rId13"/>
+                    <a:stretch>
+                      <a:fillRect/>
+                    </a:stretch>
+                  </pic:blipFill>
+                  <pic:spPr>
+                    <a:xfrm>
+                      <a:off x="0" y="0"/>
+                      <a:ext cx="5939790" cy="3347720"/>
+                    </a:xfrm>
+                    <a:prstGeom prst="rect">
+                      <a:avLst/>
+                    </a:prstGeom>
+                  </pic:spPr>
+                </pic:pic>
+              </a:graphicData>
+            </a:graphic>
+          </wp:inline>
+        </w:drawing>
       </w:r>
     </w:p>
     <w:p>
@@ -26646,14 +26638,23 @@
         <w:spacing w:after="100" w:afterAutospacing="1" w:line="360" w:lineRule="auto"/>
         <w:ind w:firstLine="709"/>
         <w:contextualSpacing/>
-        <w:jc w:val="both"/>
-        <w:rPr>
-          <w:rFonts w:ascii="Times New Roman" w:eastAsia="Times New Roman" w:hAnsi="Times New Roman" w:cs="Times New Roman"/>
-          <w:sz w:val="28"/>
-          <w:szCs w:val="28"/>
-          <w:lang w:eastAsia="ru-RU"/>
-        </w:rPr>
-      </w:pPr>
+        <w:jc w:val="center"/>
+        <w:rPr>
+          <w:rFonts w:ascii="Times New Roman" w:eastAsia="Times New Roman" w:hAnsi="Times New Roman" w:cs="Times New Roman"/>
+          <w:sz w:val="28"/>
+          <w:szCs w:val="28"/>
+          <w:lang w:eastAsia="ru-RU"/>
+        </w:rPr>
+      </w:pPr>
+      <w:r>
+        <w:rPr>
+          <w:rFonts w:ascii="Times New Roman" w:eastAsia="Times New Roman" w:hAnsi="Times New Roman" w:cs="Times New Roman"/>
+          <w:sz w:val="28"/>
+          <w:szCs w:val="28"/>
+          <w:lang w:eastAsia="ru-RU"/>
+        </w:rPr>
+        <w:t>Рисунок 6 – Диаграмма деятельности модуля «Авторизация/регистрация».</w:t>
+      </w:r>
     </w:p>
     <w:p>
       <w:pPr>
@@ -26668,6 +26669,427 @@
           <w:lang w:eastAsia="ru-RU"/>
         </w:rPr>
       </w:pPr>
+    </w:p>
+    <w:p>
+      <w:pPr>
+        <w:spacing w:after="100" w:afterAutospacing="1" w:line="360" w:lineRule="auto"/>
+        <w:ind w:firstLine="709"/>
+        <w:contextualSpacing/>
+        <w:jc w:val="center"/>
+        <w:rPr>
+          <w:rFonts w:ascii="Times New Roman" w:eastAsia="Times New Roman" w:hAnsi="Times New Roman" w:cs="Times New Roman"/>
+          <w:sz w:val="28"/>
+          <w:szCs w:val="28"/>
+          <w:lang w:eastAsia="ru-RU"/>
+        </w:rPr>
+      </w:pPr>
+    </w:p>
+    <w:p>
+      <w:pPr>
+        <w:spacing w:after="100" w:afterAutospacing="1" w:line="360" w:lineRule="auto"/>
+        <w:ind w:firstLine="709"/>
+        <w:contextualSpacing/>
+        <w:jc w:val="center"/>
+        <w:rPr>
+          <w:rFonts w:ascii="Times New Roman" w:eastAsia="Times New Roman" w:hAnsi="Times New Roman" w:cs="Times New Roman"/>
+          <w:sz w:val="28"/>
+          <w:szCs w:val="28"/>
+          <w:lang w:eastAsia="ru-RU"/>
+        </w:rPr>
+      </w:pPr>
+      <w:r>
+        <w:rPr>
+          <w:rFonts w:ascii="Times New Roman" w:eastAsia="Times New Roman" w:hAnsi="Times New Roman" w:cs="Times New Roman"/>
+          <w:sz w:val="28"/>
+          <w:szCs w:val="28"/>
+          <w:lang w:eastAsia="ru-RU"/>
+        </w:rPr>
+        <w:t xml:space="preserve">Рисунок 7 – </w:t>
+      </w:r>
+      <w:r>
+        <w:rPr>
+          <w:rFonts w:ascii="Times New Roman" w:eastAsia="Times New Roman" w:hAnsi="Times New Roman" w:cs="Times New Roman"/>
+          <w:sz w:val="28"/>
+          <w:szCs w:val="28"/>
+          <w:lang w:eastAsia="ru-RU"/>
+        </w:rPr>
+        <w:t xml:space="preserve">Диаграмма </w:t>
+      </w:r>
+      <w:r>
+        <w:rPr>
+          <w:rFonts w:ascii="Times New Roman" w:eastAsia="Times New Roman" w:hAnsi="Times New Roman" w:cs="Times New Roman"/>
+          <w:sz w:val="28"/>
+          <w:szCs w:val="28"/>
+          <w:lang w:eastAsia="ru-RU"/>
+        </w:rPr>
+        <w:t>последовательности</w:t>
+      </w:r>
+      <w:r>
+        <w:rPr>
+          <w:rFonts w:ascii="Times New Roman" w:eastAsia="Times New Roman" w:hAnsi="Times New Roman" w:cs="Times New Roman"/>
+          <w:sz w:val="28"/>
+          <w:szCs w:val="28"/>
+          <w:lang w:eastAsia="ru-RU"/>
+        </w:rPr>
+        <w:t xml:space="preserve"> модуля «Авторизация/регистрация».</w:t>
+      </w:r>
+    </w:p>
+    <w:p>
+      <w:pPr>
+        <w:spacing w:after="100" w:afterAutospacing="1" w:line="360" w:lineRule="auto"/>
+        <w:ind w:firstLine="709"/>
+        <w:contextualSpacing/>
+        <w:jc w:val="both"/>
+        <w:rPr>
+          <w:rFonts w:ascii="Times New Roman" w:eastAsia="Times New Roman" w:hAnsi="Times New Roman" w:cs="Times New Roman"/>
+          <w:sz w:val="28"/>
+          <w:szCs w:val="28"/>
+          <w:lang w:eastAsia="ru-RU"/>
+        </w:rPr>
+      </w:pPr>
+    </w:p>
+    <w:p>
+      <w:pPr>
+        <w:spacing w:after="100" w:afterAutospacing="1" w:line="360" w:lineRule="auto"/>
+        <w:ind w:firstLine="709"/>
+        <w:contextualSpacing/>
+        <w:jc w:val="center"/>
+        <w:rPr>
+          <w:rFonts w:ascii="Times New Roman" w:eastAsia="Times New Roman" w:hAnsi="Times New Roman" w:cs="Times New Roman"/>
+          <w:sz w:val="28"/>
+          <w:szCs w:val="28"/>
+          <w:lang w:eastAsia="ru-RU"/>
+        </w:rPr>
+      </w:pPr>
+    </w:p>
+    <w:p>
+      <w:pPr>
+        <w:spacing w:after="100" w:afterAutospacing="1" w:line="360" w:lineRule="auto"/>
+        <w:ind w:firstLine="709"/>
+        <w:contextualSpacing/>
+        <w:jc w:val="center"/>
+        <w:rPr>
+          <w:rFonts w:ascii="Times New Roman" w:eastAsia="Times New Roman" w:hAnsi="Times New Roman" w:cs="Times New Roman"/>
+          <w:sz w:val="28"/>
+          <w:szCs w:val="28"/>
+          <w:lang w:eastAsia="ru-RU"/>
+        </w:rPr>
+      </w:pPr>
+      <w:r>
+        <w:rPr>
+          <w:rFonts w:ascii="Times New Roman" w:eastAsia="Times New Roman" w:hAnsi="Times New Roman" w:cs="Times New Roman"/>
+          <w:sz w:val="28"/>
+          <w:szCs w:val="28"/>
+          <w:lang w:eastAsia="ru-RU"/>
+        </w:rPr>
+        <w:t xml:space="preserve">Рисунок </w:t>
+      </w:r>
+      <w:r>
+        <w:rPr>
+          <w:rFonts w:ascii="Times New Roman" w:eastAsia="Times New Roman" w:hAnsi="Times New Roman" w:cs="Times New Roman"/>
+          <w:sz w:val="28"/>
+          <w:szCs w:val="28"/>
+          <w:lang w:eastAsia="ru-RU"/>
+        </w:rPr>
+        <w:t>8</w:t>
+      </w:r>
+      <w:r>
+        <w:rPr>
+          <w:rFonts w:ascii="Times New Roman" w:eastAsia="Times New Roman" w:hAnsi="Times New Roman" w:cs="Times New Roman"/>
+          <w:sz w:val="28"/>
+          <w:szCs w:val="28"/>
+          <w:lang w:eastAsia="ru-RU"/>
+        </w:rPr>
+        <w:t xml:space="preserve"> – Диаграмма </w:t>
+      </w:r>
+      <w:r>
+        <w:rPr>
+          <w:rFonts w:ascii="Times New Roman" w:eastAsia="Times New Roman" w:hAnsi="Times New Roman" w:cs="Times New Roman"/>
+          <w:sz w:val="28"/>
+          <w:szCs w:val="28"/>
+          <w:lang w:eastAsia="ru-RU"/>
+        </w:rPr>
+        <w:t>коммуникации</w:t>
+      </w:r>
+      <w:r>
+        <w:rPr>
+          <w:rFonts w:ascii="Times New Roman" w:eastAsia="Times New Roman" w:hAnsi="Times New Roman" w:cs="Times New Roman"/>
+          <w:sz w:val="28"/>
+          <w:szCs w:val="28"/>
+          <w:lang w:eastAsia="ru-RU"/>
+        </w:rPr>
+        <w:t xml:space="preserve"> модуля «Авторизация/регистрация».</w:t>
+      </w:r>
+    </w:p>
+    <w:p>
+      <w:pPr>
+        <w:spacing w:after="100" w:afterAutospacing="1" w:line="360" w:lineRule="auto"/>
+        <w:ind w:firstLine="709"/>
+        <w:contextualSpacing/>
+        <w:jc w:val="both"/>
+        <w:rPr>
+          <w:rFonts w:ascii="Times New Roman" w:eastAsia="Times New Roman" w:hAnsi="Times New Roman" w:cs="Times New Roman"/>
+          <w:sz w:val="28"/>
+          <w:szCs w:val="28"/>
+          <w:lang w:eastAsia="ru-RU"/>
+        </w:rPr>
+      </w:pPr>
+    </w:p>
+    <w:p>
+      <w:pPr>
+        <w:spacing w:after="100" w:afterAutospacing="1" w:line="360" w:lineRule="auto"/>
+        <w:ind w:firstLine="709"/>
+        <w:contextualSpacing/>
+        <w:jc w:val="center"/>
+        <w:rPr>
+          <w:rFonts w:ascii="Times New Roman" w:eastAsia="Times New Roman" w:hAnsi="Times New Roman" w:cs="Times New Roman"/>
+          <w:sz w:val="28"/>
+          <w:szCs w:val="28"/>
+          <w:lang w:eastAsia="ru-RU"/>
+        </w:rPr>
+      </w:pPr>
+    </w:p>
+    <w:p>
+      <w:pPr>
+        <w:spacing w:after="100" w:afterAutospacing="1" w:line="360" w:lineRule="auto"/>
+        <w:ind w:firstLine="709"/>
+        <w:contextualSpacing/>
+        <w:jc w:val="center"/>
+        <w:rPr>
+          <w:rFonts w:ascii="Times New Roman" w:eastAsia="Times New Roman" w:hAnsi="Times New Roman" w:cs="Times New Roman"/>
+          <w:sz w:val="28"/>
+          <w:szCs w:val="28"/>
+          <w:lang w:eastAsia="ru-RU"/>
+        </w:rPr>
+      </w:pPr>
+      <w:r>
+        <w:rPr>
+          <w:rFonts w:ascii="Times New Roman" w:eastAsia="Times New Roman" w:hAnsi="Times New Roman" w:cs="Times New Roman"/>
+          <w:sz w:val="28"/>
+          <w:szCs w:val="28"/>
+          <w:lang w:eastAsia="ru-RU"/>
+        </w:rPr>
+        <w:t xml:space="preserve">Рисунок </w:t>
+      </w:r>
+      <w:r>
+        <w:rPr>
+          <w:rFonts w:ascii="Times New Roman" w:eastAsia="Times New Roman" w:hAnsi="Times New Roman" w:cs="Times New Roman"/>
+          <w:sz w:val="28"/>
+          <w:szCs w:val="28"/>
+          <w:lang w:eastAsia="ru-RU"/>
+        </w:rPr>
+        <w:t>9</w:t>
+      </w:r>
+      <w:r>
+        <w:rPr>
+          <w:rFonts w:ascii="Times New Roman" w:eastAsia="Times New Roman" w:hAnsi="Times New Roman" w:cs="Times New Roman"/>
+          <w:sz w:val="28"/>
+          <w:szCs w:val="28"/>
+          <w:lang w:eastAsia="ru-RU"/>
+        </w:rPr>
+        <w:t xml:space="preserve"> – Диаграмма </w:t>
+      </w:r>
+      <w:r>
+        <w:rPr>
+          <w:rFonts w:ascii="Times New Roman" w:eastAsia="Times New Roman" w:hAnsi="Times New Roman" w:cs="Times New Roman"/>
+          <w:sz w:val="28"/>
+          <w:szCs w:val="28"/>
+          <w:lang w:eastAsia="ru-RU"/>
+        </w:rPr>
+        <w:t>состояний</w:t>
+      </w:r>
+      <w:r>
+        <w:rPr>
+          <w:rFonts w:ascii="Times New Roman" w:eastAsia="Times New Roman" w:hAnsi="Times New Roman" w:cs="Times New Roman"/>
+          <w:sz w:val="28"/>
+          <w:szCs w:val="28"/>
+          <w:lang w:eastAsia="ru-RU"/>
+        </w:rPr>
+        <w:t xml:space="preserve"> модуля «Авторизация/регистрация».</w:t>
+      </w:r>
+      <w:bookmarkStart w:id="71" w:name="_GoBack"/>
+      <w:bookmarkEnd w:id="71"/>
+    </w:p>
+    <w:p>
+      <w:pPr>
+        <w:spacing w:after="100" w:afterAutospacing="1" w:line="360" w:lineRule="auto"/>
+        <w:ind w:firstLine="709"/>
+        <w:contextualSpacing/>
+        <w:jc w:val="both"/>
+        <w:rPr>
+          <w:rFonts w:ascii="Times New Roman" w:eastAsia="Times New Roman" w:hAnsi="Times New Roman" w:cs="Times New Roman"/>
+          <w:sz w:val="28"/>
+          <w:szCs w:val="28"/>
+          <w:lang w:eastAsia="ru-RU"/>
+        </w:rPr>
+      </w:pPr>
+    </w:p>
+    <w:p>
+      <w:pPr>
+        <w:spacing w:after="100" w:afterAutospacing="1" w:line="360" w:lineRule="auto"/>
+        <w:ind w:firstLine="709"/>
+        <w:contextualSpacing/>
+        <w:jc w:val="both"/>
+        <w:rPr>
+          <w:rFonts w:ascii="Times New Roman" w:eastAsia="Times New Roman" w:hAnsi="Times New Roman" w:cs="Times New Roman"/>
+          <w:sz w:val="28"/>
+          <w:szCs w:val="28"/>
+          <w:lang w:eastAsia="ru-RU"/>
+        </w:rPr>
+      </w:pPr>
+      <w:r>
+        <w:rPr>
+          <w:rFonts w:ascii="Times New Roman" w:eastAsia="Times New Roman" w:hAnsi="Times New Roman" w:cs="Times New Roman"/>
+          <w:sz w:val="28"/>
+          <w:szCs w:val="28"/>
+          <w:lang w:eastAsia="ru-RU"/>
+        </w:rPr>
+        <w:t>Так же были выявлены некоторые требования к процессу авторизации и регистрации, а именно:</w:t>
+      </w:r>
+    </w:p>
+    <w:p>
+      <w:pPr>
+        <w:pStyle w:val="aa"/>
+        <w:numPr>
+          <w:ilvl w:val="0"/>
+          <w:numId w:val="25"/>
+        </w:numPr>
+        <w:spacing w:after="100" w:afterAutospacing="1" w:line="360" w:lineRule="auto"/>
+        <w:ind w:left="0" w:firstLine="709"/>
+        <w:jc w:val="both"/>
+        <w:rPr>
+          <w:rFonts w:ascii="Times New Roman" w:eastAsia="Times New Roman" w:hAnsi="Times New Roman" w:cs="Times New Roman"/>
+          <w:sz w:val="28"/>
+          <w:szCs w:val="28"/>
+          <w:lang w:eastAsia="ru-RU"/>
+        </w:rPr>
+      </w:pPr>
+      <w:r>
+        <w:rPr>
+          <w:rFonts w:ascii="Times New Roman" w:eastAsia="Times New Roman" w:hAnsi="Times New Roman" w:cs="Times New Roman"/>
+          <w:sz w:val="28"/>
+          <w:szCs w:val="28"/>
+          <w:lang w:eastAsia="ru-RU"/>
+        </w:rPr>
+        <w:t>Пароль должен состоять минимум из 8 символов и обязательно содержать: специальные символы, заглавные буквы, строчные буквы, цифры,</w:t>
+      </w:r>
+      <w:r>
+        <w:rPr>
+          <w:rFonts w:ascii="Times New Roman" w:eastAsia="Times New Roman" w:hAnsi="Times New Roman" w:cs="Times New Roman"/>
+          <w:sz w:val="28"/>
+          <w:szCs w:val="28"/>
+          <w:lang w:eastAsia="ru-RU"/>
+        </w:rPr>
+        <w:t xml:space="preserve"> </w:t>
+      </w:r>
+      <w:r>
+        <w:rPr>
+          <w:rFonts w:ascii="Times New Roman" w:eastAsia="Times New Roman" w:hAnsi="Times New Roman" w:cs="Times New Roman"/>
+          <w:sz w:val="28"/>
+          <w:szCs w:val="28"/>
+          <w:lang w:eastAsia="ru-RU"/>
+        </w:rPr>
+        <w:t>латинские буквы.</w:t>
+      </w:r>
+    </w:p>
+    <w:p>
+      <w:pPr>
+        <w:pStyle w:val="aa"/>
+        <w:numPr>
+          <w:ilvl w:val="0"/>
+          <w:numId w:val="25"/>
+        </w:numPr>
+        <w:spacing w:after="100" w:afterAutospacing="1" w:line="360" w:lineRule="auto"/>
+        <w:ind w:left="0" w:firstLine="709"/>
+        <w:jc w:val="both"/>
+        <w:rPr>
+          <w:rFonts w:ascii="Times New Roman" w:eastAsia="Times New Roman" w:hAnsi="Times New Roman" w:cs="Times New Roman"/>
+          <w:sz w:val="28"/>
+          <w:szCs w:val="28"/>
+          <w:lang w:eastAsia="ru-RU"/>
+        </w:rPr>
+      </w:pPr>
+      <w:r>
+        <w:rPr>
+          <w:rFonts w:ascii="Times New Roman" w:eastAsia="Times New Roman" w:hAnsi="Times New Roman" w:cs="Times New Roman"/>
+          <w:sz w:val="28"/>
+          <w:szCs w:val="28"/>
+          <w:lang w:eastAsia="ru-RU"/>
+        </w:rPr>
+        <w:t xml:space="preserve">Почта должна соответствовать всем правилам написания, а именно: содержание </w:t>
+      </w:r>
+      <w:r>
+        <w:rPr>
+          <w:rFonts w:ascii="Times New Roman" w:eastAsia="Times New Roman" w:hAnsi="Times New Roman" w:cs="Times New Roman"/>
+          <w:sz w:val="28"/>
+          <w:szCs w:val="28"/>
+          <w:lang w:eastAsia="ru-RU"/>
+        </w:rPr>
+        <w:t>@</w:t>
+      </w:r>
+      <w:r>
+        <w:rPr>
+          <w:rFonts w:ascii="Times New Roman" w:eastAsia="Times New Roman" w:hAnsi="Times New Roman" w:cs="Times New Roman"/>
+          <w:sz w:val="28"/>
+          <w:szCs w:val="28"/>
+          <w:lang w:eastAsia="ru-RU"/>
+        </w:rPr>
+        <w:t>, наличие домена верхнего уровня.</w:t>
+      </w:r>
+    </w:p>
+    <w:p>
+      <w:pPr>
+        <w:pStyle w:val="aa"/>
+        <w:numPr>
+          <w:ilvl w:val="0"/>
+          <w:numId w:val="25"/>
+        </w:numPr>
+        <w:spacing w:after="100" w:afterAutospacing="1" w:line="360" w:lineRule="auto"/>
+        <w:ind w:left="0" w:firstLine="709"/>
+        <w:jc w:val="both"/>
+        <w:rPr>
+          <w:rFonts w:ascii="Times New Roman" w:eastAsia="Times New Roman" w:hAnsi="Times New Roman" w:cs="Times New Roman"/>
+          <w:sz w:val="28"/>
+          <w:szCs w:val="28"/>
+          <w:lang w:eastAsia="ru-RU"/>
+        </w:rPr>
+      </w:pPr>
+      <w:r>
+        <w:rPr>
+          <w:rFonts w:ascii="Times New Roman" w:eastAsia="Times New Roman" w:hAnsi="Times New Roman" w:cs="Times New Roman"/>
+          <w:sz w:val="28"/>
+          <w:szCs w:val="28"/>
+          <w:lang w:eastAsia="ru-RU"/>
+        </w:rPr>
+        <w:t>Обязательные поля для введения: Фамилия, Имя, Дата рождения, Пароль. Все не перечисленные выше поля не обязательны для заполнения.</w:t>
+      </w:r>
+    </w:p>
+    <w:p>
+      <w:pPr>
+        <w:pStyle w:val="aa"/>
+        <w:numPr>
+          <w:ilvl w:val="0"/>
+          <w:numId w:val="25"/>
+        </w:numPr>
+        <w:spacing w:after="100" w:afterAutospacing="1" w:line="360" w:lineRule="auto"/>
+        <w:ind w:left="0" w:firstLine="709"/>
+        <w:jc w:val="both"/>
+        <w:rPr>
+          <w:rFonts w:ascii="Times New Roman" w:eastAsia="Times New Roman" w:hAnsi="Times New Roman" w:cs="Times New Roman"/>
+          <w:sz w:val="28"/>
+          <w:szCs w:val="28"/>
+          <w:lang w:eastAsia="ru-RU"/>
+        </w:rPr>
+      </w:pPr>
+      <w:r>
+        <w:rPr>
+          <w:rFonts w:ascii="Times New Roman" w:eastAsia="Times New Roman" w:hAnsi="Times New Roman" w:cs="Times New Roman"/>
+          <w:sz w:val="28"/>
+          <w:szCs w:val="28"/>
+          <w:lang w:eastAsia="ru-RU"/>
+        </w:rPr>
+        <w:t>В случае отказа в регистрации/авторизации должно выводиться сообщение с пояснением причины или ошибки сервиса.</w:t>
+      </w:r>
     </w:p>
     <w:p>
       <w:pPr>
@@ -26730,6 +27152,133 @@
           <w:lang w:eastAsia="ru-RU"/>
         </w:rPr>
       </w:pPr>
+      <w:bookmarkStart w:id="72" w:name="_Toc229829472"/>
+      <w:bookmarkStart w:id="73" w:name="_Toc229835797"/>
+      <w:r>
+        <w:rPr>
+          <w:rFonts w:eastAsia="Times New Roman"/>
+          <w:highlight w:val="yellow"/>
+          <w:lang w:eastAsia="ru-RU"/>
+        </w:rPr>
+        <w:lastRenderedPageBreak/>
+        <w:t>Тестирование</w:t>
+      </w:r>
+      <w:bookmarkEnd w:id="72"/>
+      <w:bookmarkEnd w:id="73"/>
+    </w:p>
+    <w:p>
+      <w:pPr>
+        <w:spacing w:after="100" w:afterAutospacing="1" w:line="360" w:lineRule="auto"/>
+        <w:ind w:firstLine="709"/>
+        <w:contextualSpacing/>
+        <w:jc w:val="both"/>
+        <w:rPr>
+          <w:rFonts w:ascii="Times New Roman" w:eastAsia="Times New Roman" w:hAnsi="Times New Roman" w:cs="Times New Roman"/>
+          <w:sz w:val="28"/>
+          <w:szCs w:val="28"/>
+          <w:lang w:eastAsia="ru-RU"/>
+        </w:rPr>
+      </w:pPr>
+      <w:r>
+        <w:rPr>
+          <w:rFonts w:ascii="Times New Roman" w:eastAsia="Times New Roman" w:hAnsi="Times New Roman" w:cs="Times New Roman"/>
+          <w:sz w:val="28"/>
+          <w:szCs w:val="28"/>
+          <w:highlight w:val="yellow"/>
+          <w:lang w:eastAsia="ru-RU"/>
+        </w:rPr>
+        <w:t>Описание что делали с тестами индивидуально и тестовая документация</w:t>
+      </w:r>
+    </w:p>
+    <w:p>
+      <w:pPr>
+        <w:spacing w:after="100" w:afterAutospacing="1" w:line="360" w:lineRule="auto"/>
+        <w:ind w:firstLine="709"/>
+        <w:contextualSpacing/>
+        <w:jc w:val="both"/>
+        <w:rPr>
+          <w:rFonts w:ascii="Times New Roman" w:eastAsia="Times New Roman" w:hAnsi="Times New Roman" w:cs="Times New Roman"/>
+          <w:sz w:val="28"/>
+          <w:szCs w:val="28"/>
+          <w:lang w:eastAsia="ru-RU"/>
+        </w:rPr>
+      </w:pPr>
+    </w:p>
+    <w:p>
+      <w:pPr>
+        <w:spacing w:after="100" w:afterAutospacing="1" w:line="360" w:lineRule="auto"/>
+        <w:ind w:firstLine="709"/>
+        <w:contextualSpacing/>
+        <w:jc w:val="both"/>
+        <w:rPr>
+          <w:rFonts w:ascii="Times New Roman" w:eastAsia="Times New Roman" w:hAnsi="Times New Roman" w:cs="Times New Roman"/>
+          <w:sz w:val="28"/>
+          <w:szCs w:val="28"/>
+          <w:lang w:eastAsia="ru-RU"/>
+        </w:rPr>
+      </w:pPr>
+    </w:p>
+    <w:p>
+      <w:pPr>
+        <w:spacing w:after="100" w:afterAutospacing="1" w:line="360" w:lineRule="auto"/>
+        <w:ind w:firstLine="709"/>
+        <w:contextualSpacing/>
+        <w:jc w:val="both"/>
+        <w:rPr>
+          <w:rFonts w:ascii="Times New Roman" w:eastAsia="Times New Roman" w:hAnsi="Times New Roman" w:cs="Times New Roman"/>
+          <w:sz w:val="28"/>
+          <w:szCs w:val="28"/>
+          <w:lang w:eastAsia="ru-RU"/>
+        </w:rPr>
+      </w:pPr>
+    </w:p>
+    <w:p>
+      <w:pPr>
+        <w:spacing w:after="100" w:afterAutospacing="1" w:line="360" w:lineRule="auto"/>
+        <w:ind w:firstLine="709"/>
+        <w:contextualSpacing/>
+        <w:jc w:val="both"/>
+        <w:rPr>
+          <w:rFonts w:ascii="Times New Roman" w:eastAsia="Times New Roman" w:hAnsi="Times New Roman" w:cs="Times New Roman"/>
+          <w:sz w:val="28"/>
+          <w:szCs w:val="28"/>
+          <w:lang w:eastAsia="ru-RU"/>
+        </w:rPr>
+      </w:pPr>
+    </w:p>
+    <w:p>
+      <w:pPr>
+        <w:spacing w:after="160" w:line="259" w:lineRule="auto"/>
+        <w:rPr>
+          <w:rFonts w:ascii="Times New Roman" w:eastAsia="Times New Roman" w:hAnsi="Times New Roman" w:cs="Times New Roman"/>
+          <w:sz w:val="28"/>
+          <w:szCs w:val="28"/>
+          <w:lang w:eastAsia="ru-RU"/>
+        </w:rPr>
+      </w:pPr>
+      <w:r>
+        <w:rPr>
+          <w:rFonts w:ascii="Times New Roman" w:eastAsia="Times New Roman" w:hAnsi="Times New Roman" w:cs="Times New Roman"/>
+          <w:sz w:val="28"/>
+          <w:szCs w:val="28"/>
+          <w:lang w:eastAsia="ru-RU"/>
+        </w:rPr>
+        <w:br w:type="page"/>
+      </w:r>
+    </w:p>
+    <w:p>
+      <w:pPr>
+        <w:pStyle w:val="1"/>
+        <w:numPr>
+          <w:ilvl w:val="0"/>
+          <w:numId w:val="4"/>
+        </w:numPr>
+        <w:rPr>
+          <w:rFonts w:eastAsia="Times New Roman"/>
+          <w:highlight w:val="yellow"/>
+          <w:lang w:eastAsia="ru-RU"/>
+        </w:rPr>
+      </w:pPr>
       <w:bookmarkStart w:id="74" w:name="_Toc229829473"/>
       <w:bookmarkStart w:id="75" w:name="_Toc229835798"/>
       <w:r>
@@ -27037,7 +27586,7 @@
       </w:pPr>
     </w:p>
     <w:sectPr>
-      <w:footerReference w:type="default" r:id="rId13"/>
+      <w:footerReference w:type="default" r:id="rId14"/>
       <w:pgSz w:w="11906" w:h="16838"/>
       <w:pgMar w:top="1134" w:right="851" w:bottom="1134" w:left="1701" w:header="709" w:footer="709" w:gutter="0"/>
       <w:pgNumType w:start="0"/>
@@ -27084,7 +27633,6 @@
         <w:docPartUnique/>
       </w:docPartObj>
     </w:sdtPr>
-    <w:sdtEndPr/>
     <w:sdtContent>
       <w:p>
         <w:pPr>
@@ -27104,7 +27652,7 @@
           <w:rPr>
             <w:noProof/>
           </w:rPr>
-          <w:t>27</w:t>
+          <w:t>44</w:t>
         </w:r>
         <w:r>
           <w:fldChar w:fldCharType="end"/>
@@ -27888,6 +28436,92 @@
     </w:lvl>
   </w:abstractNum>
   <w:abstractNum w:abstractNumId="7" w15:restartNumberingAfterBreak="0">
+    <w:nsid w:val="105836A1"/>
+    <w:multiLevelType w:val="hybridMultilevel"/>
+    <w:tmpl w:val="FC88A034"/>
+    <w:lvl w:ilvl="0" w:tplc="04190011">
+      <w:start w:val="1"/>
+      <w:numFmt w:val="decimal"/>
+      <w:lvlText w:val="%1)"/>
+      <w:lvlJc w:val="left"/>
+      <w:pPr>
+        <w:ind w:left="1429" w:hanging="360"/>
+      </w:pPr>
+    </w:lvl>
+    <w:lvl w:ilvl="1" w:tplc="04190019" w:tentative="1">
+      <w:start w:val="1"/>
+      <w:numFmt w:val="lowerLetter"/>
+      <w:lvlText w:val="%2."/>
+      <w:lvlJc w:val="left"/>
+      <w:pPr>
+        <w:ind w:left="2149" w:hanging="360"/>
+      </w:pPr>
+    </w:lvl>
+    <w:lvl w:ilvl="2" w:tplc="0419001B" w:tentative="1">
+      <w:start w:val="1"/>
+      <w:numFmt w:val="lowerRoman"/>
+      <w:lvlText w:val="%3."/>
+      <w:lvlJc w:val="right"/>
+      <w:pPr>
+        <w:ind w:left="2869" w:hanging="180"/>
+      </w:pPr>
+    </w:lvl>
+    <w:lvl w:ilvl="3" w:tplc="0419000F" w:tentative="1">
+      <w:start w:val="1"/>
+      <w:numFmt w:val="decimal"/>
+      <w:lvlText w:val="%4."/>
+      <w:lvlJc w:val="left"/>
+      <w:pPr>
+        <w:ind w:left="3589" w:hanging="360"/>
+      </w:pPr>
+    </w:lvl>
+    <w:lvl w:ilvl="4" w:tplc="04190019" w:tentative="1">
+      <w:start w:val="1"/>
+      <w:numFmt w:val="lowerLetter"/>
+      <w:lvlText w:val="%5."/>
+      <w:lvlJc w:val="left"/>
+      <w:pPr>
+        <w:ind w:left="4309" w:hanging="360"/>
+      </w:pPr>
+    </w:lvl>
+    <w:lvl w:ilvl="5" w:tplc="0419001B" w:tentative="1">
+      <w:start w:val="1"/>
+      <w:numFmt w:val="lowerRoman"/>
+      <w:lvlText w:val="%6."/>
+      <w:lvlJc w:val="right"/>
+      <w:pPr>
+        <w:ind w:left="5029" w:hanging="180"/>
+      </w:pPr>
+    </w:lvl>
+    <w:lvl w:ilvl="6" w:tplc="0419000F" w:tentative="1">
+      <w:start w:val="1"/>
+      <w:numFmt w:val="decimal"/>
+      <w:lvlText w:val="%7."/>
+      <w:lvlJc w:val="left"/>
+      <w:pPr>
+        <w:ind w:left="5749" w:hanging="360"/>
+      </w:pPr>
+    </w:lvl>
+    <w:lvl w:ilvl="7" w:tplc="04190019" w:tentative="1">
+      <w:start w:val="1"/>
+      <w:numFmt w:val="lowerLetter"/>
+      <w:lvlText w:val="%8."/>
+      <w:lvlJc w:val="left"/>
+      <w:pPr>
+        <w:ind w:left="6469" w:hanging="360"/>
+      </w:pPr>
+    </w:lvl>
+    <w:lvl w:ilvl="8" w:tplc="0419001B" w:tentative="1">
+      <w:start w:val="1"/>
+      <w:numFmt w:val="lowerRoman"/>
+      <w:lvlText w:val="%9."/>
+      <w:lvlJc w:val="right"/>
+      <w:pPr>
+        <w:ind w:left="7189" w:hanging="180"/>
+      </w:pPr>
+    </w:lvl>
+  </w:abstractNum>
+  <w:abstractNum w:abstractNumId="8" w15:restartNumberingAfterBreak="0">
     <w:nsid w:val="135D1614"/>
     <w:multiLevelType w:val="hybridMultilevel"/>
     <w:tmpl w:val="4E7693BE"/>
@@ -28000,7 +28634,7 @@
       </w:rPr>
     </w:lvl>
   </w:abstractNum>
-  <w:abstractNum w:abstractNumId="8" w15:restartNumberingAfterBreak="0">
+  <w:abstractNum w:abstractNumId="9" w15:restartNumberingAfterBreak="0">
     <w:nsid w:val="1AE5000C"/>
     <w:multiLevelType w:val="hybridMultilevel"/>
     <w:tmpl w:val="CFC8C79C"/>
@@ -28113,7 +28747,7 @@
       </w:rPr>
     </w:lvl>
   </w:abstractNum>
-  <w:abstractNum w:abstractNumId="9" w15:restartNumberingAfterBreak="0">
+  <w:abstractNum w:abstractNumId="10" w15:restartNumberingAfterBreak="0">
     <w:nsid w:val="2AFE08FC"/>
     <w:multiLevelType w:val="hybridMultilevel"/>
     <w:tmpl w:val="D1A65D8E"/>
@@ -28226,7 +28860,7 @@
       </w:rPr>
     </w:lvl>
   </w:abstractNum>
-  <w:abstractNum w:abstractNumId="10" w15:restartNumberingAfterBreak="0">
+  <w:abstractNum w:abstractNumId="11" w15:restartNumberingAfterBreak="0">
     <w:nsid w:val="2D792C9B"/>
     <w:multiLevelType w:val="hybridMultilevel"/>
     <w:tmpl w:val="08BA3BD4"/>
@@ -28339,7 +28973,7 @@
       </w:rPr>
     </w:lvl>
   </w:abstractNum>
-  <w:abstractNum w:abstractNumId="11" w15:restartNumberingAfterBreak="0">
+  <w:abstractNum w:abstractNumId="12" w15:restartNumberingAfterBreak="0">
     <w:nsid w:val="3A1278E5"/>
     <w:multiLevelType w:val="hybridMultilevel"/>
     <w:tmpl w:val="7F7E6FA8"/>
@@ -28452,7 +29086,7 @@
       </w:rPr>
     </w:lvl>
   </w:abstractNum>
-  <w:abstractNum w:abstractNumId="12" w15:restartNumberingAfterBreak="0">
+  <w:abstractNum w:abstractNumId="13" w15:restartNumberingAfterBreak="0">
     <w:nsid w:val="3D5E0B13"/>
     <w:multiLevelType w:val="hybridMultilevel"/>
     <w:tmpl w:val="06228E70"/>
@@ -28565,7 +29199,7 @@
       </w:rPr>
     </w:lvl>
   </w:abstractNum>
-  <w:abstractNum w:abstractNumId="13" w15:restartNumberingAfterBreak="0">
+  <w:abstractNum w:abstractNumId="14" w15:restartNumberingAfterBreak="0">
     <w:nsid w:val="439B54CC"/>
     <w:multiLevelType w:val="multilevel"/>
     <w:tmpl w:val="098C7BC4"/>
@@ -28686,7 +29320,7 @@
       </w:rPr>
     </w:lvl>
   </w:abstractNum>
-  <w:abstractNum w:abstractNumId="14" w15:restartNumberingAfterBreak="0">
+  <w:abstractNum w:abstractNumId="15" w15:restartNumberingAfterBreak="0">
     <w:nsid w:val="53FF28DC"/>
     <w:multiLevelType w:val="hybridMultilevel"/>
     <w:tmpl w:val="8F24DB6E"/>
@@ -28799,7 +29433,7 @@
       </w:rPr>
     </w:lvl>
   </w:abstractNum>
-  <w:abstractNum w:abstractNumId="15" w15:restartNumberingAfterBreak="0">
+  <w:abstractNum w:abstractNumId="16" w15:restartNumberingAfterBreak="0">
     <w:nsid w:val="558D4C67"/>
     <w:multiLevelType w:val="hybridMultilevel"/>
     <w:tmpl w:val="92A65CB6"/>
@@ -28888,7 +29522,7 @@
       </w:pPr>
     </w:lvl>
   </w:abstractNum>
-  <w:abstractNum w:abstractNumId="16" w15:restartNumberingAfterBreak="0">
+  <w:abstractNum w:abstractNumId="17" w15:restartNumberingAfterBreak="0">
     <w:nsid w:val="558D58EB"/>
     <w:multiLevelType w:val="hybridMultilevel"/>
     <w:tmpl w:val="DAFCB6B0"/>
@@ -29001,7 +29635,7 @@
       </w:rPr>
     </w:lvl>
   </w:abstractNum>
-  <w:abstractNum w:abstractNumId="17" w15:restartNumberingAfterBreak="0">
+  <w:abstractNum w:abstractNumId="18" w15:restartNumberingAfterBreak="0">
     <w:nsid w:val="59096512"/>
     <w:multiLevelType w:val="hybridMultilevel"/>
     <w:tmpl w:val="5D26FC54"/>
@@ -29114,7 +29748,7 @@
       </w:rPr>
     </w:lvl>
   </w:abstractNum>
-  <w:abstractNum w:abstractNumId="18" w15:restartNumberingAfterBreak="0">
+  <w:abstractNum w:abstractNumId="19" w15:restartNumberingAfterBreak="0">
     <w:nsid w:val="60C53F88"/>
     <w:multiLevelType w:val="multilevel"/>
     <w:tmpl w:val="78D402FA"/>
@@ -29235,7 +29869,7 @@
       </w:rPr>
     </w:lvl>
   </w:abstractNum>
-  <w:abstractNum w:abstractNumId="19" w15:restartNumberingAfterBreak="0">
+  <w:abstractNum w:abstractNumId="20" w15:restartNumberingAfterBreak="0">
     <w:nsid w:val="67C658B0"/>
     <w:multiLevelType w:val="hybridMultilevel"/>
     <w:tmpl w:val="1BE6BB12"/>
@@ -29347,7 +29981,7 @@
       </w:rPr>
     </w:lvl>
   </w:abstractNum>
-  <w:abstractNum w:abstractNumId="20" w15:restartNumberingAfterBreak="0">
+  <w:abstractNum w:abstractNumId="21" w15:restartNumberingAfterBreak="0">
     <w:nsid w:val="67DB7E98"/>
     <w:multiLevelType w:val="hybridMultilevel"/>
     <w:tmpl w:val="D42882F2"/>
@@ -29460,7 +30094,7 @@
       </w:rPr>
     </w:lvl>
   </w:abstractNum>
-  <w:abstractNum w:abstractNumId="21" w15:restartNumberingAfterBreak="0">
+  <w:abstractNum w:abstractNumId="22" w15:restartNumberingAfterBreak="0">
     <w:nsid w:val="6955234E"/>
     <w:multiLevelType w:val="hybridMultilevel"/>
     <w:tmpl w:val="58E85584"/>
@@ -29573,7 +30207,7 @@
       </w:rPr>
     </w:lvl>
   </w:abstractNum>
-  <w:abstractNum w:abstractNumId="22" w15:restartNumberingAfterBreak="0">
+  <w:abstractNum w:abstractNumId="23" w15:restartNumberingAfterBreak="0">
     <w:nsid w:val="738F0F93"/>
     <w:multiLevelType w:val="hybridMultilevel"/>
     <w:tmpl w:val="5C4E99A2"/>
@@ -29686,7 +30320,7 @@
       </w:rPr>
     </w:lvl>
   </w:abstractNum>
-  <w:abstractNum w:abstractNumId="23" w15:restartNumberingAfterBreak="0">
+  <w:abstractNum w:abstractNumId="24" w15:restartNumberingAfterBreak="0">
     <w:nsid w:val="7492456F"/>
     <w:multiLevelType w:val="hybridMultilevel"/>
     <w:tmpl w:val="DA30138E"/>
@@ -29800,22 +30434,22 @@
     </w:lvl>
   </w:abstractNum>
   <w:num w:numId="1">
-    <w:abstractNumId w:val="15"/>
+    <w:abstractNumId w:val="16"/>
   </w:num>
   <w:num w:numId="2">
-    <w:abstractNumId w:val="10"/>
+    <w:abstractNumId w:val="11"/>
   </w:num>
   <w:num w:numId="3">
     <w:abstractNumId w:val="6"/>
   </w:num>
   <w:num w:numId="4">
-    <w:abstractNumId w:val="18"/>
+    <w:abstractNumId w:val="19"/>
   </w:num>
   <w:num w:numId="5">
-    <w:abstractNumId w:val="19"/>
+    <w:abstractNumId w:val="20"/>
   </w:num>
   <w:num w:numId="6">
-    <w:abstractNumId w:val="17"/>
+    <w:abstractNumId w:val="18"/>
   </w:num>
   <w:num w:numId="7">
     <w:abstractNumId w:val="3"/>
@@ -29827,48 +30461,51 @@
     <w:abstractNumId w:val="2"/>
   </w:num>
   <w:num w:numId="10">
-    <w:abstractNumId w:val="13"/>
+    <w:abstractNumId w:val="14"/>
   </w:num>
   <w:num w:numId="11">
     <w:abstractNumId w:val="5"/>
   </w:num>
   <w:num w:numId="12">
-    <w:abstractNumId w:val="21"/>
+    <w:abstractNumId w:val="22"/>
   </w:num>
   <w:num w:numId="13">
-    <w:abstractNumId w:val="14"/>
+    <w:abstractNumId w:val="15"/>
   </w:num>
   <w:num w:numId="14">
-    <w:abstractNumId w:val="12"/>
+    <w:abstractNumId w:val="13"/>
   </w:num>
   <w:num w:numId="15">
-    <w:abstractNumId w:val="9"/>
+    <w:abstractNumId w:val="10"/>
   </w:num>
   <w:num w:numId="16">
-    <w:abstractNumId w:val="22"/>
+    <w:abstractNumId w:val="23"/>
   </w:num>
   <w:num w:numId="17">
     <w:abstractNumId w:val="1"/>
   </w:num>
   <w:num w:numId="18">
-    <w:abstractNumId w:val="11"/>
+    <w:abstractNumId w:val="12"/>
   </w:num>
   <w:num w:numId="19">
     <w:abstractNumId w:val="0"/>
   </w:num>
   <w:num w:numId="20">
-    <w:abstractNumId w:val="16"/>
+    <w:abstractNumId w:val="17"/>
   </w:num>
   <w:num w:numId="21">
-    <w:abstractNumId w:val="23"/>
+    <w:abstractNumId w:val="24"/>
   </w:num>
   <w:num w:numId="22">
-    <w:abstractNumId w:val="20"/>
+    <w:abstractNumId w:val="21"/>
   </w:num>
   <w:num w:numId="23">
+    <w:abstractNumId w:val="9"/>
+  </w:num>
+  <w:num w:numId="24">
     <w:abstractNumId w:val="8"/>
   </w:num>
-  <w:num w:numId="24">
+  <w:num w:numId="25">
     <w:abstractNumId w:val="7"/>
   </w:num>
   <w:numIdMacAtCleanup w:val="24"/>
@@ -30268,7 +30905,7 @@
   <w:style w:type="paragraph" w:default="1" w:styleId="a">
     <w:name w:val="Normal"/>
     <w:qFormat/>
-    <w:rsid w:val="009C7948"/>
+    <w:rsid w:val="00FA771D"/>
     <w:pPr>
       <w:spacing w:after="200" w:line="276" w:lineRule="auto"/>
     </w:pPr>
@@ -30611,6 +31248,17 @@
       <w:ind w:left="660"/>
     </w:pPr>
   </w:style>
+  <w:style w:type="character" w:styleId="ac">
+    <w:name w:val="Strong"/>
+    <w:basedOn w:val="a0"/>
+    <w:uiPriority w:val="22"/>
+    <w:qFormat/>
+    <w:rsid w:val="0068402F"/>
+    <w:rPr>
+      <w:b/>
+      <w:bCs/>
+    </w:rPr>
+  </w:style>
 </w:styles>
 </file>
 
@@ -30880,7 +31528,7 @@
 </file>
 
 <file path=customXml/itemProps1.xml><?xml version="1.0" encoding="utf-8"?>
-<ds:datastoreItem xmlns:ds="http://schemas.openxmlformats.org/officeDocument/2006/customXml" ds:itemID="{887CEFFC-4D05-4CD5-9CCC-86DA9FBEB663}">
+<ds:datastoreItem xmlns:ds="http://schemas.openxmlformats.org/officeDocument/2006/customXml" ds:itemID="{10A04E2D-E2CC-4EFC-B49F-B6E60B8763E5}">
   <ds:schemaRefs>
     <ds:schemaRef ds:uri="http://schemas.openxmlformats.org/officeDocument/2006/bibliography"/>
   </ds:schemaRefs>

</xml_diff>